<commit_message>
Update Comments pa Fullstack.docx
</commit_message>
<xml_diff>
--- a/Comments pa Fullstack.docx
+++ b/Comments pa Fullstack.docx
@@ -50,49 +50,7 @@
         <w:rPr>
           <w:lang w:val="es-CO"/>
         </w:rPr>
-        <w:t xml:space="preserve">, asegurando que el </w:t>
-      </w:r>
-      <w:proofErr w:type="spellStart"/>
-      <w:r>
-        <w:rPr>
-          <w:lang w:val="es-CO"/>
-        </w:rPr>
-        <w:t>Frontend</w:t>
-      </w:r>
-      <w:proofErr w:type="spellEnd"/>
-      <w:r>
-        <w:rPr>
-          <w:lang w:val="es-CO"/>
-        </w:rPr>
-        <w:t xml:space="preserve"> y el </w:t>
-      </w:r>
-      <w:proofErr w:type="spellStart"/>
-      <w:r>
-        <w:rPr>
-          <w:lang w:val="es-CO"/>
-        </w:rPr>
-        <w:t>Backend</w:t>
-      </w:r>
-      <w:proofErr w:type="spellEnd"/>
-      <w:r>
-        <w:rPr>
-          <w:lang w:val="es-CO"/>
-        </w:rPr>
-        <w:t xml:space="preserve"> de </w:t>
-      </w:r>
-      <w:proofErr w:type="spellStart"/>
-      <w:r>
-        <w:rPr>
-          <w:lang w:val="es-CO"/>
-        </w:rPr>
-        <w:t>Medussa</w:t>
-      </w:r>
-      <w:proofErr w:type="spellEnd"/>
-      <w:r>
-        <w:rPr>
-          <w:lang w:val="es-CO"/>
-        </w:rPr>
-        <w:t xml:space="preserve"> ERP hablen el mismo idioma.</w:t>
+        <w:t>, asegurando que el Frontend y el Backend de Medussa ERP hablen el mismo idioma.</w:t>
       </w:r>
     </w:p>
     <w:p>
@@ -151,25 +109,7 @@
           <w:bCs/>
           <w:lang w:val="es-CO"/>
         </w:rPr>
-        <w:t xml:space="preserve"> Reporte de Integración </w:t>
-      </w:r>
-      <w:proofErr w:type="spellStart"/>
-      <w:r>
-        <w:rPr>
-          <w:b/>
-          <w:bCs/>
-          <w:lang w:val="es-CO"/>
-        </w:rPr>
-        <w:t>Fullstack</w:t>
-      </w:r>
-      <w:proofErr w:type="spellEnd"/>
-      <w:r>
-        <w:rPr>
-          <w:b/>
-          <w:bCs/>
-          <w:lang w:val="es-CO"/>
-        </w:rPr>
-        <w:t>: HU-011</w:t>
+        <w:t xml:space="preserve"> Reporte de Integración Fullstack: HU-011</w:t>
       </w:r>
     </w:p>
     <w:p>
@@ -190,21 +130,7 @@
         <w:rPr>
           <w:lang w:val="es-CO"/>
         </w:rPr>
-        <w:t xml:space="preserve"> Juan Camilo (</w:t>
-      </w:r>
-      <w:proofErr w:type="spellStart"/>
-      <w:r>
-        <w:rPr>
-          <w:lang w:val="es-CO"/>
-        </w:rPr>
-        <w:t>Frontend</w:t>
-      </w:r>
-      <w:proofErr w:type="spellEnd"/>
-      <w:r>
-        <w:rPr>
-          <w:lang w:val="es-CO"/>
-        </w:rPr>
-        <w:t xml:space="preserve"> Developer)</w:t>
+        <w:t xml:space="preserve"> Juan Camilo (Frontend Developer)</w:t>
       </w:r>
     </w:p>
     <w:p>
@@ -245,25 +171,7 @@
           <w:bCs/>
           <w:lang w:val="es-CO"/>
         </w:rPr>
-        <w:t>1. Arquitectura de Datos (</w:t>
-      </w:r>
-      <w:proofErr w:type="spellStart"/>
-      <w:r>
-        <w:rPr>
-          <w:b/>
-          <w:bCs/>
-          <w:lang w:val="es-CO"/>
-        </w:rPr>
-        <w:t>Multi-tenancy</w:t>
-      </w:r>
-      <w:proofErr w:type="spellEnd"/>
-      <w:r>
-        <w:rPr>
-          <w:b/>
-          <w:bCs/>
-          <w:lang w:val="es-CO"/>
-        </w:rPr>
-        <w:t>)</w:t>
+        <w:t>1. Arquitectura de Datos (Multi-tenancy)</w:t>
       </w:r>
     </w:p>
     <w:p>
@@ -340,21 +248,7 @@
         <w:rPr>
           <w:lang w:val="es-CO"/>
         </w:rPr>
-        <w:t xml:space="preserve"> La tabla puente </w:t>
-      </w:r>
-      <w:proofErr w:type="spellStart"/>
-      <w:r>
-        <w:rPr>
-          <w:lang w:val="es-CO"/>
-        </w:rPr>
-        <w:t>usuario_empresa_config</w:t>
-      </w:r>
-      <w:proofErr w:type="spellEnd"/>
-      <w:r>
-        <w:rPr>
-          <w:lang w:val="es-CO"/>
-        </w:rPr>
-        <w:t xml:space="preserve"> es la que define el acceso.</w:t>
+        <w:t xml:space="preserve"> La tabla puente usuario_empresa_config es la que define el acceso.</w:t>
       </w:r>
     </w:p>
     <w:p>
@@ -379,21 +273,7 @@
         <w:rPr>
           <w:lang w:val="es-CO"/>
         </w:rPr>
-        <w:t xml:space="preserve"> Para Juan Camilo, esto significa </w:t>
-      </w:r>
-      <w:proofErr w:type="gramStart"/>
-      <w:r>
-        <w:rPr>
-          <w:lang w:val="es-CO"/>
-        </w:rPr>
-        <w:t>que</w:t>
-      </w:r>
-      <w:proofErr w:type="gramEnd"/>
-      <w:r>
-        <w:rPr>
-          <w:lang w:val="es-CO"/>
-        </w:rPr>
-        <w:t xml:space="preserve"> al crear un usuario, </w:t>
+        <w:t xml:space="preserve"> Para Juan Camilo, esto significa que al crear un usuario, </w:t>
       </w:r>
       <w:r>
         <w:rPr>
@@ -424,25 +304,7 @@
           <w:bCs/>
           <w:lang w:val="es-CO"/>
         </w:rPr>
-        <w:t>2. Contratos de API (</w:t>
-      </w:r>
-      <w:proofErr w:type="spellStart"/>
-      <w:r>
-        <w:rPr>
-          <w:b/>
-          <w:bCs/>
-          <w:lang w:val="es-CO"/>
-        </w:rPr>
-        <w:t>Endpoints</w:t>
-      </w:r>
-      <w:proofErr w:type="spellEnd"/>
-      <w:r>
-        <w:rPr>
-          <w:b/>
-          <w:bCs/>
-          <w:lang w:val="es-CO"/>
-        </w:rPr>
-        <w:t>)</w:t>
+        <w:t>2. Contratos de API (Endpoints)</w:t>
       </w:r>
     </w:p>
     <w:p>
@@ -468,23 +330,13 @@
           <w:lang w:val="es-CO"/>
         </w:rPr>
       </w:pPr>
-      <w:proofErr w:type="spellStart"/>
-      <w:r>
-        <w:rPr>
-          <w:b/>
-          <w:bCs/>
-          <w:lang w:val="es-CO"/>
-        </w:rPr>
-        <w:t>Payload</w:t>
-      </w:r>
-      <w:proofErr w:type="spellEnd"/>
-      <w:r>
-        <w:rPr>
-          <w:b/>
-          <w:bCs/>
-          <w:lang w:val="es-CO"/>
-        </w:rPr>
-        <w:t xml:space="preserve"> esperado:</w:t>
+      <w:r>
+        <w:rPr>
+          <w:b/>
+          <w:bCs/>
+          <w:lang w:val="es-CO"/>
+        </w:rPr>
+        <w:t>Payload esperado:</w:t>
       </w:r>
     </w:p>
     <w:p>
@@ -549,21 +401,7 @@
         <w:rPr>
           <w:lang w:val="es-CO"/>
         </w:rPr>
-        <w:t xml:space="preserve">  "</w:t>
-      </w:r>
-      <w:proofErr w:type="spellStart"/>
-      <w:r>
-        <w:rPr>
-          <w:lang w:val="es-CO"/>
-        </w:rPr>
-        <w:t>username</w:t>
-      </w:r>
-      <w:proofErr w:type="spellEnd"/>
-      <w:r>
-        <w:rPr>
-          <w:lang w:val="es-CO"/>
-        </w:rPr>
-        <w:t>": "user123",</w:t>
+        <w:t xml:space="preserve">  "username": "user123",</w:t>
       </w:r>
     </w:p>
     <w:p>
@@ -590,37 +428,7 @@
         <w:rPr>
           <w:lang w:val="es-CO"/>
         </w:rPr>
-        <w:t xml:space="preserve">  "</w:t>
-      </w:r>
-      <w:proofErr w:type="spellStart"/>
-      <w:proofErr w:type="gramStart"/>
-      <w:r>
-        <w:rPr>
-          <w:lang w:val="es-CO"/>
-        </w:rPr>
-        <w:t>password</w:t>
-      </w:r>
-      <w:proofErr w:type="spellEnd"/>
-      <w:proofErr w:type="gramEnd"/>
-      <w:r>
-        <w:rPr>
-          <w:lang w:val="es-CO"/>
-        </w:rPr>
-        <w:t>": "</w:t>
-      </w:r>
-      <w:proofErr w:type="spellStart"/>
-      <w:r>
-        <w:rPr>
-          <w:lang w:val="es-CO"/>
-        </w:rPr>
-        <w:t>securePassword</w:t>
-      </w:r>
-      <w:proofErr w:type="spellEnd"/>
-      <w:r>
-        <w:rPr>
-          <w:lang w:val="es-CO"/>
-        </w:rPr>
-        <w:t>",</w:t>
+        <w:t xml:space="preserve">  "password": "securePassword",</w:t>
       </w:r>
     </w:p>
     <w:p>
@@ -685,48 +493,20 @@
         <w:rPr>
           <w:lang w:val="es-CO"/>
         </w:rPr>
-        <w:t xml:space="preserve">      "</w:t>
-      </w:r>
-      <w:proofErr w:type="spellStart"/>
-      <w:r>
-        <w:rPr>
-          <w:lang w:val="es-CO"/>
-        </w:rPr>
-        <w:t>empresa_id</w:t>
-      </w:r>
-      <w:proofErr w:type="spellEnd"/>
-      <w:r>
-        <w:rPr>
-          <w:lang w:val="es-CO"/>
-        </w:rPr>
-        <w:t>": "EMP-001",</w:t>
-      </w:r>
-    </w:p>
-    <w:p>
-      <w:pPr>
-        <w:rPr>
-          <w:lang w:val="es-CO"/>
-        </w:rPr>
-      </w:pPr>
-      <w:r>
-        <w:rPr>
-          <w:lang w:val="es-CO"/>
-        </w:rPr>
-        <w:t xml:space="preserve">      "</w:t>
-      </w:r>
-      <w:proofErr w:type="spellStart"/>
-      <w:r>
-        <w:rPr>
-          <w:lang w:val="es-CO"/>
-        </w:rPr>
-        <w:t>rol_id</w:t>
-      </w:r>
-      <w:proofErr w:type="spellEnd"/>
-      <w:r>
-        <w:rPr>
-          <w:lang w:val="es-CO"/>
-        </w:rPr>
-        <w:t>": 1,</w:t>
+        <w:t xml:space="preserve">      "empresa_id": "EMP-001",</w:t>
+      </w:r>
+    </w:p>
+    <w:p>
+      <w:pPr>
+        <w:rPr>
+          <w:lang w:val="es-CO"/>
+        </w:rPr>
+      </w:pPr>
+      <w:r>
+        <w:rPr>
+          <w:lang w:val="es-CO"/>
+        </w:rPr>
+        <w:t xml:space="preserve">      "rol_id": 1,</w:t>
       </w:r>
     </w:p>
     <w:p>
@@ -737,20 +517,7 @@
         <w:t xml:space="preserve">      </w:t>
       </w:r>
       <w:r>
-        <w:t>"</w:t>
-      </w:r>
-      <w:proofErr w:type="spellStart"/>
-      <w:proofErr w:type="gramStart"/>
-      <w:r>
-        <w:t>perfil</w:t>
-      </w:r>
-      <w:proofErr w:type="gramEnd"/>
-      <w:r>
-        <w:t>_id</w:t>
-      </w:r>
-      <w:proofErr w:type="spellEnd"/>
-      <w:r>
-        <w:t>": 10</w:t>
+        <w:t>"perfil_id": 10</w:t>
       </w:r>
     </w:p>
     <w:p>
@@ -790,77 +557,7 @@
         <w:rPr>
           <w:lang w:val="es-CO"/>
         </w:rPr>
-        <w:t xml:space="preserve"> El </w:t>
-      </w:r>
-      <w:proofErr w:type="spellStart"/>
-      <w:r>
-        <w:rPr>
-          <w:lang w:val="es-CO"/>
-        </w:rPr>
-        <w:t>Backend</w:t>
-      </w:r>
-      <w:proofErr w:type="spellEnd"/>
-      <w:r>
-        <w:rPr>
-          <w:lang w:val="es-CO"/>
-        </w:rPr>
-        <w:t xml:space="preserve"> rechazará la petición (400 Bad </w:t>
-      </w:r>
-      <w:proofErr w:type="spellStart"/>
-      <w:r>
-        <w:rPr>
-          <w:lang w:val="es-CO"/>
-        </w:rPr>
-        <w:t>Request</w:t>
-      </w:r>
-      <w:proofErr w:type="spellEnd"/>
-      <w:r>
-        <w:rPr>
-          <w:lang w:val="es-CO"/>
-        </w:rPr>
-        <w:t xml:space="preserve">) si </w:t>
-      </w:r>
-      <w:proofErr w:type="gramStart"/>
-      <w:r>
-        <w:rPr>
-          <w:lang w:val="es-CO"/>
-        </w:rPr>
-        <w:t xml:space="preserve">el </w:t>
-      </w:r>
-      <w:proofErr w:type="spellStart"/>
-      <w:r>
-        <w:rPr>
-          <w:lang w:val="es-CO"/>
-        </w:rPr>
-        <w:t>empresa</w:t>
-      </w:r>
-      <w:proofErr w:type="gramEnd"/>
-      <w:r>
-        <w:rPr>
-          <w:lang w:val="es-CO"/>
-        </w:rPr>
-        <w:t>_id</w:t>
-      </w:r>
-      <w:proofErr w:type="spellEnd"/>
-      <w:r>
-        <w:rPr>
-          <w:lang w:val="es-CO"/>
-        </w:rPr>
-        <w:t xml:space="preserve"> o el </w:t>
-      </w:r>
-      <w:proofErr w:type="spellStart"/>
-      <w:r>
-        <w:rPr>
-          <w:lang w:val="es-CO"/>
-        </w:rPr>
-        <w:t>rol_id</w:t>
-      </w:r>
-      <w:proofErr w:type="spellEnd"/>
-      <w:r>
-        <w:rPr>
-          <w:lang w:val="es-CO"/>
-        </w:rPr>
-        <w:t xml:space="preserve"> no existen previamente en la base de datos.</w:t>
+        <w:t xml:space="preserve"> El Backend rechazará la petición (400 Bad Request) si el empresa_id o el rol_id no existen previamente en la base de datos.</w:t>
       </w:r>
     </w:p>
     <w:p>
@@ -890,21 +587,7 @@
         <w:rPr>
           <w:lang w:val="es-CO"/>
         </w:rPr>
-        <w:t xml:space="preserve">Este </w:t>
-      </w:r>
-      <w:proofErr w:type="spellStart"/>
-      <w:r>
-        <w:rPr>
-          <w:lang w:val="es-CO"/>
-        </w:rPr>
-        <w:t>endpoint</w:t>
-      </w:r>
-      <w:proofErr w:type="spellEnd"/>
-      <w:r>
-        <w:rPr>
-          <w:lang w:val="es-CO"/>
-        </w:rPr>
-        <w:t xml:space="preserve"> es vital para tu vista de </w:t>
+        <w:t xml:space="preserve">Este endpoint es vital para tu vista de </w:t>
       </w:r>
       <w:r>
         <w:rPr>
@@ -933,25 +616,7 @@
           <w:bCs/>
           <w:lang w:val="es-CO"/>
         </w:rPr>
-        <w:t xml:space="preserve">Respuesta (Schema: </w:t>
-      </w:r>
-      <w:proofErr w:type="spellStart"/>
-      <w:r>
-        <w:rPr>
-          <w:b/>
-          <w:bCs/>
-          <w:lang w:val="es-CO"/>
-        </w:rPr>
-        <w:t>UsuarioDetalleResponse</w:t>
-      </w:r>
-      <w:proofErr w:type="spellEnd"/>
-      <w:r>
-        <w:rPr>
-          <w:b/>
-          <w:bCs/>
-          <w:lang w:val="es-CO"/>
-        </w:rPr>
-        <w:t>):</w:t>
+        <w:t>Respuesta (Schema: UsuarioDetalleResponse):</w:t>
       </w:r>
     </w:p>
     <w:p>
@@ -1029,143 +694,21 @@
         <w:rPr>
           <w:lang w:val="es-CO"/>
         </w:rPr>
-        <w:t xml:space="preserve">    </w:t>
-      </w:r>
-      <w:proofErr w:type="gramStart"/>
-      <w:r>
-        <w:rPr>
-          <w:lang w:val="es-CO"/>
-        </w:rPr>
-        <w:t>{ "</w:t>
-      </w:r>
-      <w:proofErr w:type="spellStart"/>
-      <w:proofErr w:type="gramEnd"/>
-      <w:r>
-        <w:rPr>
-          <w:lang w:val="es-CO"/>
-        </w:rPr>
-        <w:t>empresa_id</w:t>
-      </w:r>
-      <w:proofErr w:type="spellEnd"/>
-      <w:r>
-        <w:rPr>
-          <w:lang w:val="es-CO"/>
-        </w:rPr>
-        <w:t>": "EMP-001", "</w:t>
-      </w:r>
-      <w:proofErr w:type="spellStart"/>
-      <w:r>
-        <w:rPr>
-          <w:lang w:val="es-CO"/>
-        </w:rPr>
-        <w:t>rol_id</w:t>
-      </w:r>
-      <w:proofErr w:type="spellEnd"/>
-      <w:r>
-        <w:rPr>
-          <w:lang w:val="es-CO"/>
-        </w:rPr>
-        <w:t>": 1, "</w:t>
-      </w:r>
-      <w:proofErr w:type="spellStart"/>
-      <w:r>
-        <w:rPr>
-          <w:lang w:val="es-CO"/>
-        </w:rPr>
-        <w:t>perfil_id</w:t>
-      </w:r>
-      <w:proofErr w:type="spellEnd"/>
-      <w:r>
-        <w:rPr>
-          <w:lang w:val="es-CO"/>
-        </w:rPr>
-        <w:t xml:space="preserve">": </w:t>
-      </w:r>
-      <w:proofErr w:type="gramStart"/>
-      <w:r>
-        <w:rPr>
-          <w:lang w:val="es-CO"/>
-        </w:rPr>
-        <w:t>10 }</w:t>
-      </w:r>
-      <w:proofErr w:type="gramEnd"/>
-      <w:r>
-        <w:rPr>
-          <w:lang w:val="es-CO"/>
-        </w:rPr>
-        <w:t>,</w:t>
-      </w:r>
-    </w:p>
-    <w:p>
-      <w:pPr>
-        <w:rPr>
-          <w:lang w:val="es-CO"/>
-        </w:rPr>
-      </w:pPr>
-      <w:r>
-        <w:rPr>
-          <w:lang w:val="es-CO"/>
-        </w:rPr>
-        <w:t xml:space="preserve">    </w:t>
-      </w:r>
-      <w:proofErr w:type="gramStart"/>
-      <w:r>
-        <w:rPr>
-          <w:lang w:val="es-CO"/>
-        </w:rPr>
-        <w:t>{ "</w:t>
-      </w:r>
-      <w:proofErr w:type="spellStart"/>
-      <w:proofErr w:type="gramEnd"/>
-      <w:r>
-        <w:rPr>
-          <w:lang w:val="es-CO"/>
-        </w:rPr>
-        <w:t>empresa_id</w:t>
-      </w:r>
-      <w:proofErr w:type="spellEnd"/>
-      <w:r>
-        <w:rPr>
-          <w:lang w:val="es-CO"/>
-        </w:rPr>
-        <w:t>": "EMP-002", "</w:t>
-      </w:r>
-      <w:proofErr w:type="spellStart"/>
-      <w:r>
-        <w:rPr>
-          <w:lang w:val="es-CO"/>
-        </w:rPr>
-        <w:t>rol_id</w:t>
-      </w:r>
-      <w:proofErr w:type="spellEnd"/>
-      <w:r>
-        <w:rPr>
-          <w:lang w:val="es-CO"/>
-        </w:rPr>
-        <w:t>": 2, "</w:t>
-      </w:r>
-      <w:proofErr w:type="spellStart"/>
-      <w:r>
-        <w:rPr>
-          <w:lang w:val="es-CO"/>
-        </w:rPr>
-        <w:t>perfil_id</w:t>
-      </w:r>
-      <w:proofErr w:type="spellEnd"/>
-      <w:r>
-        <w:rPr>
-          <w:lang w:val="es-CO"/>
-        </w:rPr>
-        <w:t xml:space="preserve">": </w:t>
-      </w:r>
-      <w:proofErr w:type="gramStart"/>
-      <w:r>
-        <w:rPr>
-          <w:lang w:val="es-CO"/>
-        </w:rPr>
-        <w:t>11 }</w:t>
-      </w:r>
-      <w:proofErr w:type="gramEnd"/>
+        <w:t xml:space="preserve">    { "empresa_id": "EMP-001", "rol_id": 1, "perfil_id": 10 },</w:t>
+      </w:r>
+    </w:p>
+    <w:p>
+      <w:pPr>
+        <w:rPr>
+          <w:lang w:val="es-CO"/>
+        </w:rPr>
+      </w:pPr>
+      <w:r>
+        <w:rPr>
+          <w:lang w:val="es-CO"/>
+        </w:rPr>
+        <w:t xml:space="preserve">    { "empresa_id": "EMP-002", "rol_id": 2, "perfil_id": 11 }</w:t>
+      </w:r>
     </w:p>
     <w:p>
       <w:pPr>
@@ -1240,25 +783,7 @@
           <w:bCs/>
           <w:lang w:val="es-CO"/>
         </w:rPr>
-        <w:t xml:space="preserve">409 </w:t>
-      </w:r>
-      <w:proofErr w:type="spellStart"/>
-      <w:r>
-        <w:rPr>
-          <w:b/>
-          <w:bCs/>
-          <w:lang w:val="es-CO"/>
-        </w:rPr>
-        <w:t>Conflict</w:t>
-      </w:r>
-      <w:proofErr w:type="spellEnd"/>
-      <w:r>
-        <w:rPr>
-          <w:b/>
-          <w:bCs/>
-          <w:lang w:val="es-CO"/>
-        </w:rPr>
-        <w:t>:</w:t>
+        <w:t>409 Conflict:</w:t>
       </w:r>
       <w:r>
         <w:rPr>
@@ -1297,77 +822,13 @@
           <w:bCs/>
           <w:lang w:val="es-CO"/>
         </w:rPr>
-        <w:t xml:space="preserve">422 </w:t>
-      </w:r>
-      <w:proofErr w:type="spellStart"/>
-      <w:r>
-        <w:rPr>
-          <w:b/>
-          <w:bCs/>
-          <w:lang w:val="es-CO"/>
-        </w:rPr>
-        <w:t>Unprocessable</w:t>
-      </w:r>
-      <w:proofErr w:type="spellEnd"/>
-      <w:r>
-        <w:rPr>
-          <w:b/>
-          <w:bCs/>
-          <w:lang w:val="es-CO"/>
-        </w:rPr>
-        <w:t xml:space="preserve"> </w:t>
-      </w:r>
-      <w:proofErr w:type="spellStart"/>
-      <w:r>
-        <w:rPr>
-          <w:b/>
-          <w:bCs/>
-          <w:lang w:val="es-CO"/>
-        </w:rPr>
-        <w:t>Entity</w:t>
-      </w:r>
-      <w:proofErr w:type="spellEnd"/>
-      <w:r>
-        <w:rPr>
-          <w:b/>
-          <w:bCs/>
-          <w:lang w:val="es-CO"/>
-        </w:rPr>
-        <w:t>:</w:t>
-      </w:r>
-      <w:r>
-        <w:rPr>
-          <w:lang w:val="es-CO"/>
-        </w:rPr>
-        <w:t xml:space="preserve"> Error de </w:t>
-      </w:r>
-      <w:proofErr w:type="spellStart"/>
-      <w:r>
-        <w:rPr>
-          <w:lang w:val="es-CO"/>
-        </w:rPr>
-        <w:t>Pydantic</w:t>
-      </w:r>
-      <w:proofErr w:type="spellEnd"/>
-      <w:r>
-        <w:rPr>
-          <w:lang w:val="es-CO"/>
-        </w:rPr>
-        <w:t>. Falta un campo obligatorio (</w:t>
-      </w:r>
-      <w:proofErr w:type="spellStart"/>
-      <w:r>
-        <w:rPr>
-          <w:lang w:val="es-CO"/>
-        </w:rPr>
-        <w:t>ej</w:t>
-      </w:r>
-      <w:proofErr w:type="spellEnd"/>
-      <w:r>
-        <w:rPr>
-          <w:lang w:val="es-CO"/>
-        </w:rPr>
-        <w:t>: olvidaste el apellido).</w:t>
+        <w:t>422 Unprocessable Entity:</w:t>
+      </w:r>
+      <w:r>
+        <w:rPr>
+          <w:lang w:val="es-CO"/>
+        </w:rPr>
+        <w:t xml:space="preserve"> Error de Pydantic. Falta un campo obligatorio (ej: olvidaste el apellido).</w:t>
       </w:r>
     </w:p>
     <w:p>
@@ -1386,25 +847,7 @@
           <w:bCs/>
           <w:lang w:val="es-CO"/>
         </w:rPr>
-        <w:t xml:space="preserve">400 Bad </w:t>
-      </w:r>
-      <w:proofErr w:type="spellStart"/>
-      <w:r>
-        <w:rPr>
-          <w:b/>
-          <w:bCs/>
-          <w:lang w:val="es-CO"/>
-        </w:rPr>
-        <w:t>Request</w:t>
-      </w:r>
-      <w:proofErr w:type="spellEnd"/>
-      <w:r>
-        <w:rPr>
-          <w:b/>
-          <w:bCs/>
-          <w:lang w:val="es-CO"/>
-        </w:rPr>
-        <w:t>:</w:t>
+        <w:t>400 Bad Request:</w:t>
       </w:r>
       <w:r>
         <w:rPr>
@@ -1427,25 +870,7 @@
           <w:bCs/>
           <w:lang w:val="es-CO"/>
         </w:rPr>
-        <w:t>4. Lógica de "Borrado" (</w:t>
-      </w:r>
-      <w:proofErr w:type="spellStart"/>
-      <w:r>
-        <w:rPr>
-          <w:b/>
-          <w:bCs/>
-          <w:lang w:val="es-CO"/>
-        </w:rPr>
-        <w:t>Soft</w:t>
-      </w:r>
-      <w:proofErr w:type="spellEnd"/>
-      <w:r>
-        <w:rPr>
-          <w:b/>
-          <w:bCs/>
-          <w:lang w:val="es-CO"/>
-        </w:rPr>
-        <w:t xml:space="preserve"> Delete)</w:t>
+        <w:t>4. Lógica de "Borrado" (Soft Delete)</w:t>
       </w:r>
     </w:p>
     <w:p>
@@ -1489,21 +914,7 @@
         <w:rPr>
           <w:lang w:val="es-CO"/>
         </w:rPr>
-        <w:t xml:space="preserve">El </w:t>
-      </w:r>
-      <w:proofErr w:type="spellStart"/>
-      <w:r>
-        <w:rPr>
-          <w:lang w:val="es-CO"/>
-        </w:rPr>
-        <w:t>endpoint</w:t>
-      </w:r>
-      <w:proofErr w:type="spellEnd"/>
-      <w:r>
-        <w:rPr>
-          <w:lang w:val="es-CO"/>
-        </w:rPr>
-        <w:t xml:space="preserve"> DELETE cambia el estado a false.</w:t>
+        <w:t>El endpoint DELETE cambia el estado a false.</w:t>
       </w:r>
     </w:p>
     <w:p>
@@ -1520,21 +931,7 @@
         <w:rPr>
           <w:lang w:val="es-CO"/>
         </w:rPr>
-        <w:t xml:space="preserve">El GET / (listado) filtrará automáticamente y solo te enviará </w:t>
-      </w:r>
-      <w:proofErr w:type="gramStart"/>
-      <w:r>
-        <w:rPr>
-          <w:lang w:val="es-CO"/>
-        </w:rPr>
-        <w:t>los estado</w:t>
-      </w:r>
-      <w:proofErr w:type="gramEnd"/>
-      <w:r>
-        <w:rPr>
-          <w:lang w:val="es-CO"/>
-        </w:rPr>
-        <w:t>: true.</w:t>
+        <w:t>El GET / (listado) filtrará automáticamente y solo te enviará los estado: true.</w:t>
       </w:r>
     </w:p>
     <w:p>
@@ -1572,45 +969,13 @@
           <w:bCs/>
           <w:lang w:val="es-CO"/>
         </w:rPr>
-        <w:t>componente dinámico (</w:t>
-      </w:r>
-      <w:proofErr w:type="spellStart"/>
-      <w:r>
-        <w:rPr>
-          <w:b/>
-          <w:bCs/>
-          <w:lang w:val="es-CO"/>
-        </w:rPr>
-        <w:t>Repeater</w:t>
-      </w:r>
-      <w:proofErr w:type="spellEnd"/>
-      <w:r>
-        <w:rPr>
-          <w:b/>
-          <w:bCs/>
-          <w:lang w:val="es-CO"/>
-        </w:rPr>
-        <w:t>)</w:t>
-      </w:r>
-      <w:r>
-        <w:rPr>
-          <w:lang w:val="es-CO"/>
-        </w:rPr>
-        <w:t xml:space="preserve"> donde puedas agregar filas de "Empresa - Rol - Perfil" para un mismo usuario antes de hacer el </w:t>
-      </w:r>
-      <w:proofErr w:type="spellStart"/>
-      <w:r>
-        <w:rPr>
-          <w:lang w:val="es-CO"/>
-        </w:rPr>
-        <w:t>submit</w:t>
-      </w:r>
-      <w:proofErr w:type="spellEnd"/>
-      <w:r>
-        <w:rPr>
-          <w:lang w:val="es-CO"/>
-        </w:rPr>
-        <w:t>.</w:t>
+        <w:t>componente dinámico (Repeater)</w:t>
+      </w:r>
+      <w:r>
+        <w:rPr>
+          <w:lang w:val="es-CO"/>
+        </w:rPr>
+        <w:t xml:space="preserve"> donde puedas agregar filas de "Empresa - Rol - Perfil" para un mismo usuario antes de hacer el submit.</w:t>
       </w:r>
     </w:p>
     <w:p>
@@ -1638,21 +1003,7 @@
         <w:rPr>
           <w:lang w:val="es-CO"/>
         </w:rPr>
-        <w:t xml:space="preserve">, con este reporte Juan Camilo ya tiene los </w:t>
-      </w:r>
-      <w:proofErr w:type="spellStart"/>
-      <w:r>
-        <w:rPr>
-          <w:lang w:val="es-CO"/>
-        </w:rPr>
-        <w:t>payloads</w:t>
-      </w:r>
-      <w:proofErr w:type="spellEnd"/>
-      <w:r>
-        <w:rPr>
-          <w:lang w:val="es-CO"/>
-        </w:rPr>
-        <w:t xml:space="preserve"> y los códigos de error necesarios para conectar el formulario de usuarios. ¿Quieres que procedamos con la siguiente HU o necesitas ajustar algo más de este informe?</w:t>
+        <w:t>, con este reporte Juan Camilo ya tiene los payloads y los códigos de error necesarios para conectar el formulario de usuarios. ¿Quieres que procedamos con la siguiente HU o necesitas ajustar algo más de este informe?</w:t>
       </w:r>
     </w:p>
     <w:p>
@@ -1686,25 +1037,7 @@
           <w:bCs/>
           <w:lang w:val="es-CO"/>
         </w:rPr>
-        <w:t>2. Entrega para Juan Camilo (</w:t>
-      </w:r>
-      <w:proofErr w:type="spellStart"/>
-      <w:r>
-        <w:rPr>
-          <w:b/>
-          <w:bCs/>
-          <w:lang w:val="es-CO"/>
-        </w:rPr>
-        <w:t>Frontend</w:t>
-      </w:r>
-      <w:proofErr w:type="spellEnd"/>
-      <w:r>
-        <w:rPr>
-          <w:b/>
-          <w:bCs/>
-          <w:lang w:val="es-CO"/>
-        </w:rPr>
-        <w:t>)</w:t>
+        <w:t>2. Entrega para Juan Camilo (Frontend)</w:t>
       </w:r>
     </w:p>
     <w:p>
@@ -1742,60 +1075,16 @@
           <w:bCs/>
           <w:lang w:val="es-CO"/>
         </w:rPr>
-        <w:t xml:space="preserve"> Especificaciones Técnicas </w:t>
-      </w:r>
-      <w:proofErr w:type="gramStart"/>
-      <w:r>
-        <w:rPr>
-          <w:b/>
-          <w:bCs/>
-          <w:lang w:val="es-CO"/>
-        </w:rPr>
-        <w:t xml:space="preserve">para </w:t>
-      </w:r>
-      <w:proofErr w:type="spellStart"/>
-      <w:r>
-        <w:rPr>
-          <w:b/>
-          <w:bCs/>
-          <w:lang w:val="es-CO"/>
-        </w:rPr>
-        <w:t>Frontend</w:t>
-      </w:r>
-      <w:proofErr w:type="spellEnd"/>
-      <w:proofErr w:type="gramEnd"/>
-      <w:r>
-        <w:rPr>
-          <w:b/>
-          <w:bCs/>
-          <w:lang w:val="es-CO"/>
-        </w:rPr>
-        <w:t xml:space="preserve"> (HU-002/003)</w:t>
-      </w:r>
-    </w:p>
-    <w:p>
-      <w:r>
-        <w:rPr>
-          <w:b/>
-          <w:bCs/>
-        </w:rPr>
-        <w:t xml:space="preserve">Punto de </w:t>
-      </w:r>
-      <w:proofErr w:type="spellStart"/>
-      <w:r>
-        <w:rPr>
-          <w:b/>
-          <w:bCs/>
-        </w:rPr>
-        <w:t>Acceso</w:t>
-      </w:r>
-      <w:proofErr w:type="spellEnd"/>
-      <w:r>
-        <w:rPr>
-          <w:b/>
-          <w:bCs/>
-        </w:rPr>
-        <w:t xml:space="preserve"> (Login):</w:t>
+        <w:t xml:space="preserve"> Especificaciones Técnicas para Frontend (HU-002/003)</w:t>
+      </w:r>
+    </w:p>
+    <w:p>
+      <w:r>
+        <w:rPr>
+          <w:b/>
+          <w:bCs/>
+        </w:rPr>
+        <w:t>Punto de Acceso (Login):</w:t>
       </w:r>
     </w:p>
     <w:p>
@@ -1813,15 +1102,7 @@
         <w:t>Endpoint:</w:t>
       </w:r>
       <w:r>
-        <w:t xml:space="preserve"> POST /</w:t>
-      </w:r>
-      <w:proofErr w:type="spellStart"/>
-      <w:r>
-        <w:t>api</w:t>
-      </w:r>
-      <w:proofErr w:type="spellEnd"/>
-      <w:r>
-        <w:t>/v1/auth/login</w:t>
+        <w:t xml:space="preserve"> POST /api/v1/auth/login</w:t>
       </w:r>
     </w:p>
     <w:p>
@@ -1837,23 +1118,7 @@
           <w:bCs/>
         </w:rPr>
         <w:lastRenderedPageBreak/>
-        <w:t xml:space="preserve">Payload </w:t>
-      </w:r>
-      <w:proofErr w:type="spellStart"/>
-      <w:r>
-        <w:rPr>
-          <w:b/>
-          <w:bCs/>
-        </w:rPr>
-        <w:t>esperado</w:t>
-      </w:r>
-      <w:proofErr w:type="spellEnd"/>
-      <w:r>
-        <w:rPr>
-          <w:b/>
-          <w:bCs/>
-        </w:rPr>
-        <w:t>:</w:t>
+        <w:t>Payload esperado:</w:t>
       </w:r>
       <w:r>
         <w:t xml:space="preserve"> username (email) y password.</w:t>
@@ -1881,55 +1146,16 @@
         <w:rPr>
           <w:lang w:val="es-CO"/>
         </w:rPr>
-        <w:t xml:space="preserve"> Recibirás un </w:t>
-      </w:r>
-      <w:proofErr w:type="spellStart"/>
-      <w:r>
-        <w:rPr>
-          <w:lang w:val="es-CO"/>
-        </w:rPr>
-        <w:t>access_token</w:t>
-      </w:r>
-      <w:proofErr w:type="spellEnd"/>
-      <w:r>
-        <w:rPr>
-          <w:lang w:val="es-CO"/>
-        </w:rPr>
-        <w:t xml:space="preserve"> tipo Bearer.</w:t>
-      </w:r>
-    </w:p>
-    <w:p>
-      <w:proofErr w:type="spellStart"/>
-      <w:r>
-        <w:rPr>
-          <w:b/>
-          <w:bCs/>
-        </w:rPr>
-        <w:t>Contexto</w:t>
-      </w:r>
-      <w:proofErr w:type="spellEnd"/>
-      <w:r>
-        <w:rPr>
-          <w:b/>
-          <w:bCs/>
-        </w:rPr>
-        <w:t xml:space="preserve"> </w:t>
-      </w:r>
-      <w:proofErr w:type="spellStart"/>
-      <w:r>
-        <w:rPr>
-          <w:b/>
-          <w:bCs/>
-        </w:rPr>
-        <w:t>Multiempresa</w:t>
-      </w:r>
-      <w:proofErr w:type="spellEnd"/>
-      <w:r>
-        <w:rPr>
-          <w:b/>
-          <w:bCs/>
-        </w:rPr>
-        <w:t>:</w:t>
+        <w:t xml:space="preserve"> Recibirás un access_token tipo Bearer.</w:t>
+      </w:r>
+    </w:p>
+    <w:p>
+      <w:r>
+        <w:rPr>
+          <w:b/>
+          <w:bCs/>
+        </w:rPr>
+        <w:t>Contexto Multiempresa:</w:t>
       </w:r>
     </w:p>
     <w:p>
@@ -1954,21 +1180,7 @@
         <w:rPr>
           <w:lang w:val="es-CO"/>
         </w:rPr>
-        <w:t xml:space="preserve"> Para todas las peticiones privadas (usuarios, roles, inventarios), debes enviar el ID de la empresa activa en el </w:t>
-      </w:r>
-      <w:proofErr w:type="spellStart"/>
-      <w:r>
-        <w:rPr>
-          <w:lang w:val="es-CO"/>
-        </w:rPr>
-        <w:t>header</w:t>
-      </w:r>
-      <w:proofErr w:type="spellEnd"/>
-      <w:r>
-        <w:rPr>
-          <w:lang w:val="es-CO"/>
-        </w:rPr>
-        <w:t>:</w:t>
+        <w:t xml:space="preserve"> Para todas las peticiones privadas (usuarios, roles, inventarios), debes enviar el ID de la empresa activa en el header:</w:t>
       </w:r>
     </w:p>
     <w:p>
@@ -2004,55 +1216,16 @@
         <w:rPr>
           <w:lang w:val="es-CO"/>
         </w:rPr>
-        <w:t xml:space="preserve"> El </w:t>
-      </w:r>
-      <w:proofErr w:type="spellStart"/>
-      <w:r>
-        <w:rPr>
-          <w:lang w:val="es-CO"/>
-        </w:rPr>
-        <w:t>backend</w:t>
-      </w:r>
-      <w:proofErr w:type="spellEnd"/>
-      <w:r>
-        <w:rPr>
-          <w:lang w:val="es-CO"/>
-        </w:rPr>
-        <w:t xml:space="preserve"> filtrará los datos automáticamente basándose en ese Header. Si no lo envías, podrías recibir un error de "Empresa no especificada".</w:t>
-      </w:r>
-    </w:p>
-    <w:p>
-      <w:proofErr w:type="spellStart"/>
-      <w:r>
-        <w:rPr>
-          <w:b/>
-          <w:bCs/>
-        </w:rPr>
-        <w:t>Estructura</w:t>
-      </w:r>
-      <w:proofErr w:type="spellEnd"/>
-      <w:r>
-        <w:rPr>
-          <w:b/>
-          <w:bCs/>
-        </w:rPr>
-        <w:t xml:space="preserve"> de </w:t>
-      </w:r>
-      <w:proofErr w:type="spellStart"/>
-      <w:r>
-        <w:rPr>
-          <w:b/>
-          <w:bCs/>
-        </w:rPr>
-        <w:t>Permisos</w:t>
-      </w:r>
-      <w:proofErr w:type="spellEnd"/>
-      <w:r>
-        <w:rPr>
-          <w:b/>
-          <w:bCs/>
-        </w:rPr>
-        <w:t xml:space="preserve"> (RBAC):</w:t>
+        <w:t xml:space="preserve"> El backend filtrará los datos automáticamente basándose en ese Header. Si no lo envías, podrías recibir un error de "Empresa no especificada".</w:t>
+      </w:r>
+    </w:p>
+    <w:p>
+      <w:r>
+        <w:rPr>
+          <w:b/>
+          <w:bCs/>
+        </w:rPr>
+        <w:t>Estructura de Permisos (RBAC):</w:t>
       </w:r>
     </w:p>
     <w:p>
@@ -2069,91 +1242,7 @@
         <w:rPr>
           <w:lang w:val="es-CO"/>
         </w:rPr>
-        <w:t xml:space="preserve">Los permisos son granulares por perfil. Juan, usa esta taxonomía en tus componentes de permisos: </w:t>
-      </w:r>
-      <w:proofErr w:type="spellStart"/>
-      <w:r>
-        <w:rPr>
-          <w:lang w:val="es-CO"/>
-        </w:rPr>
-        <w:t>view</w:t>
-      </w:r>
-      <w:proofErr w:type="spellEnd"/>
-      <w:r>
-        <w:rPr>
-          <w:lang w:val="es-CO"/>
-        </w:rPr>
-        <w:t xml:space="preserve">, </w:t>
-      </w:r>
-      <w:proofErr w:type="spellStart"/>
-      <w:r>
-        <w:rPr>
-          <w:lang w:val="es-CO"/>
-        </w:rPr>
-        <w:t>create</w:t>
-      </w:r>
-      <w:proofErr w:type="spellEnd"/>
-      <w:r>
-        <w:rPr>
-          <w:lang w:val="es-CO"/>
-        </w:rPr>
-        <w:t xml:space="preserve">, </w:t>
-      </w:r>
-      <w:proofErr w:type="spellStart"/>
-      <w:r>
-        <w:rPr>
-          <w:lang w:val="es-CO"/>
-        </w:rPr>
-        <w:t>edit</w:t>
-      </w:r>
-      <w:proofErr w:type="spellEnd"/>
-      <w:r>
-        <w:rPr>
-          <w:lang w:val="es-CO"/>
-        </w:rPr>
-        <w:t xml:space="preserve">, </w:t>
-      </w:r>
-      <w:proofErr w:type="spellStart"/>
-      <w:r>
-        <w:rPr>
-          <w:lang w:val="es-CO"/>
-        </w:rPr>
-        <w:t>delete</w:t>
-      </w:r>
-      <w:proofErr w:type="spellEnd"/>
-      <w:r>
-        <w:rPr>
-          <w:lang w:val="es-CO"/>
-        </w:rPr>
-        <w:t xml:space="preserve">, </w:t>
-      </w:r>
-      <w:proofErr w:type="spellStart"/>
-      <w:r>
-        <w:rPr>
-          <w:lang w:val="es-CO"/>
-        </w:rPr>
-        <w:t>approve</w:t>
-      </w:r>
-      <w:proofErr w:type="spellEnd"/>
-      <w:r>
-        <w:rPr>
-          <w:lang w:val="es-CO"/>
-        </w:rPr>
-        <w:t xml:space="preserve">, </w:t>
-      </w:r>
-      <w:proofErr w:type="spellStart"/>
-      <w:r>
-        <w:rPr>
-          <w:lang w:val="es-CO"/>
-        </w:rPr>
-        <w:t>manage</w:t>
-      </w:r>
-      <w:proofErr w:type="spellEnd"/>
-      <w:r>
-        <w:rPr>
-          <w:lang w:val="es-CO"/>
-        </w:rPr>
-        <w:t>.</w:t>
+        <w:t>Los permisos son granulares por perfil. Juan, usa esta taxonomía en tus componentes de permisos: view, create, edit, delete, approve, manage.</w:t>
       </w:r>
     </w:p>
     <w:p>
@@ -2170,76 +1259,16 @@
         <w:rPr>
           <w:lang w:val="es-CO"/>
         </w:rPr>
-        <w:t xml:space="preserve">Si un usuario tiene el perfil "Auditor" en la empresa "EMP-001", el </w:t>
-      </w:r>
-      <w:proofErr w:type="spellStart"/>
-      <w:r>
-        <w:rPr>
-          <w:lang w:val="es-CO"/>
-        </w:rPr>
-        <w:t>backend</w:t>
-      </w:r>
-      <w:proofErr w:type="spellEnd"/>
-      <w:r>
-        <w:rPr>
-          <w:lang w:val="es-CO"/>
-        </w:rPr>
-        <w:t xml:space="preserve"> solo le permitirá acciones de </w:t>
-      </w:r>
-      <w:proofErr w:type="spellStart"/>
-      <w:r>
-        <w:rPr>
-          <w:lang w:val="es-CO"/>
-        </w:rPr>
-        <w:t>view</w:t>
-      </w:r>
-      <w:proofErr w:type="spellEnd"/>
-      <w:r>
-        <w:rPr>
-          <w:lang w:val="es-CO"/>
-        </w:rPr>
-        <w:t>.</w:t>
-      </w:r>
-    </w:p>
-    <w:p>
-      <w:r>
-        <w:rPr>
-          <w:b/>
-          <w:bCs/>
-        </w:rPr>
-        <w:t xml:space="preserve">Endpoints </w:t>
-      </w:r>
-      <w:proofErr w:type="spellStart"/>
-      <w:r>
-        <w:rPr>
-          <w:b/>
-          <w:bCs/>
-        </w:rPr>
-        <w:t>Listos</w:t>
-      </w:r>
-      <w:proofErr w:type="spellEnd"/>
-      <w:r>
-        <w:rPr>
-          <w:b/>
-          <w:bCs/>
-        </w:rPr>
-        <w:t xml:space="preserve"> para </w:t>
-      </w:r>
-      <w:proofErr w:type="spellStart"/>
-      <w:r>
-        <w:rPr>
-          <w:b/>
-          <w:bCs/>
-        </w:rPr>
-        <w:t>Integrar</w:t>
-      </w:r>
-      <w:proofErr w:type="spellEnd"/>
-      <w:r>
-        <w:rPr>
-          <w:b/>
-          <w:bCs/>
-        </w:rPr>
-        <w:t>:</w:t>
+        <w:t>Si un usuario tiene el perfil "Auditor" en la empresa "EMP-001", el backend solo le permitirá acciones de view.</w:t>
+      </w:r>
+    </w:p>
+    <w:p>
+      <w:r>
+        <w:rPr>
+          <w:b/>
+          <w:bCs/>
+        </w:rPr>
+        <w:t>Endpoints Listos para Integrar:</w:t>
       </w:r>
     </w:p>
     <w:p>
@@ -2256,21 +1285,7 @@
         <w:rPr>
           <w:lang w:val="es-CO"/>
         </w:rPr>
-        <w:t xml:space="preserve">GET /api/v1/usuarios: Listado de usuarios de la empresa activa (basado en el </w:t>
-      </w:r>
-      <w:proofErr w:type="spellStart"/>
-      <w:r>
-        <w:rPr>
-          <w:lang w:val="es-CO"/>
-        </w:rPr>
-        <w:t>header</w:t>
-      </w:r>
-      <w:proofErr w:type="spellEnd"/>
-      <w:r>
-        <w:rPr>
-          <w:lang w:val="es-CO"/>
-        </w:rPr>
-        <w:t>).</w:t>
+        <w:t>GET /api/v1/usuarios: Listado de usuarios de la empresa activa (basado en el header).</w:t>
       </w:r>
     </w:p>
     <w:p>
@@ -2304,35 +1319,7 @@
         <w:rPr>
           <w:lang w:val="es-CO"/>
         </w:rPr>
-        <w:t>GET /api/v1/</w:t>
-      </w:r>
-      <w:proofErr w:type="spellStart"/>
-      <w:r>
-        <w:rPr>
-          <w:lang w:val="es-CO"/>
-        </w:rPr>
-        <w:t>auth</w:t>
-      </w:r>
-      <w:proofErr w:type="spellEnd"/>
-      <w:r>
-        <w:rPr>
-          <w:lang w:val="es-CO"/>
-        </w:rPr>
-        <w:t xml:space="preserve">/me: Para obtener los datos del usuario </w:t>
-      </w:r>
-      <w:proofErr w:type="spellStart"/>
-      <w:r>
-        <w:rPr>
-          <w:lang w:val="es-CO"/>
-        </w:rPr>
-        <w:t>logueado</w:t>
-      </w:r>
-      <w:proofErr w:type="spellEnd"/>
-      <w:r>
-        <w:rPr>
-          <w:lang w:val="es-CO"/>
-        </w:rPr>
-        <w:t xml:space="preserve"> y sus empresas asociadas.</w:t>
+        <w:t>GET /api/v1/auth/me: Para obtener los datos del usuario logueado y sus empresas asociadas.</w:t>
       </w:r>
     </w:p>
     <w:p>
@@ -2394,35 +1381,7 @@
         <w:rPr>
           <w:lang w:val="es-CO"/>
         </w:rPr>
-        <w:t xml:space="preserve"> Verifica que el código de </w:t>
-      </w:r>
-      <w:proofErr w:type="spellStart"/>
-      <w:r>
-        <w:rPr>
-          <w:lang w:val="es-CO"/>
-        </w:rPr>
-        <w:t>FastAPI</w:t>
-      </w:r>
-      <w:proofErr w:type="spellEnd"/>
-      <w:r>
-        <w:rPr>
-          <w:lang w:val="es-CO"/>
-        </w:rPr>
-        <w:t xml:space="preserve"> esté extrayendo correctamente el X-Company-ID del </w:t>
-      </w:r>
-      <w:proofErr w:type="spellStart"/>
-      <w:r>
-        <w:rPr>
-          <w:lang w:val="es-CO"/>
-        </w:rPr>
-        <w:t>header</w:t>
-      </w:r>
-      <w:proofErr w:type="spellEnd"/>
-      <w:r>
-        <w:rPr>
-          <w:lang w:val="es-CO"/>
-        </w:rPr>
-        <w:t xml:space="preserve"> para las consultas de base de datos.</w:t>
+        <w:t xml:space="preserve"> Verifica que el código de FastAPI esté extrayendo correctamente el X-Company-ID del header para las consultas de base de datos.</w:t>
       </w:r>
     </w:p>
     <w:p>
@@ -2447,49 +1406,7 @@
         <w:rPr>
           <w:lang w:val="es-CO"/>
         </w:rPr>
-        <w:t xml:space="preserve"> Pásale la URL de tu Swagger (http://127.0.0.1:8000/docs) para que él vea los modelos de datos (</w:t>
-      </w:r>
-      <w:proofErr w:type="spellStart"/>
-      <w:r>
-        <w:rPr>
-          <w:lang w:val="es-CO"/>
-        </w:rPr>
-        <w:t>schemas</w:t>
-      </w:r>
-      <w:proofErr w:type="spellEnd"/>
-      <w:r>
-        <w:rPr>
-          <w:lang w:val="es-CO"/>
-        </w:rPr>
-        <w:t xml:space="preserve">) actualizados de </w:t>
-      </w:r>
-      <w:proofErr w:type="spellStart"/>
-      <w:r>
-        <w:rPr>
-          <w:lang w:val="es-CO"/>
-        </w:rPr>
-        <w:t>UsuarioCreate</w:t>
-      </w:r>
-      <w:proofErr w:type="spellEnd"/>
-      <w:r>
-        <w:rPr>
-          <w:lang w:val="es-CO"/>
-        </w:rPr>
-        <w:t xml:space="preserve"> y </w:t>
-      </w:r>
-      <w:proofErr w:type="spellStart"/>
-      <w:r>
-        <w:rPr>
-          <w:lang w:val="es-CO"/>
-        </w:rPr>
-        <w:t>UsuarioResponse</w:t>
-      </w:r>
-      <w:proofErr w:type="spellEnd"/>
-      <w:r>
-        <w:rPr>
-          <w:lang w:val="es-CO"/>
-        </w:rPr>
-        <w:t>.</w:t>
+        <w:t xml:space="preserve"> Pásale la URL de tu Swagger (http://127.0.0.1:8000/docs) para que él vea los modelos de datos (schemas) actualizados de UsuarioCreate y UsuarioResponse.</w:t>
       </w:r>
     </w:p>
     <w:p>
@@ -2522,43 +1439,19 @@
         </w:rPr>
         <w:t xml:space="preserve">Para que Juan Camilo pueda integrar el </w:t>
       </w:r>
-      <w:proofErr w:type="spellStart"/>
-      <w:r>
-        <w:rPr>
-          <w:b/>
-          <w:bCs/>
-          <w:lang w:val="es-CO"/>
-        </w:rPr>
-        <w:t>Frontend</w:t>
-      </w:r>
-      <w:proofErr w:type="spellEnd"/>
-      <w:r>
-        <w:rPr>
-          <w:b/>
-          <w:bCs/>
-          <w:lang w:val="es-CO"/>
-        </w:rPr>
-        <w:t xml:space="preserve"> en Angular</w:t>
-      </w:r>
-      <w:r>
-        <w:rPr>
-          <w:lang w:val="es-CO"/>
-        </w:rPr>
-        <w:t xml:space="preserve"> con estos nuevos cambios, necesita conocer los nuevos </w:t>
-      </w:r>
-      <w:proofErr w:type="spellStart"/>
-      <w:r>
-        <w:rPr>
-          <w:lang w:val="es-CO"/>
-        </w:rPr>
-        <w:t>endpoints</w:t>
-      </w:r>
-      <w:proofErr w:type="spellEnd"/>
-      <w:r>
-        <w:rPr>
-          <w:lang w:val="es-CO"/>
-        </w:rPr>
-        <w:t xml:space="preserve">, la estructura del JSON y las reglas de negocio que implementamos para cumplir con la </w:t>
+      <w:r>
+        <w:rPr>
+          <w:b/>
+          <w:bCs/>
+          <w:lang w:val="es-CO"/>
+        </w:rPr>
+        <w:t>Frontend en Angular</w:t>
+      </w:r>
+      <w:r>
+        <w:rPr>
+          <w:lang w:val="es-CO"/>
+        </w:rPr>
+        <w:t xml:space="preserve"> con estos nuevos cambios, necesita conocer los nuevos endpoints, la estructura del JSON y las reglas de negocio que implementamos para cumplir con la </w:t>
       </w:r>
       <w:r>
         <w:rPr>
@@ -2591,7 +1484,7 @@
     <w:p>
       <w:r>
         <w:pict w14:anchorId="34D05541">
-          <v:rect id="_x0000_i1040" style="width:0;height:1.5pt" o:hralign="center" o:hrstd="t" o:hrnoshade="t" o:hr="t" fillcolor="gray" stroked="f"/>
+          <v:rect id="_x0000_i1028" style="width:0;height:1.5pt" o:hralign="center" o:hrstd="t" o:hrnoshade="t" o:hr="t" fillcolor="gray" stroked="f"/>
         </w:pict>
       </w:r>
     </w:p>
@@ -2607,25 +1500,7 @@
           <w:bCs/>
           <w:lang w:val="es-CO"/>
         </w:rPr>
-        <w:t xml:space="preserve">Asunto: Actualización de </w:t>
-      </w:r>
-      <w:proofErr w:type="spellStart"/>
-      <w:r>
-        <w:rPr>
-          <w:b/>
-          <w:bCs/>
-          <w:lang w:val="es-CO"/>
-        </w:rPr>
-        <w:t>Backend</w:t>
-      </w:r>
-      <w:proofErr w:type="spellEnd"/>
-      <w:r>
-        <w:rPr>
-          <w:b/>
-          <w:bCs/>
-          <w:lang w:val="es-CO"/>
-        </w:rPr>
-        <w:t xml:space="preserve"> - Implementación HU-013 (Roles por Empresa)</w:t>
+        <w:t>Asunto: Actualización de Backend - Implementación HU-013 (Roles por Empresa)</w:t>
       </w:r>
     </w:p>
     <w:p>
@@ -2665,21 +1540,7 @@
         <w:rPr>
           <w:lang w:val="es-CO"/>
         </w:rPr>
-        <w:t xml:space="preserve"> en el </w:t>
-      </w:r>
-      <w:proofErr w:type="spellStart"/>
-      <w:r>
-        <w:rPr>
-          <w:lang w:val="es-CO"/>
-        </w:rPr>
-        <w:t>Backend</w:t>
-      </w:r>
-      <w:proofErr w:type="spellEnd"/>
-      <w:r>
-        <w:rPr>
-          <w:lang w:val="es-CO"/>
-        </w:rPr>
-        <w:t>. He actualizado los modelos y esquemas para que cada empresa maneje su propia estructura de roles de forma independiente.</w:t>
+        <w:t xml:space="preserve"> en el Backend. He actualizado los modelos y esquemas para que cada empresa maneje su propia estructura de roles de forma independiente.</w:t>
       </w:r>
     </w:p>
     <w:p>
@@ -2729,21 +1590,7 @@
         <w:rPr>
           <w:lang w:val="es-CO"/>
         </w:rPr>
-        <w:t xml:space="preserve"> Los roles ahora están filtrados por </w:t>
-      </w:r>
-      <w:proofErr w:type="spellStart"/>
-      <w:r>
-        <w:rPr>
-          <w:lang w:val="es-CO"/>
-        </w:rPr>
-        <w:t>empresa_id</w:t>
-      </w:r>
-      <w:proofErr w:type="spellEnd"/>
-      <w:r>
-        <w:rPr>
-          <w:lang w:val="es-CO"/>
-        </w:rPr>
-        <w:t>. Un mismo nombre de rol puede existir en diferentes empresas, pero es único dentro de la misma.</w:t>
+        <w:t xml:space="preserve"> Los roles ahora están filtrados por empresa_id. Un mismo nombre de rol puede existir en diferentes empresas, pero es único dentro de la misma.</w:t>
       </w:r>
     </w:p>
     <w:p>
@@ -2782,21 +1629,7 @@
         <w:rPr>
           <w:lang w:val="es-CO"/>
         </w:rPr>
-        <w:t xml:space="preserve">. El </w:t>
-      </w:r>
-      <w:proofErr w:type="spellStart"/>
-      <w:r>
-        <w:rPr>
-          <w:lang w:val="es-CO"/>
-        </w:rPr>
-        <w:t>endpoint</w:t>
-      </w:r>
-      <w:proofErr w:type="spellEnd"/>
-      <w:r>
-        <w:rPr>
-          <w:lang w:val="es-CO"/>
-        </w:rPr>
-        <w:t xml:space="preserve"> DELETE ahora realiza una desactivación lógica (estado: "inactivo").</w:t>
+        <w:t>. El endpoint DELETE ahora realiza una desactivación lógica (estado: "inactivo").</w:t>
       </w:r>
     </w:p>
     <w:p>
@@ -2860,25 +1693,7 @@
           <w:bCs/>
           <w:lang w:val="es-CO"/>
         </w:rPr>
-        <w:t xml:space="preserve"> Nuevos </w:t>
-      </w:r>
-      <w:proofErr w:type="spellStart"/>
-      <w:r>
-        <w:rPr>
-          <w:b/>
-          <w:bCs/>
-          <w:lang w:val="es-CO"/>
-        </w:rPr>
-        <w:t>Endpoints</w:t>
-      </w:r>
-      <w:proofErr w:type="spellEnd"/>
-      <w:r>
-        <w:rPr>
-          <w:b/>
-          <w:bCs/>
-          <w:lang w:val="es-CO"/>
-        </w:rPr>
-        <w:t xml:space="preserve"> (Base: /api/v1/seguridad)</w:t>
+        <w:t xml:space="preserve"> Nuevos Endpoints (Base: /api/v1/seguridad)</w:t>
       </w:r>
     </w:p>
     <w:tbl>
@@ -2920,7 +1735,6 @@
             <w:hideMark/>
           </w:tcPr>
           <w:p>
-            <w:proofErr w:type="spellStart"/>
             <w:r>
               <w:rPr>
                 <w:b/>
@@ -2928,7 +1742,6 @@
               </w:rPr>
               <w:t>Método</w:t>
             </w:r>
-            <w:proofErr w:type="spellEnd"/>
           </w:p>
         </w:tc>
         <w:tc>
@@ -2978,7 +1791,6 @@
             <w:hideMark/>
           </w:tcPr>
           <w:p>
-            <w:proofErr w:type="spellStart"/>
             <w:r>
               <w:rPr>
                 <w:b/>
@@ -2986,7 +1798,6 @@
               </w:rPr>
               <w:t>Descripción</w:t>
             </w:r>
-            <w:proofErr w:type="spellEnd"/>
           </w:p>
         </w:tc>
       </w:tr>
@@ -3131,33 +1942,7 @@
           </w:tcPr>
           <w:p>
             <w:r>
-              <w:t>/</w:t>
-            </w:r>
-            <w:proofErr w:type="gramStart"/>
-            <w:r>
-              <w:t>roles</w:t>
-            </w:r>
-            <w:proofErr w:type="gramEnd"/>
-            <w:r>
-              <w:t>/</w:t>
-            </w:r>
-            <w:proofErr w:type="spellStart"/>
-            <w:proofErr w:type="gramStart"/>
-            <w:r>
-              <w:t>empresa</w:t>
-            </w:r>
-            <w:proofErr w:type="spellEnd"/>
-            <w:r>
-              <w:t>/{</w:t>
-            </w:r>
-            <w:proofErr w:type="spellStart"/>
-            <w:proofErr w:type="gramEnd"/>
-            <w:r>
-              <w:t>empresa_id</w:t>
-            </w:r>
-            <w:proofErr w:type="spellEnd"/>
-            <w:r>
-              <w:t>}</w:t>
+              <w:t>/roles/empresa/{empresa_id}</w:t>
             </w:r>
           </w:p>
         </w:tc>
@@ -3247,20 +2032,7 @@
           </w:tcPr>
           <w:p>
             <w:r>
-              <w:t>/</w:t>
-            </w:r>
-            <w:proofErr w:type="gramStart"/>
-            <w:r>
-              <w:t>roles/{</w:t>
-            </w:r>
-            <w:proofErr w:type="spellStart"/>
-            <w:proofErr w:type="gramEnd"/>
-            <w:r>
-              <w:t>rol_id</w:t>
-            </w:r>
-            <w:proofErr w:type="spellEnd"/>
-            <w:r>
-              <w:t>}</w:t>
+              <w:t>/roles/{rol_id}</w:t>
             </w:r>
           </w:p>
         </w:tc>
@@ -3349,20 +2121,7 @@
           </w:tcPr>
           <w:p>
             <w:r>
-              <w:t>/</w:t>
-            </w:r>
-            <w:proofErr w:type="gramStart"/>
-            <w:r>
-              <w:t>roles/{</w:t>
-            </w:r>
-            <w:proofErr w:type="spellStart"/>
-            <w:proofErr w:type="gramEnd"/>
-            <w:r>
-              <w:t>rol_id</w:t>
-            </w:r>
-            <w:proofErr w:type="spellEnd"/>
-            <w:r>
-              <w:t>}</w:t>
+              <w:t>/roles/{rol_id}</w:t>
             </w:r>
           </w:p>
         </w:tc>
@@ -3394,21 +2153,7 @@
               <w:rPr>
                 <w:lang w:val="es-CO"/>
               </w:rPr>
-              <w:t>Desactiva el rol (</w:t>
-            </w:r>
-            <w:proofErr w:type="spellStart"/>
-            <w:r>
-              <w:rPr>
-                <w:lang w:val="es-CO"/>
-              </w:rPr>
-              <w:t>Soft</w:t>
-            </w:r>
-            <w:proofErr w:type="spellEnd"/>
-            <w:r>
-              <w:rPr>
-                <w:lang w:val="es-CO"/>
-              </w:rPr>
-              <w:t xml:space="preserve"> Delete).</w:t>
+              <w:t>Desactiva el rol (Soft Delete).</w:t>
             </w:r>
           </w:p>
         </w:tc>
@@ -3436,25 +2181,7 @@
           <w:bCs/>
           <w:lang w:val="es-CO"/>
         </w:rPr>
-        <w:t xml:space="preserve"> Ejemplo de </w:t>
-      </w:r>
-      <w:proofErr w:type="spellStart"/>
-      <w:r>
-        <w:rPr>
-          <w:b/>
-          <w:bCs/>
-          <w:lang w:val="es-CO"/>
-        </w:rPr>
-        <w:t>Payload</w:t>
-      </w:r>
-      <w:proofErr w:type="spellEnd"/>
-      <w:r>
-        <w:rPr>
-          <w:b/>
-          <w:bCs/>
-          <w:lang w:val="es-CO"/>
-        </w:rPr>
-        <w:t xml:space="preserve"> (Creación/Edición)</w:t>
+        <w:t xml:space="preserve"> Ejemplo de Payload (Creación/Edición)</w:t>
       </w:r>
     </w:p>
     <w:p>
@@ -3519,48 +2246,20 @@
         <w:rPr>
           <w:lang w:val="es-CO"/>
         </w:rPr>
-        <w:t xml:space="preserve">  "</w:t>
-      </w:r>
-      <w:proofErr w:type="spellStart"/>
-      <w:r>
-        <w:rPr>
-          <w:lang w:val="es-CO"/>
-        </w:rPr>
-        <w:t>descripcion</w:t>
-      </w:r>
-      <w:proofErr w:type="spellEnd"/>
-      <w:r>
-        <w:rPr>
-          <w:lang w:val="es-CO"/>
-        </w:rPr>
-        <w:t>": "Acceso total al módulo comercial",</w:t>
-      </w:r>
-    </w:p>
-    <w:p>
-      <w:pPr>
-        <w:rPr>
-          <w:lang w:val="es-CO"/>
-        </w:rPr>
-      </w:pPr>
-      <w:r>
-        <w:rPr>
-          <w:lang w:val="es-CO"/>
-        </w:rPr>
-        <w:t xml:space="preserve">  "</w:t>
-      </w:r>
-      <w:proofErr w:type="spellStart"/>
-      <w:r>
-        <w:rPr>
-          <w:lang w:val="es-CO"/>
-        </w:rPr>
-        <w:t>empresa_id</w:t>
-      </w:r>
-      <w:proofErr w:type="spellEnd"/>
-      <w:r>
-        <w:rPr>
-          <w:lang w:val="es-CO"/>
-        </w:rPr>
-        <w:t>": "MED-BOG-01",</w:t>
+        <w:t xml:space="preserve">  "descripcion": "Acceso total al módulo comercial",</w:t>
+      </w:r>
+    </w:p>
+    <w:p>
+      <w:pPr>
+        <w:rPr>
+          <w:lang w:val="es-CO"/>
+        </w:rPr>
+      </w:pPr>
+      <w:r>
+        <w:rPr>
+          <w:lang w:val="es-CO"/>
+        </w:rPr>
+        <w:t xml:space="preserve">  "empresa_id": "MED-BOG-01",</w:t>
       </w:r>
     </w:p>
     <w:p>
@@ -3707,47 +2406,11 @@
           <w:lang w:val="es-CO"/>
         </w:rPr>
       </w:pPr>
-      <w:proofErr w:type="gramStart"/>
-      <w:r>
-        <w:rPr>
-          <w:lang w:val="es-CO"/>
-        </w:rPr>
-        <w:t>Asegurar</w:t>
-      </w:r>
-      <w:proofErr w:type="gramEnd"/>
-      <w:r>
-        <w:rPr>
-          <w:lang w:val="es-CO"/>
-        </w:rPr>
-        <w:t xml:space="preserve"> que el modal de creación envíe </w:t>
-      </w:r>
-      <w:proofErr w:type="gramStart"/>
-      <w:r>
-        <w:rPr>
-          <w:lang w:val="es-CO"/>
-        </w:rPr>
-        <w:t xml:space="preserve">el </w:t>
-      </w:r>
-      <w:proofErr w:type="spellStart"/>
-      <w:r>
-        <w:rPr>
-          <w:lang w:val="es-CO"/>
-        </w:rPr>
-        <w:t>empresa</w:t>
-      </w:r>
-      <w:proofErr w:type="gramEnd"/>
-      <w:r>
-        <w:rPr>
-          <w:lang w:val="es-CO"/>
-        </w:rPr>
-        <w:t>_id</w:t>
-      </w:r>
-      <w:proofErr w:type="spellEnd"/>
-      <w:r>
-        <w:rPr>
-          <w:lang w:val="es-CO"/>
-        </w:rPr>
-        <w:t xml:space="preserve"> de la empresa que el usuario tiene seleccionada actualmente.</w:t>
+      <w:r>
+        <w:rPr>
+          <w:lang w:val="es-CO"/>
+        </w:rPr>
+        <w:t>Asegurar que el modal de creación envíe el empresa_id de la empresa que el usuario tiene seleccionada actualmente.</w:t>
       </w:r>
     </w:p>
     <w:p>
@@ -3794,7 +2457,7 @@
     <w:p>
       <w:r>
         <w:pict w14:anchorId="37637635">
-          <v:rect id="_x0000_i1041" style="width:0;height:1.5pt" o:hralign="center" o:hrstd="t" o:hrnoshade="t" o:hr="t" fillcolor="gray" stroked="f"/>
+          <v:rect id="_x0000_i1029" style="width:0;height:1.5pt" o:hralign="center" o:hrstd="t" o:hrnoshade="t" o:hr="t" fillcolor="gray" stroked="f"/>
         </w:pict>
       </w:r>
     </w:p>
@@ -3809,6 +2472,476 @@
           <w:lang w:val="es-CO"/>
         </w:rPr>
         <w:t>¿Hay algún otro detalle técnico o validación específica que quieras que le mencione a Juan Camilo?</w:t>
+      </w:r>
+    </w:p>
+    <w:p>
+      <w:pPr>
+        <w:rPr>
+          <w:sz w:val="48"/>
+          <w:szCs w:val="48"/>
+          <w:lang w:val="es-CO"/>
+        </w:rPr>
+      </w:pPr>
+      <w:r>
+        <w:rPr>
+          <w:sz w:val="48"/>
+          <w:szCs w:val="48"/>
+          <w:lang w:val="es-CO"/>
+        </w:rPr>
+        <w:t>HU – 014</w:t>
+      </w:r>
+    </w:p>
+    <w:p>
+      <w:r>
+        <w:t xml:space="preserve">Para que Juan Camilo pueda integrar la </w:t>
+      </w:r>
+      <w:r>
+        <w:rPr>
+          <w:b/>
+          <w:bCs/>
+        </w:rPr>
+        <w:t>HU-014</w:t>
+      </w:r>
+      <w:r>
+        <w:t xml:space="preserve"> en el Frontend (Angular), necesita entender cómo estructurar el árbol de permisos y cómo interactuar con los nuevos endpoints segmentados por empresa.</w:t>
+      </w:r>
+    </w:p>
+    <w:p>
+      <w:r>
+        <w:t>Aquí tienes la explicación técnica detallada para enviarle:</w:t>
+      </w:r>
+    </w:p>
+    <w:p>
+      <w:r>
+        <w:pict w14:anchorId="3558F30D">
+          <v:rect id="_x0000_i1042" style="width:0;height:1.5pt" o:hralign="center" o:hrstd="t" o:hrnoshade="t" o:hr="t" fillcolor="gray" stroked="f"/>
+        </w:pict>
+      </w:r>
+    </w:p>
+    <w:p>
+      <w:pPr>
+        <w:rPr>
+          <w:b/>
+          <w:bCs/>
+        </w:rPr>
+      </w:pPr>
+      <w:r>
+        <w:rPr>
+          <w:rFonts w:ascii="Segoe UI Emoji" w:hAnsi="Segoe UI Emoji" w:cs="Segoe UI Emoji"/>
+          <w:b/>
+          <w:bCs/>
+        </w:rPr>
+        <w:t>🔐</w:t>
+      </w:r>
+      <w:r>
+        <w:rPr>
+          <w:b/>
+          <w:bCs/>
+        </w:rPr>
+        <w:t xml:space="preserve"> Integración HU-014: Gestión de Perfiles y Permisos</w:t>
+      </w:r>
+    </w:p>
+    <w:p>
+      <w:r>
+        <w:t xml:space="preserve">Hola Juan Camilo, ya está lista la implementación de la </w:t>
+      </w:r>
+      <w:r>
+        <w:rPr>
+          <w:b/>
+          <w:bCs/>
+        </w:rPr>
+        <w:t>HU-014</w:t>
+      </w:r>
+      <w:r>
+        <w:t xml:space="preserve">. A diferencia de los Roles (HU-013), los </w:t>
+      </w:r>
+      <w:r>
+        <w:rPr>
+          <w:b/>
+          <w:bCs/>
+        </w:rPr>
+        <w:t>Perfiles</w:t>
+      </w:r>
+      <w:r>
+        <w:t xml:space="preserve"> manejan la lógica granular de accesos a nivel de módulos y acciones específicas.</w:t>
+      </w:r>
+    </w:p>
+    <w:p>
+      <w:pPr>
+        <w:rPr>
+          <w:b/>
+          <w:bCs/>
+        </w:rPr>
+      </w:pPr>
+      <w:r>
+        <w:rPr>
+          <w:b/>
+          <w:bCs/>
+        </w:rPr>
+        <w:t>1. Estructura de Endpoints</w:t>
+      </w:r>
+    </w:p>
+    <w:p>
+      <w:r>
+        <w:t>Los endpoints ahora siguen una ruta jerárquica que incluye el empresa_id en la URL para garantizar la segmentación:</w:t>
+      </w:r>
+    </w:p>
+    <w:p>
+      <w:pPr>
+        <w:numPr>
+          <w:ilvl w:val="0"/>
+          <w:numId w:val="12"/>
+        </w:numPr>
+      </w:pPr>
+      <w:r>
+        <w:rPr>
+          <w:b/>
+          <w:bCs/>
+        </w:rPr>
+        <w:t>Listar Perfiles:</w:t>
+      </w:r>
+      <w:r>
+        <w:t xml:space="preserve"> GET /api/v1/seguridad/empresas/{empresa_id}/perfiles </w:t>
+      </w:r>
+    </w:p>
+    <w:p>
+      <w:pPr>
+        <w:numPr>
+          <w:ilvl w:val="0"/>
+          <w:numId w:val="12"/>
+        </w:numPr>
+      </w:pPr>
+      <w:r>
+        <w:rPr>
+          <w:b/>
+          <w:bCs/>
+        </w:rPr>
+        <w:t>Crear Perfil:</w:t>
+      </w:r>
+      <w:r>
+        <w:t xml:space="preserve"> POST /api/v1/seguridad/empresas/{empresa_id}/perfiles </w:t>
+      </w:r>
+    </w:p>
+    <w:p>
+      <w:pPr>
+        <w:numPr>
+          <w:ilvl w:val="0"/>
+          <w:numId w:val="12"/>
+        </w:numPr>
+      </w:pPr>
+      <w:r>
+        <w:rPr>
+          <w:b/>
+          <w:bCs/>
+        </w:rPr>
+        <w:t>Actualizar:</w:t>
+      </w:r>
+      <w:r>
+        <w:t xml:space="preserve"> PUT /api/v1/seguridad/empresas/{empresa_id}/perfiles/{perfil_id} </w:t>
+      </w:r>
+    </w:p>
+    <w:p>
+      <w:pPr>
+        <w:numPr>
+          <w:ilvl w:val="0"/>
+          <w:numId w:val="12"/>
+        </w:numPr>
+      </w:pPr>
+      <w:r>
+        <w:rPr>
+          <w:b/>
+          <w:bCs/>
+        </w:rPr>
+        <w:t>Desactivar:</w:t>
+      </w:r>
+      <w:r>
+        <w:t xml:space="preserve"> DELETE /api/v1/seguridad/empresas/{empresa_id}/perfiles/{perfil_id} </w:t>
+      </w:r>
+    </w:p>
+    <w:p>
+      <w:pPr>
+        <w:rPr>
+          <w:b/>
+          <w:bCs/>
+        </w:rPr>
+      </w:pPr>
+      <w:r>
+        <w:rPr>
+          <w:b/>
+          <w:bCs/>
+        </w:rPr>
+        <w:t>2. El Objeto de Permisos (JSON)</w:t>
+      </w:r>
+    </w:p>
+    <w:p>
+      <w:r>
+        <w:t xml:space="preserve">Para el </w:t>
+      </w:r>
+      <w:r>
+        <w:rPr>
+          <w:b/>
+          <w:bCs/>
+        </w:rPr>
+        <w:t>Árbol de Permisos</w:t>
+      </w:r>
+      <w:r>
+        <w:t xml:space="preserve"> con checkboxes que solicita Gabriel Oliveros, el Backend espera y entrega un objeto JSON con este formato:</w:t>
+      </w:r>
+    </w:p>
+    <w:p>
+      <w:r>
+        <w:t>JSON</w:t>
+      </w:r>
+    </w:p>
+    <w:p>
+      <w:r>
+        <w:t>{</w:t>
+      </w:r>
+    </w:p>
+    <w:p>
+      <w:r>
+        <w:t xml:space="preserve">  "nombre": "Analista de Inventarios",</w:t>
+      </w:r>
+    </w:p>
+    <w:p>
+      <w:r>
+        <w:lastRenderedPageBreak/>
+        <w:t xml:space="preserve">  "descripcion": "Acceso limitado a bodega y reportes",</w:t>
+      </w:r>
+    </w:p>
+    <w:p>
+      <w:r>
+        <w:t xml:space="preserve">  "empresa_id": "MED-BOG-01",</w:t>
+      </w:r>
+    </w:p>
+    <w:p>
+      <w:r>
+        <w:t xml:space="preserve">  "permisos": {</w:t>
+      </w:r>
+    </w:p>
+    <w:p>
+      <w:r>
+        <w:t xml:space="preserve">    "inventarios": {</w:t>
+      </w:r>
+    </w:p>
+    <w:p>
+      <w:r>
+        <w:t xml:space="preserve">      "consultar": true,</w:t>
+      </w:r>
+    </w:p>
+    <w:p>
+      <w:r>
+        <w:t xml:space="preserve">      "crear": true,</w:t>
+      </w:r>
+    </w:p>
+    <w:p>
+      <w:r>
+        <w:t xml:space="preserve">      "editar": false,</w:t>
+      </w:r>
+    </w:p>
+    <w:p>
+      <w:r>
+        <w:t xml:space="preserve">      "exportar": true</w:t>
+      </w:r>
+    </w:p>
+    <w:p>
+      <w:r>
+        <w:t xml:space="preserve">    },</w:t>
+      </w:r>
+    </w:p>
+    <w:p>
+      <w:r>
+        <w:t xml:space="preserve">    "compras": {</w:t>
+      </w:r>
+    </w:p>
+    <w:p>
+      <w:r>
+        <w:t xml:space="preserve">      "consultar": true,</w:t>
+      </w:r>
+    </w:p>
+    <w:p>
+      <w:r>
+        <w:t xml:space="preserve">      "crear": false,</w:t>
+      </w:r>
+    </w:p>
+    <w:p>
+      <w:r>
+        <w:t xml:space="preserve">      "editar": false,</w:t>
+      </w:r>
+    </w:p>
+    <w:p>
+      <w:r>
+        <w:t xml:space="preserve">      "exportar": false</w:t>
+      </w:r>
+    </w:p>
+    <w:p>
+      <w:r>
+        <w:t xml:space="preserve">    }</w:t>
+      </w:r>
+    </w:p>
+    <w:p>
+      <w:r>
+        <w:t xml:space="preserve">  },</w:t>
+      </w:r>
+    </w:p>
+    <w:p>
+      <w:r>
+        <w:t xml:space="preserve">  "estado": true</w:t>
+      </w:r>
+    </w:p>
+    <w:p>
+      <w:r>
+        <w:t>}</w:t>
+      </w:r>
+    </w:p>
+    <w:p>
+      <w:pPr>
+        <w:rPr>
+          <w:b/>
+          <w:bCs/>
+        </w:rPr>
+      </w:pPr>
+      <w:r>
+        <w:rPr>
+          <w:b/>
+          <w:bCs/>
+        </w:rPr>
+        <w:t>3. Reglas de Negocio a Considerar en el Front</w:t>
+      </w:r>
+    </w:p>
+    <w:p>
+      <w:pPr>
+        <w:numPr>
+          <w:ilvl w:val="0"/>
+          <w:numId w:val="13"/>
+        </w:numPr>
+      </w:pPr>
+      <w:r>
+        <w:rPr>
+          <w:b/>
+          <w:bCs/>
+        </w:rPr>
+        <w:t>Validación de Nombre:</w:t>
+      </w:r>
+      <w:r>
+        <w:t xml:space="preserve"> El sistema validará que el nombre del perfil sea único </w:t>
+      </w:r>
+      <w:r>
+        <w:rPr>
+          <w:b/>
+          <w:bCs/>
+        </w:rPr>
+        <w:t>solo dentro de la empresa activa</w:t>
+      </w:r>
+      <w:r>
+        <w:t>.</w:t>
+      </w:r>
+    </w:p>
+    <w:p>
+      <w:pPr>
+        <w:numPr>
+          <w:ilvl w:val="0"/>
+          <w:numId w:val="13"/>
+        </w:numPr>
+      </w:pPr>
+      <w:r>
+        <w:rPr>
+          <w:b/>
+          <w:bCs/>
+        </w:rPr>
+        <w:t>Estado Booleano:</w:t>
+      </w:r>
+      <w:r>
+        <w:t xml:space="preserve"> A diferencia de Roles (que usa strings), Perfiles usa un Boolean para el campo estado.</w:t>
+      </w:r>
+    </w:p>
+    <w:p>
+      <w:pPr>
+        <w:numPr>
+          <w:ilvl w:val="0"/>
+          <w:numId w:val="13"/>
+        </w:numPr>
+      </w:pPr>
+      <w:r>
+        <w:rPr>
+          <w:b/>
+          <w:bCs/>
+        </w:rPr>
+        <w:t>No Eliminación:</w:t>
+      </w:r>
+      <w:r>
+        <w:t xml:space="preserve"> El método DELETE no borra el registro; simplemente setea el estado a false para mantener la trazabilidad.</w:t>
+      </w:r>
+    </w:p>
+    <w:p>
+      <w:pPr>
+        <w:numPr>
+          <w:ilvl w:val="0"/>
+          <w:numId w:val="13"/>
+        </w:numPr>
+      </w:pPr>
+      <w:r>
+        <w:rPr>
+          <w:b/>
+          <w:bCs/>
+        </w:rPr>
+        <w:t>Longitudes:</w:t>
+      </w:r>
+      <w:r>
+        <w:t xml:space="preserve"> El nombre del perfil tiene un máximo de </w:t>
+      </w:r>
+      <w:r>
+        <w:rPr>
+          <w:b/>
+          <w:bCs/>
+        </w:rPr>
+        <w:t>100 caracteres</w:t>
+      </w:r>
+      <w:r>
+        <w:t xml:space="preserve"> y la descripción </w:t>
+      </w:r>
+      <w:r>
+        <w:rPr>
+          <w:b/>
+          <w:bCs/>
+        </w:rPr>
+        <w:t>300</w:t>
+      </w:r>
+      <w:r>
+        <w:t>.</w:t>
+      </w:r>
+    </w:p>
+    <w:p>
+      <w:pPr>
+        <w:rPr>
+          <w:b/>
+          <w:bCs/>
+        </w:rPr>
+      </w:pPr>
+      <w:r>
+        <w:rPr>
+          <w:b/>
+          <w:bCs/>
+        </w:rPr>
+        <w:lastRenderedPageBreak/>
+        <w:t>4. Datos de Salida para las Tablas</w:t>
+      </w:r>
+    </w:p>
+    <w:p>
+      <w:r>
+        <w:t>Al realizar un GET, recibirás los campos id (perfilId), nombre, permisos, empresa_id y estado.</w:t>
+      </w:r>
+    </w:p>
+    <w:p>
+      <w:r>
+        <w:pict w14:anchorId="3070F78A">
+          <v:rect id="_x0000_i1043" style="width:0;height:1.5pt" o:hralign="center" o:hrstd="t" o:hrnoshade="t" o:hr="t" fillcolor="gray" stroked="f"/>
+        </w:pict>
+      </w:r>
+    </w:p>
+    <w:p>
+      <w:r>
+        <w:t>¿Necesitas que detallemos algún flujo adicional para la asignación de estos perfiles a los usuarios (HU-011)?</w:t>
       </w:r>
     </w:p>
     <w:p>
@@ -3831,6 +2964,155 @@
 <file path=word/numbering.xml><?xml version="1.0" encoding="utf-8"?>
 <w:numbering xmlns:wpc="http://schemas.microsoft.com/office/word/2010/wordprocessingCanvas" xmlns:cx="http://schemas.microsoft.com/office/drawing/2014/chartex" xmlns:cx1="http://schemas.microsoft.com/office/drawing/2015/9/8/chartex" xmlns:cx2="http://schemas.microsoft.com/office/drawing/2015/10/21/chartex" xmlns:cx3="http://schemas.microsoft.com/office/drawing/2016/5/9/chartex" xmlns:cx4="http://schemas.microsoft.com/office/drawing/2016/5/10/chartex" xmlns:cx5="http://schemas.microsoft.com/office/drawing/2016/5/11/chartex" xmlns:cx6="http://schemas.microsoft.com/office/drawing/2016/5/12/chartex" xmlns:cx7="http://schemas.microsoft.com/office/drawing/2016/5/13/chartex" xmlns:cx8="http://schemas.microsoft.com/office/drawing/2016/5/14/chartex" xmlns:mc="http://schemas.openxmlformats.org/markup-compatibility/2006" xmlns:aink="http://schemas.microsoft.com/office/drawing/2016/ink" xmlns:am3d="http://schemas.microsoft.com/office/drawing/2017/model3d" xmlns:o="urn:schemas-microsoft-com:office:office" xmlns:oel="http://schemas.microsoft.com/office/2019/extlst" xmlns:r="http://schemas.openxmlformats.org/officeDocument/2006/relationships" xmlns:m="http://schemas.openxmlformats.org/officeDocument/2006/math" xmlns:v="urn:schemas-microsoft-com:vml" xmlns:wp14="http://schemas.microsoft.com/office/word/2010/wordprocessingDrawing" xmlns:wp="http://schemas.openxmlformats.org/drawingml/2006/wordprocessingDrawing" xmlns:w10="urn:schemas-microsoft-com:office:word" xmlns:w="http://schemas.openxmlformats.org/wordprocessingml/2006/main" xmlns:w14="http://schemas.microsoft.com/office/word/2010/wordml" xmlns:w15="http://schemas.microsoft.com/office/word/2012/wordml" xmlns:w16cex="http://schemas.microsoft.com/office/word/2018/wordml/cex" xmlns:w16cid="http://schemas.microsoft.com/office/word/2016/wordml/cid" xmlns:w16="http://schemas.microsoft.com/office/word/2018/wordml" xmlns:w16du="http://schemas.microsoft.com/office/word/2023/wordml/word16du" xmlns:w16sdtdh="http://schemas.microsoft.com/office/word/2020/wordml/sdtdatahash" xmlns:w16sdtfl="http://schemas.microsoft.com/office/word/2024/wordml/sdtformatlock" xmlns:w16se="http://schemas.microsoft.com/office/word/2015/wordml/symex" xmlns:wpg="http://schemas.microsoft.com/office/word/2010/wordprocessingGroup" xmlns:wpi="http://schemas.microsoft.com/office/word/2010/wordprocessingInk" xmlns:wne="http://schemas.microsoft.com/office/word/2006/wordml" xmlns:wps="http://schemas.microsoft.com/office/word/2010/wordprocessingShape" mc:Ignorable="w14 w15 w16se w16cid w16 w16cex w16sdtdh w16sdtfl w16du wp14">
   <w:abstractNum w:abstractNumId="0" w15:restartNumberingAfterBreak="0">
+    <w:nsid w:val="1E695712"/>
+    <w:multiLevelType w:val="multilevel"/>
+    <w:tmpl w:val="05E8D97A"/>
+    <w:lvl w:ilvl="0">
+      <w:start w:val="1"/>
+      <w:numFmt w:val="bullet"/>
+      <w:lvlText w:val=""/>
+      <w:lvlJc w:val="left"/>
+      <w:pPr>
+        <w:tabs>
+          <w:tab w:val="num" w:pos="720"/>
+        </w:tabs>
+        <w:ind w:left="720" w:hanging="360"/>
+      </w:pPr>
+      <w:rPr>
+        <w:rFonts w:ascii="Symbol" w:hAnsi="Symbol" w:hint="default"/>
+        <w:sz w:val="20"/>
+      </w:rPr>
+    </w:lvl>
+    <w:lvl w:ilvl="1" w:tentative="1">
+      <w:start w:val="1"/>
+      <w:numFmt w:val="bullet"/>
+      <w:lvlText w:val="o"/>
+      <w:lvlJc w:val="left"/>
+      <w:pPr>
+        <w:tabs>
+          <w:tab w:val="num" w:pos="1440"/>
+        </w:tabs>
+        <w:ind w:left="1440" w:hanging="360"/>
+      </w:pPr>
+      <w:rPr>
+        <w:rFonts w:ascii="Courier New" w:hAnsi="Courier New" w:hint="default"/>
+        <w:sz w:val="20"/>
+      </w:rPr>
+    </w:lvl>
+    <w:lvl w:ilvl="2" w:tentative="1">
+      <w:start w:val="1"/>
+      <w:numFmt w:val="bullet"/>
+      <w:lvlText w:val=""/>
+      <w:lvlJc w:val="left"/>
+      <w:pPr>
+        <w:tabs>
+          <w:tab w:val="num" w:pos="2160"/>
+        </w:tabs>
+        <w:ind w:left="2160" w:hanging="360"/>
+      </w:pPr>
+      <w:rPr>
+        <w:rFonts w:ascii="Wingdings" w:hAnsi="Wingdings" w:hint="default"/>
+        <w:sz w:val="20"/>
+      </w:rPr>
+    </w:lvl>
+    <w:lvl w:ilvl="3" w:tentative="1">
+      <w:start w:val="1"/>
+      <w:numFmt w:val="bullet"/>
+      <w:lvlText w:val=""/>
+      <w:lvlJc w:val="left"/>
+      <w:pPr>
+        <w:tabs>
+          <w:tab w:val="num" w:pos="2880"/>
+        </w:tabs>
+        <w:ind w:left="2880" w:hanging="360"/>
+      </w:pPr>
+      <w:rPr>
+        <w:rFonts w:ascii="Wingdings" w:hAnsi="Wingdings" w:hint="default"/>
+        <w:sz w:val="20"/>
+      </w:rPr>
+    </w:lvl>
+    <w:lvl w:ilvl="4" w:tentative="1">
+      <w:start w:val="1"/>
+      <w:numFmt w:val="bullet"/>
+      <w:lvlText w:val=""/>
+      <w:lvlJc w:val="left"/>
+      <w:pPr>
+        <w:tabs>
+          <w:tab w:val="num" w:pos="3600"/>
+        </w:tabs>
+        <w:ind w:left="3600" w:hanging="360"/>
+      </w:pPr>
+      <w:rPr>
+        <w:rFonts w:ascii="Wingdings" w:hAnsi="Wingdings" w:hint="default"/>
+        <w:sz w:val="20"/>
+      </w:rPr>
+    </w:lvl>
+    <w:lvl w:ilvl="5" w:tentative="1">
+      <w:start w:val="1"/>
+      <w:numFmt w:val="bullet"/>
+      <w:lvlText w:val=""/>
+      <w:lvlJc w:val="left"/>
+      <w:pPr>
+        <w:tabs>
+          <w:tab w:val="num" w:pos="4320"/>
+        </w:tabs>
+        <w:ind w:left="4320" w:hanging="360"/>
+      </w:pPr>
+      <w:rPr>
+        <w:rFonts w:ascii="Wingdings" w:hAnsi="Wingdings" w:hint="default"/>
+        <w:sz w:val="20"/>
+      </w:rPr>
+    </w:lvl>
+    <w:lvl w:ilvl="6" w:tentative="1">
+      <w:start w:val="1"/>
+      <w:numFmt w:val="bullet"/>
+      <w:lvlText w:val=""/>
+      <w:lvlJc w:val="left"/>
+      <w:pPr>
+        <w:tabs>
+          <w:tab w:val="num" w:pos="5040"/>
+        </w:tabs>
+        <w:ind w:left="5040" w:hanging="360"/>
+      </w:pPr>
+      <w:rPr>
+        <w:rFonts w:ascii="Wingdings" w:hAnsi="Wingdings" w:hint="default"/>
+        <w:sz w:val="20"/>
+      </w:rPr>
+    </w:lvl>
+    <w:lvl w:ilvl="7" w:tentative="1">
+      <w:start w:val="1"/>
+      <w:numFmt w:val="bullet"/>
+      <w:lvlText w:val=""/>
+      <w:lvlJc w:val="left"/>
+      <w:pPr>
+        <w:tabs>
+          <w:tab w:val="num" w:pos="5760"/>
+        </w:tabs>
+        <w:ind w:left="5760" w:hanging="360"/>
+      </w:pPr>
+      <w:rPr>
+        <w:rFonts w:ascii="Wingdings" w:hAnsi="Wingdings" w:hint="default"/>
+        <w:sz w:val="20"/>
+      </w:rPr>
+    </w:lvl>
+    <w:lvl w:ilvl="8" w:tentative="1">
+      <w:start w:val="1"/>
+      <w:numFmt w:val="bullet"/>
+      <w:lvlText w:val=""/>
+      <w:lvlJc w:val="left"/>
+      <w:pPr>
+        <w:tabs>
+          <w:tab w:val="num" w:pos="6480"/>
+        </w:tabs>
+        <w:ind w:left="6480" w:hanging="360"/>
+      </w:pPr>
+      <w:rPr>
+        <w:rFonts w:ascii="Wingdings" w:hAnsi="Wingdings" w:hint="default"/>
+        <w:sz w:val="20"/>
+      </w:rPr>
+    </w:lvl>
+  </w:abstractNum>
+  <w:abstractNum w:abstractNumId="1" w15:restartNumberingAfterBreak="0">
     <w:nsid w:val="20BA2A50"/>
     <w:multiLevelType w:val="multilevel"/>
     <w:tmpl w:val="00B6B176"/>
@@ -3979,7 +3261,7 @@
       </w:rPr>
     </w:lvl>
   </w:abstractNum>
-  <w:abstractNum w:abstractNumId="1" w15:restartNumberingAfterBreak="0">
+  <w:abstractNum w:abstractNumId="2" w15:restartNumberingAfterBreak="0">
     <w:nsid w:val="257A78F6"/>
     <w:multiLevelType w:val="multilevel"/>
     <w:tmpl w:val="9F783722"/>
@@ -4128,7 +3410,7 @@
       </w:rPr>
     </w:lvl>
   </w:abstractNum>
-  <w:abstractNum w:abstractNumId="2" w15:restartNumberingAfterBreak="0">
+  <w:abstractNum w:abstractNumId="3" w15:restartNumberingAfterBreak="0">
     <w:nsid w:val="26636A50"/>
     <w:multiLevelType w:val="multilevel"/>
     <w:tmpl w:val="ADE005AE"/>
@@ -4277,7 +3559,156 @@
       </w:rPr>
     </w:lvl>
   </w:abstractNum>
-  <w:abstractNum w:abstractNumId="3" w15:restartNumberingAfterBreak="0">
+  <w:abstractNum w:abstractNumId="4" w15:restartNumberingAfterBreak="0">
+    <w:nsid w:val="3FBA1120"/>
+    <w:multiLevelType w:val="multilevel"/>
+    <w:tmpl w:val="4036A524"/>
+    <w:lvl w:ilvl="0">
+      <w:start w:val="1"/>
+      <w:numFmt w:val="bullet"/>
+      <w:lvlText w:val=""/>
+      <w:lvlJc w:val="left"/>
+      <w:pPr>
+        <w:tabs>
+          <w:tab w:val="num" w:pos="720"/>
+        </w:tabs>
+        <w:ind w:left="720" w:hanging="360"/>
+      </w:pPr>
+      <w:rPr>
+        <w:rFonts w:ascii="Symbol" w:hAnsi="Symbol" w:hint="default"/>
+        <w:sz w:val="20"/>
+      </w:rPr>
+    </w:lvl>
+    <w:lvl w:ilvl="1" w:tentative="1">
+      <w:start w:val="1"/>
+      <w:numFmt w:val="bullet"/>
+      <w:lvlText w:val="o"/>
+      <w:lvlJc w:val="left"/>
+      <w:pPr>
+        <w:tabs>
+          <w:tab w:val="num" w:pos="1440"/>
+        </w:tabs>
+        <w:ind w:left="1440" w:hanging="360"/>
+      </w:pPr>
+      <w:rPr>
+        <w:rFonts w:ascii="Courier New" w:hAnsi="Courier New" w:hint="default"/>
+        <w:sz w:val="20"/>
+      </w:rPr>
+    </w:lvl>
+    <w:lvl w:ilvl="2" w:tentative="1">
+      <w:start w:val="1"/>
+      <w:numFmt w:val="bullet"/>
+      <w:lvlText w:val=""/>
+      <w:lvlJc w:val="left"/>
+      <w:pPr>
+        <w:tabs>
+          <w:tab w:val="num" w:pos="2160"/>
+        </w:tabs>
+        <w:ind w:left="2160" w:hanging="360"/>
+      </w:pPr>
+      <w:rPr>
+        <w:rFonts w:ascii="Wingdings" w:hAnsi="Wingdings" w:hint="default"/>
+        <w:sz w:val="20"/>
+      </w:rPr>
+    </w:lvl>
+    <w:lvl w:ilvl="3" w:tentative="1">
+      <w:start w:val="1"/>
+      <w:numFmt w:val="bullet"/>
+      <w:lvlText w:val=""/>
+      <w:lvlJc w:val="left"/>
+      <w:pPr>
+        <w:tabs>
+          <w:tab w:val="num" w:pos="2880"/>
+        </w:tabs>
+        <w:ind w:left="2880" w:hanging="360"/>
+      </w:pPr>
+      <w:rPr>
+        <w:rFonts w:ascii="Wingdings" w:hAnsi="Wingdings" w:hint="default"/>
+        <w:sz w:val="20"/>
+      </w:rPr>
+    </w:lvl>
+    <w:lvl w:ilvl="4" w:tentative="1">
+      <w:start w:val="1"/>
+      <w:numFmt w:val="bullet"/>
+      <w:lvlText w:val=""/>
+      <w:lvlJc w:val="left"/>
+      <w:pPr>
+        <w:tabs>
+          <w:tab w:val="num" w:pos="3600"/>
+        </w:tabs>
+        <w:ind w:left="3600" w:hanging="360"/>
+      </w:pPr>
+      <w:rPr>
+        <w:rFonts w:ascii="Wingdings" w:hAnsi="Wingdings" w:hint="default"/>
+        <w:sz w:val="20"/>
+      </w:rPr>
+    </w:lvl>
+    <w:lvl w:ilvl="5" w:tentative="1">
+      <w:start w:val="1"/>
+      <w:numFmt w:val="bullet"/>
+      <w:lvlText w:val=""/>
+      <w:lvlJc w:val="left"/>
+      <w:pPr>
+        <w:tabs>
+          <w:tab w:val="num" w:pos="4320"/>
+        </w:tabs>
+        <w:ind w:left="4320" w:hanging="360"/>
+      </w:pPr>
+      <w:rPr>
+        <w:rFonts w:ascii="Wingdings" w:hAnsi="Wingdings" w:hint="default"/>
+        <w:sz w:val="20"/>
+      </w:rPr>
+    </w:lvl>
+    <w:lvl w:ilvl="6" w:tentative="1">
+      <w:start w:val="1"/>
+      <w:numFmt w:val="bullet"/>
+      <w:lvlText w:val=""/>
+      <w:lvlJc w:val="left"/>
+      <w:pPr>
+        <w:tabs>
+          <w:tab w:val="num" w:pos="5040"/>
+        </w:tabs>
+        <w:ind w:left="5040" w:hanging="360"/>
+      </w:pPr>
+      <w:rPr>
+        <w:rFonts w:ascii="Wingdings" w:hAnsi="Wingdings" w:hint="default"/>
+        <w:sz w:val="20"/>
+      </w:rPr>
+    </w:lvl>
+    <w:lvl w:ilvl="7" w:tentative="1">
+      <w:start w:val="1"/>
+      <w:numFmt w:val="bullet"/>
+      <w:lvlText w:val=""/>
+      <w:lvlJc w:val="left"/>
+      <w:pPr>
+        <w:tabs>
+          <w:tab w:val="num" w:pos="5760"/>
+        </w:tabs>
+        <w:ind w:left="5760" w:hanging="360"/>
+      </w:pPr>
+      <w:rPr>
+        <w:rFonts w:ascii="Wingdings" w:hAnsi="Wingdings" w:hint="default"/>
+        <w:sz w:val="20"/>
+      </w:rPr>
+    </w:lvl>
+    <w:lvl w:ilvl="8" w:tentative="1">
+      <w:start w:val="1"/>
+      <w:numFmt w:val="bullet"/>
+      <w:lvlText w:val=""/>
+      <w:lvlJc w:val="left"/>
+      <w:pPr>
+        <w:tabs>
+          <w:tab w:val="num" w:pos="6480"/>
+        </w:tabs>
+        <w:ind w:left="6480" w:hanging="360"/>
+      </w:pPr>
+      <w:rPr>
+        <w:rFonts w:ascii="Wingdings" w:hAnsi="Wingdings" w:hint="default"/>
+        <w:sz w:val="20"/>
+      </w:rPr>
+    </w:lvl>
+  </w:abstractNum>
+  <w:abstractNum w:abstractNumId="5" w15:restartNumberingAfterBreak="0">
     <w:nsid w:val="43491087"/>
     <w:multiLevelType w:val="multilevel"/>
     <w:tmpl w:val="713A2978"/>
@@ -4426,7 +3857,7 @@
       </w:rPr>
     </w:lvl>
   </w:abstractNum>
-  <w:abstractNum w:abstractNumId="4" w15:restartNumberingAfterBreak="0">
+  <w:abstractNum w:abstractNumId="6" w15:restartNumberingAfterBreak="0">
     <w:nsid w:val="590F530A"/>
     <w:multiLevelType w:val="multilevel"/>
     <w:tmpl w:val="F266DCF8"/>
@@ -4575,7 +4006,7 @@
       </w:rPr>
     </w:lvl>
   </w:abstractNum>
-  <w:abstractNum w:abstractNumId="5" w15:restartNumberingAfterBreak="0">
+  <w:abstractNum w:abstractNumId="7" w15:restartNumberingAfterBreak="0">
     <w:nsid w:val="5F411846"/>
     <w:multiLevelType w:val="multilevel"/>
     <w:tmpl w:val="F99A37E8"/>
@@ -4724,7 +4155,7 @@
       </w:rPr>
     </w:lvl>
   </w:abstractNum>
-  <w:abstractNum w:abstractNumId="6" w15:restartNumberingAfterBreak="0">
+  <w:abstractNum w:abstractNumId="8" w15:restartNumberingAfterBreak="0">
     <w:nsid w:val="68997650"/>
     <w:multiLevelType w:val="multilevel"/>
     <w:tmpl w:val="6B3A2A4A"/>
@@ -4873,7 +4304,7 @@
       </w:rPr>
     </w:lvl>
   </w:abstractNum>
-  <w:abstractNum w:abstractNumId="7" w15:restartNumberingAfterBreak="0">
+  <w:abstractNum w:abstractNumId="9" w15:restartNumberingAfterBreak="0">
     <w:nsid w:val="68C775D4"/>
     <w:multiLevelType w:val="multilevel"/>
     <w:tmpl w:val="16FABC12"/>
@@ -5022,7 +4453,7 @@
       </w:rPr>
     </w:lvl>
   </w:abstractNum>
-  <w:abstractNum w:abstractNumId="8" w15:restartNumberingAfterBreak="0">
+  <w:abstractNum w:abstractNumId="10" w15:restartNumberingAfterBreak="0">
     <w:nsid w:val="6D15135B"/>
     <w:multiLevelType w:val="multilevel"/>
     <w:tmpl w:val="7D164CC6"/>
@@ -5171,7 +4602,7 @@
       </w:rPr>
     </w:lvl>
   </w:abstractNum>
-  <w:abstractNum w:abstractNumId="9" w15:restartNumberingAfterBreak="0">
+  <w:abstractNum w:abstractNumId="11" w15:restartNumberingAfterBreak="0">
     <w:nsid w:val="6F0A2D5B"/>
     <w:multiLevelType w:val="multilevel"/>
     <w:tmpl w:val="8222D54C"/>
@@ -5284,7 +4715,7 @@
       </w:pPr>
     </w:lvl>
   </w:abstractNum>
-  <w:abstractNum w:abstractNumId="10" w15:restartNumberingAfterBreak="0">
+  <w:abstractNum w:abstractNumId="12" w15:restartNumberingAfterBreak="0">
     <w:nsid w:val="788432F5"/>
     <w:multiLevelType w:val="multilevel"/>
     <w:tmpl w:val="1F4062E0"/>
@@ -5434,36 +4865,42 @@
     </w:lvl>
   </w:abstractNum>
   <w:num w:numId="1" w16cid:durableId="412506156">
+    <w:abstractNumId w:val="5"/>
+  </w:num>
+  <w:num w:numId="2" w16cid:durableId="474765523">
+    <w:abstractNumId w:val="7"/>
+  </w:num>
+  <w:num w:numId="3" w16cid:durableId="1353190117">
+    <w:abstractNumId w:val="10"/>
+  </w:num>
+  <w:num w:numId="4" w16cid:durableId="1172718243">
+    <w:abstractNumId w:val="1"/>
+  </w:num>
+  <w:num w:numId="5" w16cid:durableId="951859613">
+    <w:abstractNumId w:val="9"/>
+  </w:num>
+  <w:num w:numId="6" w16cid:durableId="1653951703">
+    <w:abstractNumId w:val="8"/>
+  </w:num>
+  <w:num w:numId="7" w16cid:durableId="993141891">
+    <w:abstractNumId w:val="2"/>
+  </w:num>
+  <w:num w:numId="8" w16cid:durableId="1152285510">
+    <w:abstractNumId w:val="12"/>
+  </w:num>
+  <w:num w:numId="9" w16cid:durableId="900604328">
+    <w:abstractNumId w:val="11"/>
+  </w:num>
+  <w:num w:numId="10" w16cid:durableId="454446034">
     <w:abstractNumId w:val="3"/>
   </w:num>
-  <w:num w:numId="2" w16cid:durableId="474765523">
-    <w:abstractNumId w:val="5"/>
+  <w:num w:numId="11" w16cid:durableId="1467434070">
+    <w:abstractNumId w:val="6"/>
   </w:num>
-  <w:num w:numId="3" w16cid:durableId="1353190117">
-    <w:abstractNumId w:val="8"/>
-  </w:num>
-  <w:num w:numId="4" w16cid:durableId="1172718243">
+  <w:num w:numId="12" w16cid:durableId="1297251611">
     <w:abstractNumId w:val="0"/>
   </w:num>
-  <w:num w:numId="5" w16cid:durableId="951859613">
-    <w:abstractNumId w:val="7"/>
-  </w:num>
-  <w:num w:numId="6" w16cid:durableId="1653951703">
-    <w:abstractNumId w:val="6"/>
-  </w:num>
-  <w:num w:numId="7" w16cid:durableId="993141891">
-    <w:abstractNumId w:val="1"/>
-  </w:num>
-  <w:num w:numId="8" w16cid:durableId="1152285510">
-    <w:abstractNumId w:val="10"/>
-  </w:num>
-  <w:num w:numId="9" w16cid:durableId="900604328">
-    <w:abstractNumId w:val="9"/>
-  </w:num>
-  <w:num w:numId="10" w16cid:durableId="454446034">
-    <w:abstractNumId w:val="2"/>
-  </w:num>
-  <w:num w:numId="11" w16cid:durableId="1467434070">
+  <w:num w:numId="13" w16cid:durableId="1879779413">
     <w:abstractNumId w:val="4"/>
   </w:num>
 </w:numbering>

</xml_diff>

<commit_message>
Comments Fullstack pa HU-005
</commit_message>
<xml_diff>
--- a/Comments pa Fullstack.docx
+++ b/Comments pa Fullstack.docx
@@ -740,13 +740,8 @@
         <w:t>"</w:t>
       </w:r>
       <w:proofErr w:type="spellStart"/>
-      <w:proofErr w:type="gramStart"/>
-      <w:r>
-        <w:t>perfil</w:t>
-      </w:r>
-      <w:proofErr w:type="gramEnd"/>
-      <w:r>
-        <w:t>_id</w:t>
+      <w:r>
+        <w:t>perfil_id</w:t>
       </w:r>
       <w:proofErr w:type="spellEnd"/>
       <w:r>
@@ -818,28 +813,14 @@
         <w:rPr>
           <w:lang w:val="es-CO"/>
         </w:rPr>
-        <w:t xml:space="preserve">) si </w:t>
-      </w:r>
-      <w:proofErr w:type="gramStart"/>
-      <w:r>
-        <w:rPr>
-          <w:lang w:val="es-CO"/>
-        </w:rPr>
-        <w:t xml:space="preserve">el </w:t>
-      </w:r>
-      <w:proofErr w:type="spellStart"/>
-      <w:r>
-        <w:rPr>
-          <w:lang w:val="es-CO"/>
-        </w:rPr>
-        <w:t>empresa</w:t>
-      </w:r>
-      <w:proofErr w:type="gramEnd"/>
-      <w:r>
-        <w:rPr>
-          <w:lang w:val="es-CO"/>
-        </w:rPr>
-        <w:t>_id</w:t>
+        <w:t xml:space="preserve">) si el </w:t>
+      </w:r>
+      <w:proofErr w:type="spellStart"/>
+      <w:r>
+        <w:rPr>
+          <w:lang w:val="es-CO"/>
+        </w:rPr>
+        <w:t>empresa_id</w:t>
       </w:r>
       <w:proofErr w:type="spellEnd"/>
       <w:r>
@@ -1029,17 +1010,9 @@
         <w:rPr>
           <w:lang w:val="es-CO"/>
         </w:rPr>
-        <w:t xml:space="preserve">    </w:t>
-      </w:r>
-      <w:proofErr w:type="gramStart"/>
-      <w:r>
-        <w:rPr>
-          <w:lang w:val="es-CO"/>
-        </w:rPr>
-        <w:t>{ "</w:t>
-      </w:r>
-      <w:proofErr w:type="spellStart"/>
-      <w:proofErr w:type="gramEnd"/>
+        <w:t xml:space="preserve">    { "</w:t>
+      </w:r>
+      <w:proofErr w:type="spellStart"/>
       <w:r>
         <w:rPr>
           <w:lang w:val="es-CO"/>
@@ -1079,44 +1052,22 @@
         <w:rPr>
           <w:lang w:val="es-CO"/>
         </w:rPr>
-        <w:t xml:space="preserve">": </w:t>
-      </w:r>
-      <w:proofErr w:type="gramStart"/>
-      <w:r>
-        <w:rPr>
-          <w:lang w:val="es-CO"/>
-        </w:rPr>
-        <w:t>10 }</w:t>
-      </w:r>
-      <w:proofErr w:type="gramEnd"/>
-      <w:r>
-        <w:rPr>
-          <w:lang w:val="es-CO"/>
-        </w:rPr>
-        <w:t>,</w:t>
-      </w:r>
-    </w:p>
-    <w:p>
-      <w:pPr>
-        <w:rPr>
-          <w:lang w:val="es-CO"/>
-        </w:rPr>
-      </w:pPr>
-      <w:r>
-        <w:rPr>
-          <w:lang w:val="es-CO"/>
-        </w:rPr>
-        <w:t xml:space="preserve">    </w:t>
-      </w:r>
-      <w:proofErr w:type="gramStart"/>
-      <w:r>
-        <w:rPr>
-          <w:lang w:val="es-CO"/>
-        </w:rPr>
-        <w:t>{ "</w:t>
-      </w:r>
-      <w:proofErr w:type="spellStart"/>
-      <w:proofErr w:type="gramEnd"/>
+        <w:t>": 10 },</w:t>
+      </w:r>
+    </w:p>
+    <w:p>
+      <w:pPr>
+        <w:rPr>
+          <w:lang w:val="es-CO"/>
+        </w:rPr>
+      </w:pPr>
+      <w:r>
+        <w:rPr>
+          <w:lang w:val="es-CO"/>
+        </w:rPr>
+        <w:t xml:space="preserve">    { "</w:t>
+      </w:r>
+      <w:proofErr w:type="spellStart"/>
       <w:r>
         <w:rPr>
           <w:lang w:val="es-CO"/>
@@ -1156,16 +1107,8 @@
         <w:rPr>
           <w:lang w:val="es-CO"/>
         </w:rPr>
-        <w:t xml:space="preserve">": </w:t>
-      </w:r>
-      <w:proofErr w:type="gramStart"/>
-      <w:r>
-        <w:rPr>
-          <w:lang w:val="es-CO"/>
-        </w:rPr>
-        <w:t>11 }</w:t>
-      </w:r>
-      <w:proofErr w:type="gramEnd"/>
+        <w:t>": 11 }</w:t>
+      </w:r>
     </w:p>
     <w:p>
       <w:pPr>
@@ -1520,21 +1463,7 @@
         <w:rPr>
           <w:lang w:val="es-CO"/>
         </w:rPr>
-        <w:t xml:space="preserve">El GET / (listado) filtrará automáticamente y solo te enviará </w:t>
-      </w:r>
-      <w:proofErr w:type="gramStart"/>
-      <w:r>
-        <w:rPr>
-          <w:lang w:val="es-CO"/>
-        </w:rPr>
-        <w:t>los estado</w:t>
-      </w:r>
-      <w:proofErr w:type="gramEnd"/>
-      <w:r>
-        <w:rPr>
-          <w:lang w:val="es-CO"/>
-        </w:rPr>
-        <w:t>: true.</w:t>
+        <w:t>El GET / (listado) filtrará automáticamente y solo te enviará los estado: true.</w:t>
       </w:r>
     </w:p>
     <w:p>
@@ -1742,16 +1671,7 @@
           <w:bCs/>
           <w:lang w:val="es-CO"/>
         </w:rPr>
-        <w:t xml:space="preserve"> Especificaciones Técnicas </w:t>
-      </w:r>
-      <w:proofErr w:type="gramStart"/>
-      <w:r>
-        <w:rPr>
-          <w:b/>
-          <w:bCs/>
-          <w:lang w:val="es-CO"/>
-        </w:rPr>
-        <w:t xml:space="preserve">para </w:t>
+        <w:t xml:space="preserve"> Especificaciones Técnicas para </w:t>
       </w:r>
       <w:proofErr w:type="spellStart"/>
       <w:r>
@@ -1763,7 +1683,6 @@
         <w:t>Frontend</w:t>
       </w:r>
       <w:proofErr w:type="spellEnd"/>
-      <w:proofErr w:type="gramEnd"/>
       <w:r>
         <w:rPr>
           <w:b/>
@@ -3131,18 +3050,9 @@
           </w:tcPr>
           <w:p>
             <w:r>
-              <w:t>/</w:t>
-            </w:r>
-            <w:proofErr w:type="gramStart"/>
-            <w:r>
-              <w:t>roles</w:t>
-            </w:r>
-            <w:proofErr w:type="gramEnd"/>
-            <w:r>
-              <w:t>/</w:t>
+              <w:t>/roles/</w:t>
             </w:r>
             <w:proofErr w:type="spellStart"/>
-            <w:proofErr w:type="gramStart"/>
             <w:r>
               <w:t>empresa</w:t>
             </w:r>
@@ -3151,7 +3061,6 @@
               <w:t>/{</w:t>
             </w:r>
             <w:proofErr w:type="spellStart"/>
-            <w:proofErr w:type="gramEnd"/>
             <w:r>
               <w:t>empresa_id</w:t>
             </w:r>
@@ -3247,14 +3156,9 @@
           </w:tcPr>
           <w:p>
             <w:r>
-              <w:t>/</w:t>
-            </w:r>
-            <w:proofErr w:type="gramStart"/>
-            <w:r>
-              <w:t>roles/{</w:t>
+              <w:t>/roles/{</w:t>
             </w:r>
             <w:proofErr w:type="spellStart"/>
-            <w:proofErr w:type="gramEnd"/>
             <w:r>
               <w:t>rol_id</w:t>
             </w:r>
@@ -3349,14 +3253,9 @@
           </w:tcPr>
           <w:p>
             <w:r>
-              <w:t>/</w:t>
-            </w:r>
-            <w:proofErr w:type="gramStart"/>
-            <w:r>
-              <w:t>roles/{</w:t>
+              <w:t>/roles/{</w:t>
             </w:r>
             <w:proofErr w:type="spellStart"/>
-            <w:proofErr w:type="gramEnd"/>
             <w:r>
               <w:t>rol_id</w:t>
             </w:r>
@@ -3707,40 +3606,18 @@
           <w:lang w:val="es-CO"/>
         </w:rPr>
       </w:pPr>
-      <w:proofErr w:type="gramStart"/>
-      <w:r>
-        <w:rPr>
-          <w:lang w:val="es-CO"/>
-        </w:rPr>
-        <w:t>Asegurar</w:t>
-      </w:r>
-      <w:proofErr w:type="gramEnd"/>
-      <w:r>
-        <w:rPr>
-          <w:lang w:val="es-CO"/>
-        </w:rPr>
-        <w:t xml:space="preserve"> que el modal de creación envíe </w:t>
-      </w:r>
-      <w:proofErr w:type="gramStart"/>
-      <w:r>
-        <w:rPr>
-          <w:lang w:val="es-CO"/>
-        </w:rPr>
-        <w:t xml:space="preserve">el </w:t>
-      </w:r>
-      <w:proofErr w:type="spellStart"/>
-      <w:r>
-        <w:rPr>
-          <w:lang w:val="es-CO"/>
-        </w:rPr>
-        <w:t>empresa</w:t>
-      </w:r>
-      <w:proofErr w:type="gramEnd"/>
-      <w:r>
-        <w:rPr>
-          <w:lang w:val="es-CO"/>
-        </w:rPr>
-        <w:t>_id</w:t>
+      <w:r>
+        <w:rPr>
+          <w:lang w:val="es-CO"/>
+        </w:rPr>
+        <w:t xml:space="preserve">Asegurar que el modal de creación envíe el </w:t>
+      </w:r>
+      <w:proofErr w:type="spellStart"/>
+      <w:r>
+        <w:rPr>
+          <w:lang w:val="es-CO"/>
+        </w:rPr>
+        <w:t>empresa_id</w:t>
       </w:r>
       <w:proofErr w:type="spellEnd"/>
       <w:r>
@@ -4020,28 +3897,14 @@
         <w:rPr>
           <w:lang w:val="es-CO"/>
         </w:rPr>
-        <w:t xml:space="preserve"> ahora siguen una ruta jerárquica que incluye </w:t>
-      </w:r>
-      <w:proofErr w:type="gramStart"/>
-      <w:r>
-        <w:rPr>
-          <w:lang w:val="es-CO"/>
-        </w:rPr>
-        <w:t xml:space="preserve">el </w:t>
-      </w:r>
-      <w:proofErr w:type="spellStart"/>
-      <w:r>
-        <w:rPr>
-          <w:lang w:val="es-CO"/>
-        </w:rPr>
-        <w:t>empresa</w:t>
-      </w:r>
-      <w:proofErr w:type="gramEnd"/>
-      <w:r>
-        <w:rPr>
-          <w:lang w:val="es-CO"/>
-        </w:rPr>
-        <w:t>_id</w:t>
+        <w:t xml:space="preserve"> ahora siguen una ruta jerárquica que incluye el </w:t>
+      </w:r>
+      <w:proofErr w:type="spellStart"/>
+      <w:r>
+        <w:rPr>
+          <w:lang w:val="es-CO"/>
+        </w:rPr>
+        <w:t>empresa_id</w:t>
       </w:r>
       <w:proofErr w:type="spellEnd"/>
       <w:r>
@@ -4080,28 +3943,14 @@
         <w:rPr>
           <w:lang w:val="es-CO"/>
         </w:rPr>
-        <w:t>empresa_</w:t>
-      </w:r>
-      <w:proofErr w:type="gramStart"/>
-      <w:r>
-        <w:rPr>
-          <w:lang w:val="es-CO"/>
-        </w:rPr>
-        <w:t>id</w:t>
-      </w:r>
-      <w:proofErr w:type="spellEnd"/>
-      <w:r>
-        <w:rPr>
-          <w:lang w:val="es-CO"/>
-        </w:rPr>
-        <w:t>}/</w:t>
-      </w:r>
-      <w:proofErr w:type="gramEnd"/>
-      <w:r>
-        <w:rPr>
-          <w:lang w:val="es-CO"/>
-        </w:rPr>
-        <w:t xml:space="preserve">perfiles </w:t>
+        <w:t>empresa_id</w:t>
+      </w:r>
+      <w:proofErr w:type="spellEnd"/>
+      <w:r>
+        <w:rPr>
+          <w:lang w:val="es-CO"/>
+        </w:rPr>
+        <w:t xml:space="preserve">}/perfiles </w:t>
       </w:r>
     </w:p>
     <w:p>
@@ -4133,28 +3982,14 @@
         <w:rPr>
           <w:lang w:val="es-CO"/>
         </w:rPr>
-        <w:t>empresa_</w:t>
-      </w:r>
-      <w:proofErr w:type="gramStart"/>
-      <w:r>
-        <w:rPr>
-          <w:lang w:val="es-CO"/>
-        </w:rPr>
-        <w:t>id</w:t>
-      </w:r>
-      <w:proofErr w:type="spellEnd"/>
-      <w:r>
-        <w:rPr>
-          <w:lang w:val="es-CO"/>
-        </w:rPr>
-        <w:t>}/</w:t>
-      </w:r>
-      <w:proofErr w:type="gramEnd"/>
-      <w:r>
-        <w:rPr>
-          <w:lang w:val="es-CO"/>
-        </w:rPr>
-        <w:t xml:space="preserve">perfiles </w:t>
+        <w:t>empresa_id</w:t>
+      </w:r>
+      <w:proofErr w:type="spellEnd"/>
+      <w:r>
+        <w:rPr>
+          <w:lang w:val="es-CO"/>
+        </w:rPr>
+        <w:t xml:space="preserve">}/perfiles </w:t>
       </w:r>
     </w:p>
     <w:p>
@@ -4186,28 +4021,14 @@
         <w:rPr>
           <w:lang w:val="es-CO"/>
         </w:rPr>
-        <w:t>empresa_</w:t>
-      </w:r>
-      <w:proofErr w:type="gramStart"/>
-      <w:r>
-        <w:rPr>
-          <w:lang w:val="es-CO"/>
-        </w:rPr>
-        <w:t>id</w:t>
-      </w:r>
-      <w:proofErr w:type="spellEnd"/>
-      <w:r>
-        <w:rPr>
-          <w:lang w:val="es-CO"/>
-        </w:rPr>
-        <w:t>}/</w:t>
-      </w:r>
-      <w:proofErr w:type="gramEnd"/>
-      <w:r>
-        <w:rPr>
-          <w:lang w:val="es-CO"/>
-        </w:rPr>
-        <w:t>perfiles/{</w:t>
+        <w:t>empresa_id</w:t>
+      </w:r>
+      <w:proofErr w:type="spellEnd"/>
+      <w:r>
+        <w:rPr>
+          <w:lang w:val="es-CO"/>
+        </w:rPr>
+        <w:t>}/perfiles/{</w:t>
       </w:r>
       <w:proofErr w:type="spellStart"/>
       <w:r>
@@ -4253,28 +4074,14 @@
         <w:rPr>
           <w:lang w:val="es-CO"/>
         </w:rPr>
-        <w:t>empresa_</w:t>
-      </w:r>
-      <w:proofErr w:type="gramStart"/>
-      <w:r>
-        <w:rPr>
-          <w:lang w:val="es-CO"/>
-        </w:rPr>
-        <w:t>id</w:t>
-      </w:r>
-      <w:proofErr w:type="spellEnd"/>
-      <w:r>
-        <w:rPr>
-          <w:lang w:val="es-CO"/>
-        </w:rPr>
-        <w:t>}/</w:t>
-      </w:r>
-      <w:proofErr w:type="gramEnd"/>
-      <w:r>
-        <w:rPr>
-          <w:lang w:val="es-CO"/>
-        </w:rPr>
-        <w:t>perfiles/{</w:t>
+        <w:t>empresa_id</w:t>
+      </w:r>
+      <w:proofErr w:type="spellEnd"/>
+      <w:r>
+        <w:rPr>
+          <w:lang w:val="es-CO"/>
+        </w:rPr>
+        <w:t>}/perfiles/{</w:t>
       </w:r>
       <w:proofErr w:type="spellStart"/>
       <w:r>
@@ -5005,7 +4812,7 @@
     <w:p>
       <w:r>
         <w:pict w14:anchorId="35B21E07">
-          <v:rect id="_x0000_i1050" style="width:0;height:1.5pt" o:hralign="center" o:hrstd="t" o:hrnoshade="t" o:hr="t" fillcolor="gray" stroked="f"/>
+          <v:rect id="_x0000_i1032" style="width:0;height:1.5pt" o:hralign="center" o:hrstd="t" o:hrnoshade="t" o:hr="t" fillcolor="gray" stroked="f"/>
         </w:pict>
       </w:r>
     </w:p>
@@ -5322,7 +5129,7 @@
     <w:p>
       <w:r>
         <w:pict w14:anchorId="0D36B54F">
-          <v:rect id="_x0000_i1051" style="width:0;height:1.5pt" o:hralign="center" o:hrstd="t" o:hrnoshade="t" o:hr="t" fillcolor="gray" stroked="f"/>
+          <v:rect id="_x0000_i1033" style="width:0;height:1.5pt" o:hralign="center" o:hrstd="t" o:hrnoshade="t" o:hr="t" fillcolor="gray" stroked="f"/>
         </w:pict>
       </w:r>
     </w:p>
@@ -5858,7 +5665,7 @@
     <w:p>
       <w:r>
         <w:pict w14:anchorId="06D6451C">
-          <v:rect id="_x0000_i1052" style="width:0;height:1.5pt" o:hralign="center" o:hrstd="t" o:hrnoshade="t" o:hr="t" fillcolor="gray" stroked="f"/>
+          <v:rect id="_x0000_i1034" style="width:0;height:1.5pt" o:hralign="center" o:hrstd="t" o:hrnoshade="t" o:hr="t" fillcolor="gray" stroked="f"/>
         </w:pict>
       </w:r>
     </w:p>
@@ -5912,6 +5719,2534 @@
           <w:lang w:val="es-CO"/>
         </w:rPr>
         <w:t>. Como ya tenemos las validaciones de SKU listas, podemos construir el importador de Excel para que el usuario no tenga que crear 500 productos a mano."</w:t>
+      </w:r>
+    </w:p>
+    <w:p>
+      <w:pPr>
+        <w:rPr>
+          <w:lang w:val="es-CO"/>
+        </w:rPr>
+      </w:pPr>
+      <w:r>
+        <w:rPr>
+          <w:sz w:val="48"/>
+          <w:szCs w:val="48"/>
+          <w:lang w:val="es-CO"/>
+        </w:rPr>
+        <w:t>HU-005</w:t>
+      </w:r>
+      <w:r>
+        <w:rPr>
+          <w:lang w:val="es-CO"/>
+        </w:rPr>
+        <w:br/>
+      </w:r>
+      <w:r>
+        <w:rPr>
+          <w:lang w:val="es-CO"/>
+        </w:rPr>
+        <w:t xml:space="preserve">Para dar por cerrada la </w:t>
+      </w:r>
+      <w:r>
+        <w:rPr>
+          <w:b/>
+          <w:bCs/>
+          <w:lang w:val="es-CO"/>
+        </w:rPr>
+        <w:t>HU-005 (Gestión de maestro de Clientes)</w:t>
+      </w:r>
+      <w:r>
+        <w:rPr>
+          <w:lang w:val="es-CO"/>
+        </w:rPr>
+        <w:t xml:space="preserve"> con el estándar de calidad que estamos manejando en medussa_erp, faltan un par de detalles técnicos "bajo el capó" que garantizan que el sistema no explote cuando el usuario empiece a buscar o cuando haya miles de registros.</w:t>
+      </w:r>
+    </w:p>
+    <w:p>
+      <w:proofErr w:type="spellStart"/>
+      <w:r>
+        <w:t>Aquí</w:t>
+      </w:r>
+      <w:proofErr w:type="spellEnd"/>
+      <w:r>
+        <w:t xml:space="preserve"> lo </w:t>
+      </w:r>
+      <w:proofErr w:type="spellStart"/>
+      <w:r>
+        <w:t>que</w:t>
+      </w:r>
+      <w:proofErr w:type="spellEnd"/>
+      <w:r>
+        <w:t xml:space="preserve"> </w:t>
+      </w:r>
+      <w:proofErr w:type="spellStart"/>
+      <w:r>
+        <w:t>falta</w:t>
+      </w:r>
+      <w:proofErr w:type="spellEnd"/>
+      <w:r>
+        <w:t xml:space="preserve"> para </w:t>
+      </w:r>
+      <w:proofErr w:type="spellStart"/>
+      <w:r>
+        <w:t>completar</w:t>
+      </w:r>
+      <w:proofErr w:type="spellEnd"/>
+      <w:r>
+        <w:t xml:space="preserve"> </w:t>
+      </w:r>
+      <w:proofErr w:type="spellStart"/>
+      <w:r>
+        <w:t>el</w:t>
+      </w:r>
+      <w:proofErr w:type="spellEnd"/>
+      <w:r>
+        <w:t xml:space="preserve"> 100%:</w:t>
+      </w:r>
+    </w:p>
+    <w:p>
+      <w:pPr>
+        <w:rPr>
+          <w:b/>
+          <w:bCs/>
+        </w:rPr>
+      </w:pPr>
+      <w:r>
+        <w:rPr>
+          <w:b/>
+          <w:bCs/>
+        </w:rPr>
+        <w:lastRenderedPageBreak/>
+        <w:t xml:space="preserve">1. </w:t>
+      </w:r>
+      <w:proofErr w:type="spellStart"/>
+      <w:r>
+        <w:rPr>
+          <w:b/>
+          <w:bCs/>
+        </w:rPr>
+        <w:t>Filtros</w:t>
+      </w:r>
+      <w:proofErr w:type="spellEnd"/>
+      <w:r>
+        <w:rPr>
+          <w:b/>
+          <w:bCs/>
+        </w:rPr>
+        <w:t xml:space="preserve"> de </w:t>
+      </w:r>
+      <w:proofErr w:type="spellStart"/>
+      <w:r>
+        <w:rPr>
+          <w:b/>
+          <w:bCs/>
+        </w:rPr>
+        <w:t>Búsqueda</w:t>
+      </w:r>
+      <w:proofErr w:type="spellEnd"/>
+      <w:r>
+        <w:rPr>
+          <w:b/>
+          <w:bCs/>
+        </w:rPr>
+        <w:t xml:space="preserve"> y </w:t>
+      </w:r>
+      <w:proofErr w:type="spellStart"/>
+      <w:r>
+        <w:rPr>
+          <w:b/>
+          <w:bCs/>
+        </w:rPr>
+        <w:t>Paginación</w:t>
+      </w:r>
+      <w:proofErr w:type="spellEnd"/>
+      <w:r>
+        <w:rPr>
+          <w:b/>
+          <w:bCs/>
+        </w:rPr>
+        <w:t xml:space="preserve"> (</w:t>
+      </w:r>
+      <w:proofErr w:type="spellStart"/>
+      <w:r>
+        <w:rPr>
+          <w:b/>
+          <w:bCs/>
+        </w:rPr>
+        <w:t>Requerido</w:t>
+      </w:r>
+      <w:proofErr w:type="spellEnd"/>
+      <w:r>
+        <w:rPr>
+          <w:b/>
+          <w:bCs/>
+        </w:rPr>
+        <w:t xml:space="preserve"> </w:t>
+      </w:r>
+      <w:proofErr w:type="spellStart"/>
+      <w:r>
+        <w:rPr>
+          <w:b/>
+          <w:bCs/>
+        </w:rPr>
+        <w:t>en</w:t>
+      </w:r>
+      <w:proofErr w:type="spellEnd"/>
+      <w:r>
+        <w:rPr>
+          <w:b/>
+          <w:bCs/>
+        </w:rPr>
+        <w:t xml:space="preserve"> HU-005-BE-02)</w:t>
+      </w:r>
+    </w:p>
+    <w:p>
+      <w:proofErr w:type="spellStart"/>
+      <w:r>
+        <w:t>Actualmente</w:t>
+      </w:r>
+      <w:proofErr w:type="spellEnd"/>
+      <w:r>
+        <w:t xml:space="preserve">, </w:t>
+      </w:r>
+      <w:proofErr w:type="spellStart"/>
+      <w:r>
+        <w:t>el</w:t>
+      </w:r>
+      <w:proofErr w:type="spellEnd"/>
+      <w:r>
+        <w:t xml:space="preserve"> GET </w:t>
+      </w:r>
+      <w:proofErr w:type="spellStart"/>
+      <w:r>
+        <w:t>trae</w:t>
+      </w:r>
+      <w:proofErr w:type="spellEnd"/>
+      <w:r>
+        <w:t xml:space="preserve"> </w:t>
+      </w:r>
+      <w:proofErr w:type="spellStart"/>
+      <w:r>
+        <w:t>todos</w:t>
+      </w:r>
+      <w:proofErr w:type="spellEnd"/>
+      <w:r>
+        <w:t xml:space="preserve"> </w:t>
+      </w:r>
+      <w:proofErr w:type="spellStart"/>
+      <w:r>
+        <w:t>los</w:t>
+      </w:r>
+      <w:proofErr w:type="spellEnd"/>
+      <w:r>
+        <w:t xml:space="preserve"> </w:t>
+      </w:r>
+      <w:proofErr w:type="spellStart"/>
+      <w:r>
+        <w:t>clientes</w:t>
+      </w:r>
+      <w:proofErr w:type="spellEnd"/>
+      <w:r>
+        <w:t xml:space="preserve">. La </w:t>
+      </w:r>
+      <w:proofErr w:type="spellStart"/>
+      <w:r>
+        <w:t>historia</w:t>
+      </w:r>
+      <w:proofErr w:type="spellEnd"/>
+      <w:r>
+        <w:t xml:space="preserve"> de </w:t>
+      </w:r>
+      <w:proofErr w:type="spellStart"/>
+      <w:r>
+        <w:t>usuario</w:t>
+      </w:r>
+      <w:proofErr w:type="spellEnd"/>
+      <w:r>
+        <w:t xml:space="preserve"> </w:t>
+      </w:r>
+      <w:proofErr w:type="spellStart"/>
+      <w:r>
+        <w:t>pide</w:t>
+      </w:r>
+      <w:proofErr w:type="spellEnd"/>
+      <w:r>
+        <w:t xml:space="preserve"> </w:t>
+      </w:r>
+      <w:proofErr w:type="spellStart"/>
+      <w:r>
+        <w:t>búsquedas</w:t>
+      </w:r>
+      <w:proofErr w:type="spellEnd"/>
+      <w:r>
+        <w:t xml:space="preserve"> </w:t>
+      </w:r>
+      <w:proofErr w:type="spellStart"/>
+      <w:r>
+        <w:t>por</w:t>
+      </w:r>
+      <w:proofErr w:type="spellEnd"/>
+      <w:r>
+        <w:t xml:space="preserve"> </w:t>
+      </w:r>
+      <w:r>
+        <w:rPr>
+          <w:b/>
+          <w:bCs/>
+        </w:rPr>
+        <w:t>Nombre, ID o Ciudad</w:t>
+      </w:r>
+      <w:r>
+        <w:t xml:space="preserve">. </w:t>
+      </w:r>
+      <w:proofErr w:type="spellStart"/>
+      <w:r>
+        <w:t>Debemos</w:t>
+      </w:r>
+      <w:proofErr w:type="spellEnd"/>
+      <w:r>
+        <w:t xml:space="preserve"> </w:t>
+      </w:r>
+      <w:proofErr w:type="spellStart"/>
+      <w:r>
+        <w:t>ajustar</w:t>
+      </w:r>
+      <w:proofErr w:type="spellEnd"/>
+      <w:r>
+        <w:t xml:space="preserve"> </w:t>
+      </w:r>
+      <w:proofErr w:type="spellStart"/>
+      <w:r>
+        <w:t>el</w:t>
+      </w:r>
+      <w:proofErr w:type="spellEnd"/>
+      <w:r>
+        <w:t xml:space="preserve"> </w:t>
+      </w:r>
+      <w:proofErr w:type="spellStart"/>
+      <w:r>
+        <w:t>servicio</w:t>
+      </w:r>
+      <w:proofErr w:type="spellEnd"/>
+      <w:r>
+        <w:t>:</w:t>
+      </w:r>
+    </w:p>
+    <w:p>
+      <w:pPr>
+        <w:numPr>
+          <w:ilvl w:val="0"/>
+          <w:numId w:val="16"/>
+        </w:numPr>
+      </w:pPr>
+      <w:r>
+        <w:rPr>
+          <w:b/>
+          <w:bCs/>
+        </w:rPr>
+        <w:t>En cliente_service.py</w:t>
+      </w:r>
+      <w:r>
+        <w:t xml:space="preserve">: </w:t>
+      </w:r>
+      <w:proofErr w:type="spellStart"/>
+      <w:r>
+        <w:t>Modificar</w:t>
+      </w:r>
+      <w:proofErr w:type="spellEnd"/>
+      <w:r>
+        <w:t xml:space="preserve"> </w:t>
+      </w:r>
+      <w:proofErr w:type="spellStart"/>
+      <w:r>
+        <w:t>obtener_clientes</w:t>
+      </w:r>
+      <w:proofErr w:type="spellEnd"/>
+      <w:r>
+        <w:t xml:space="preserve"> para </w:t>
+      </w:r>
+      <w:proofErr w:type="spellStart"/>
+      <w:r>
+        <w:t>aceptar</w:t>
+      </w:r>
+      <w:proofErr w:type="spellEnd"/>
+      <w:r>
+        <w:t xml:space="preserve"> </w:t>
+      </w:r>
+      <w:proofErr w:type="spellStart"/>
+      <w:r>
+        <w:t>parámetros</w:t>
+      </w:r>
+      <w:proofErr w:type="spellEnd"/>
+      <w:r>
+        <w:t xml:space="preserve"> de </w:t>
+      </w:r>
+      <w:proofErr w:type="spellStart"/>
+      <w:r>
+        <w:t>búsqueda</w:t>
+      </w:r>
+      <w:proofErr w:type="spellEnd"/>
+      <w:r>
+        <w:t xml:space="preserve"> y usar </w:t>
+      </w:r>
+      <w:proofErr w:type="spellStart"/>
+      <w:r>
+        <w:t>ilike</w:t>
+      </w:r>
+      <w:proofErr w:type="spellEnd"/>
+      <w:r>
+        <w:t xml:space="preserve"> (</w:t>
+      </w:r>
+      <w:proofErr w:type="spellStart"/>
+      <w:r>
+        <w:t>búsqueda</w:t>
+      </w:r>
+      <w:proofErr w:type="spellEnd"/>
+      <w:r>
+        <w:t xml:space="preserve"> insensible a </w:t>
+      </w:r>
+      <w:proofErr w:type="spellStart"/>
+      <w:r>
+        <w:t>mayúsculas</w:t>
+      </w:r>
+      <w:proofErr w:type="spellEnd"/>
+      <w:r>
+        <w:t>).</w:t>
+      </w:r>
+    </w:p>
+    <w:p>
+      <w:pPr>
+        <w:numPr>
+          <w:ilvl w:val="0"/>
+          <w:numId w:val="16"/>
+        </w:numPr>
+      </w:pPr>
+      <w:proofErr w:type="spellStart"/>
+      <w:r>
+        <w:rPr>
+          <w:b/>
+          <w:bCs/>
+        </w:rPr>
+        <w:t>Paginación</w:t>
+      </w:r>
+      <w:proofErr w:type="spellEnd"/>
+      <w:r>
+        <w:t xml:space="preserve">: Añadir limit y offset para </w:t>
+      </w:r>
+      <w:proofErr w:type="spellStart"/>
+      <w:r>
+        <w:t>que</w:t>
+      </w:r>
+      <w:proofErr w:type="spellEnd"/>
+      <w:r>
+        <w:t xml:space="preserve"> </w:t>
+      </w:r>
+      <w:proofErr w:type="spellStart"/>
+      <w:r>
+        <w:t>el</w:t>
+      </w:r>
+      <w:proofErr w:type="spellEnd"/>
+      <w:r>
+        <w:t xml:space="preserve"> Frontend no se </w:t>
+      </w:r>
+      <w:proofErr w:type="spellStart"/>
+      <w:r>
+        <w:t>sature</w:t>
+      </w:r>
+      <w:proofErr w:type="spellEnd"/>
+      <w:r>
+        <w:t xml:space="preserve"> </w:t>
+      </w:r>
+      <w:proofErr w:type="spellStart"/>
+      <w:r>
+        <w:t>si</w:t>
+      </w:r>
+      <w:proofErr w:type="spellEnd"/>
+      <w:r>
+        <w:t xml:space="preserve"> hay 5,000 </w:t>
+      </w:r>
+      <w:proofErr w:type="spellStart"/>
+      <w:r>
+        <w:t>clientes</w:t>
+      </w:r>
+      <w:proofErr w:type="spellEnd"/>
+      <w:r>
+        <w:t>.</w:t>
+      </w:r>
+    </w:p>
+    <w:p>
+      <w:pPr>
+        <w:rPr>
+          <w:b/>
+          <w:bCs/>
+        </w:rPr>
+      </w:pPr>
+      <w:r>
+        <w:rPr>
+          <w:b/>
+          <w:bCs/>
+        </w:rPr>
+        <w:t xml:space="preserve">2. </w:t>
+      </w:r>
+      <w:proofErr w:type="spellStart"/>
+      <w:r>
+        <w:rPr>
+          <w:b/>
+          <w:bCs/>
+        </w:rPr>
+        <w:t>Validación</w:t>
+      </w:r>
+      <w:proofErr w:type="spellEnd"/>
+      <w:r>
+        <w:rPr>
+          <w:b/>
+          <w:bCs/>
+        </w:rPr>
+        <w:t xml:space="preserve"> de </w:t>
+      </w:r>
+      <w:proofErr w:type="spellStart"/>
+      <w:r>
+        <w:rPr>
+          <w:b/>
+          <w:bCs/>
+        </w:rPr>
+        <w:t>Dependencias</w:t>
+      </w:r>
+      <w:proofErr w:type="spellEnd"/>
+      <w:r>
+        <w:rPr>
+          <w:b/>
+          <w:bCs/>
+        </w:rPr>
+        <w:t xml:space="preserve"> (</w:t>
+      </w:r>
+      <w:proofErr w:type="spellStart"/>
+      <w:r>
+        <w:rPr>
+          <w:b/>
+          <w:bCs/>
+        </w:rPr>
+        <w:t>Requerido</w:t>
+      </w:r>
+      <w:proofErr w:type="spellEnd"/>
+      <w:r>
+        <w:rPr>
+          <w:b/>
+          <w:bCs/>
+        </w:rPr>
+        <w:t xml:space="preserve"> </w:t>
+      </w:r>
+      <w:proofErr w:type="spellStart"/>
+      <w:r>
+        <w:rPr>
+          <w:b/>
+          <w:bCs/>
+        </w:rPr>
+        <w:t>en</w:t>
+      </w:r>
+      <w:proofErr w:type="spellEnd"/>
+      <w:r>
+        <w:rPr>
+          <w:b/>
+          <w:bCs/>
+        </w:rPr>
+        <w:t xml:space="preserve"> HU-005-BE-04)</w:t>
+      </w:r>
+    </w:p>
+    <w:p>
+      <w:r>
+        <w:t xml:space="preserve">La </w:t>
+      </w:r>
+      <w:proofErr w:type="spellStart"/>
+      <w:r>
+        <w:t>historia</w:t>
+      </w:r>
+      <w:proofErr w:type="spellEnd"/>
+      <w:r>
+        <w:t xml:space="preserve"> </w:t>
+      </w:r>
+      <w:proofErr w:type="spellStart"/>
+      <w:r>
+        <w:t>menciona</w:t>
+      </w:r>
+      <w:proofErr w:type="spellEnd"/>
+      <w:r>
+        <w:t xml:space="preserve"> "</w:t>
+      </w:r>
+      <w:proofErr w:type="spellStart"/>
+      <w:r>
+        <w:t>Validación</w:t>
+      </w:r>
+      <w:proofErr w:type="spellEnd"/>
+      <w:r>
+        <w:t xml:space="preserve"> de </w:t>
+      </w:r>
+      <w:proofErr w:type="spellStart"/>
+      <w:r>
+        <w:t>dependencias</w:t>
+      </w:r>
+      <w:proofErr w:type="spellEnd"/>
+      <w:r>
+        <w:t xml:space="preserve">". Antes de </w:t>
+      </w:r>
+      <w:proofErr w:type="spellStart"/>
+      <w:r>
+        <w:t>permitir</w:t>
+      </w:r>
+      <w:proofErr w:type="spellEnd"/>
+      <w:r>
+        <w:t xml:space="preserve"> la </w:t>
+      </w:r>
+      <w:proofErr w:type="spellStart"/>
+      <w:r>
+        <w:t>eliminación</w:t>
+      </w:r>
+      <w:proofErr w:type="spellEnd"/>
+      <w:r>
+        <w:t xml:space="preserve"> (</w:t>
+      </w:r>
+      <w:proofErr w:type="spellStart"/>
+      <w:r>
+        <w:t>aunque</w:t>
+      </w:r>
+      <w:proofErr w:type="spellEnd"/>
+      <w:r>
+        <w:t xml:space="preserve"> sea </w:t>
+      </w:r>
+      <w:proofErr w:type="spellStart"/>
+      <w:r>
+        <w:t>lógica</w:t>
+      </w:r>
+      <w:proofErr w:type="spellEnd"/>
+      <w:r>
+        <w:t xml:space="preserve">), </w:t>
+      </w:r>
+      <w:proofErr w:type="spellStart"/>
+      <w:r>
+        <w:t>el</w:t>
+      </w:r>
+      <w:proofErr w:type="spellEnd"/>
+      <w:r>
+        <w:t xml:space="preserve"> </w:t>
+      </w:r>
+      <w:proofErr w:type="spellStart"/>
+      <w:r>
+        <w:t>sistema</w:t>
+      </w:r>
+      <w:proofErr w:type="spellEnd"/>
+      <w:r>
+        <w:t xml:space="preserve"> </w:t>
+      </w:r>
+      <w:proofErr w:type="spellStart"/>
+      <w:r>
+        <w:t>debería</w:t>
+      </w:r>
+      <w:proofErr w:type="spellEnd"/>
+      <w:r>
+        <w:t xml:space="preserve"> </w:t>
+      </w:r>
+      <w:proofErr w:type="spellStart"/>
+      <w:r>
+        <w:t>verificar</w:t>
+      </w:r>
+      <w:proofErr w:type="spellEnd"/>
+      <w:r>
+        <w:t xml:space="preserve"> </w:t>
+      </w:r>
+      <w:proofErr w:type="spellStart"/>
+      <w:r>
+        <w:t>si</w:t>
+      </w:r>
+      <w:proofErr w:type="spellEnd"/>
+      <w:r>
+        <w:t xml:space="preserve"> </w:t>
+      </w:r>
+      <w:proofErr w:type="spellStart"/>
+      <w:r>
+        <w:t>el</w:t>
+      </w:r>
+      <w:proofErr w:type="spellEnd"/>
+      <w:r>
+        <w:t xml:space="preserve"> </w:t>
+      </w:r>
+      <w:proofErr w:type="spellStart"/>
+      <w:r>
+        <w:t>cliente</w:t>
+      </w:r>
+      <w:proofErr w:type="spellEnd"/>
+      <w:r>
+        <w:t xml:space="preserve"> </w:t>
+      </w:r>
+      <w:proofErr w:type="spellStart"/>
+      <w:r>
+        <w:t>tiene</w:t>
+      </w:r>
+      <w:proofErr w:type="spellEnd"/>
+      <w:r>
+        <w:t xml:space="preserve"> facturas o </w:t>
+      </w:r>
+      <w:proofErr w:type="spellStart"/>
+      <w:r>
+        <w:t>proyectos</w:t>
+      </w:r>
+      <w:proofErr w:type="spellEnd"/>
+      <w:r>
+        <w:t xml:space="preserve"> </w:t>
+      </w:r>
+      <w:proofErr w:type="spellStart"/>
+      <w:r>
+        <w:t>asociados</w:t>
+      </w:r>
+      <w:proofErr w:type="spellEnd"/>
+      <w:r>
+        <w:t xml:space="preserve">. Como </w:t>
+      </w:r>
+      <w:proofErr w:type="spellStart"/>
+      <w:r>
+        <w:t>estamos</w:t>
+      </w:r>
+      <w:proofErr w:type="spellEnd"/>
+      <w:r>
+        <w:t xml:space="preserve"> </w:t>
+      </w:r>
+      <w:proofErr w:type="spellStart"/>
+      <w:r>
+        <w:t>empezando</w:t>
+      </w:r>
+      <w:proofErr w:type="spellEnd"/>
+      <w:r>
+        <w:t xml:space="preserve">, </w:t>
+      </w:r>
+      <w:proofErr w:type="spellStart"/>
+      <w:r>
+        <w:t>por</w:t>
+      </w:r>
+      <w:proofErr w:type="spellEnd"/>
+      <w:r>
+        <w:t xml:space="preserve"> </w:t>
+      </w:r>
+      <w:proofErr w:type="spellStart"/>
+      <w:r>
+        <w:t>ahora</w:t>
+      </w:r>
+      <w:proofErr w:type="spellEnd"/>
+      <w:r>
+        <w:t xml:space="preserve"> basta con </w:t>
+      </w:r>
+      <w:proofErr w:type="spellStart"/>
+      <w:r>
+        <w:t>asegurar</w:t>
+      </w:r>
+      <w:proofErr w:type="spellEnd"/>
+      <w:r>
+        <w:t xml:space="preserve"> </w:t>
+      </w:r>
+      <w:proofErr w:type="spellStart"/>
+      <w:r>
+        <w:t>que</w:t>
+      </w:r>
+      <w:proofErr w:type="spellEnd"/>
+      <w:r>
+        <w:t xml:space="preserve"> </w:t>
+      </w:r>
+      <w:proofErr w:type="spellStart"/>
+      <w:r>
+        <w:t>el</w:t>
+      </w:r>
+      <w:proofErr w:type="spellEnd"/>
+      <w:r>
+        <w:t xml:space="preserve"> DELETE solo </w:t>
+      </w:r>
+      <w:proofErr w:type="spellStart"/>
+      <w:r>
+        <w:t>cambie</w:t>
+      </w:r>
+      <w:proofErr w:type="spellEnd"/>
+      <w:r>
+        <w:t xml:space="preserve"> </w:t>
+      </w:r>
+      <w:proofErr w:type="spellStart"/>
+      <w:r>
+        <w:t>el</w:t>
+      </w:r>
+      <w:proofErr w:type="spellEnd"/>
+      <w:r>
+        <w:t xml:space="preserve"> </w:t>
+      </w:r>
+      <w:proofErr w:type="spellStart"/>
+      <w:r>
+        <w:t>estado</w:t>
+      </w:r>
+      <w:proofErr w:type="spellEnd"/>
+      <w:r>
+        <w:t xml:space="preserve">, </w:t>
+      </w:r>
+      <w:proofErr w:type="spellStart"/>
+      <w:r>
+        <w:t>pero</w:t>
+      </w:r>
+      <w:proofErr w:type="spellEnd"/>
+      <w:r>
+        <w:t xml:space="preserve"> hay </w:t>
+      </w:r>
+      <w:proofErr w:type="spellStart"/>
+      <w:r>
+        <w:t>que</w:t>
+      </w:r>
+      <w:proofErr w:type="spellEnd"/>
+      <w:r>
+        <w:t xml:space="preserve"> </w:t>
+      </w:r>
+      <w:proofErr w:type="spellStart"/>
+      <w:r>
+        <w:t>dejar</w:t>
+      </w:r>
+      <w:proofErr w:type="spellEnd"/>
+      <w:r>
+        <w:t xml:space="preserve"> </w:t>
+      </w:r>
+      <w:proofErr w:type="spellStart"/>
+      <w:r>
+        <w:t>el</w:t>
+      </w:r>
+      <w:proofErr w:type="spellEnd"/>
+      <w:r>
+        <w:t xml:space="preserve"> </w:t>
+      </w:r>
+      <w:proofErr w:type="spellStart"/>
+      <w:r>
+        <w:t>gancho</w:t>
+      </w:r>
+      <w:proofErr w:type="spellEnd"/>
+      <w:r>
+        <w:t xml:space="preserve"> para </w:t>
+      </w:r>
+      <w:proofErr w:type="spellStart"/>
+      <w:r>
+        <w:t>futuras</w:t>
+      </w:r>
+      <w:proofErr w:type="spellEnd"/>
+      <w:r>
+        <w:t xml:space="preserve"> </w:t>
+      </w:r>
+      <w:proofErr w:type="spellStart"/>
+      <w:r>
+        <w:t>validaciones</w:t>
+      </w:r>
+      <w:proofErr w:type="spellEnd"/>
+      <w:r>
+        <w:t>.</w:t>
+      </w:r>
+    </w:p>
+    <w:p>
+      <w:r>
+        <w:pict w14:anchorId="200F7C49">
+          <v:rect id="_x0000_i1047" style="width:0;height:1.5pt" o:hralign="center" o:hrstd="t" o:hrnoshade="t" o:hr="t" fillcolor="gray" stroked="f"/>
+        </w:pict>
+      </w:r>
+    </w:p>
+    <w:p>
+      <w:pPr>
+        <w:rPr>
+          <w:b/>
+          <w:bCs/>
+        </w:rPr>
+      </w:pPr>
+      <w:r>
+        <w:rPr>
+          <w:rFonts w:ascii="Segoe UI Emoji" w:hAnsi="Segoe UI Emoji" w:cs="Segoe UI Emoji"/>
+          <w:b/>
+          <w:bCs/>
+        </w:rPr>
+        <w:t>📊</w:t>
+      </w:r>
+      <w:r>
+        <w:rPr>
+          <w:b/>
+          <w:bCs/>
+        </w:rPr>
+        <w:t xml:space="preserve"> </w:t>
+      </w:r>
+      <w:proofErr w:type="spellStart"/>
+      <w:r>
+        <w:rPr>
+          <w:b/>
+          <w:bCs/>
+        </w:rPr>
+        <w:t>Reporte</w:t>
+      </w:r>
+      <w:proofErr w:type="spellEnd"/>
+      <w:r>
+        <w:rPr>
+          <w:b/>
+          <w:bCs/>
+        </w:rPr>
+        <w:t xml:space="preserve"> </w:t>
+      </w:r>
+      <w:proofErr w:type="spellStart"/>
+      <w:r>
+        <w:rPr>
+          <w:b/>
+          <w:bCs/>
+        </w:rPr>
+        <w:t>Fullstack</w:t>
+      </w:r>
+      <w:proofErr w:type="spellEnd"/>
+      <w:r>
+        <w:rPr>
+          <w:b/>
+          <w:bCs/>
+        </w:rPr>
+        <w:t xml:space="preserve">: HU-005 - </w:t>
+      </w:r>
+      <w:proofErr w:type="spellStart"/>
+      <w:r>
+        <w:rPr>
+          <w:b/>
+          <w:bCs/>
+        </w:rPr>
+        <w:t>Gestión</w:t>
+      </w:r>
+      <w:proofErr w:type="spellEnd"/>
+      <w:r>
+        <w:rPr>
+          <w:b/>
+          <w:bCs/>
+        </w:rPr>
+        <w:t xml:space="preserve"> de </w:t>
+      </w:r>
+      <w:proofErr w:type="spellStart"/>
+      <w:r>
+        <w:rPr>
+          <w:b/>
+          <w:bCs/>
+        </w:rPr>
+        <w:t>Clientes</w:t>
+      </w:r>
+      <w:proofErr w:type="spellEnd"/>
+    </w:p>
+    <w:p>
+      <w:proofErr w:type="spellStart"/>
+      <w:r>
+        <w:rPr>
+          <w:b/>
+          <w:bCs/>
+        </w:rPr>
+        <w:t>Destinatario</w:t>
+      </w:r>
+      <w:proofErr w:type="spellEnd"/>
+      <w:r>
+        <w:rPr>
+          <w:b/>
+          <w:bCs/>
+        </w:rPr>
+        <w:t>:</w:t>
+      </w:r>
+      <w:r>
+        <w:t xml:space="preserve"> Juan Camilo</w:t>
+      </w:r>
+    </w:p>
+    <w:p>
+      <w:r>
+        <w:rPr>
+          <w:b/>
+          <w:bCs/>
+        </w:rPr>
+        <w:t>Estado:</w:t>
+      </w:r>
+      <w:r>
+        <w:t xml:space="preserve"> </w:t>
+      </w:r>
+      <w:r>
+        <w:rPr>
+          <w:rFonts w:ascii="Segoe UI Emoji" w:hAnsi="Segoe UI Emoji" w:cs="Segoe UI Emoji"/>
+        </w:rPr>
+        <w:t>🟢</w:t>
+      </w:r>
+      <w:r>
+        <w:t xml:space="preserve"> </w:t>
+      </w:r>
+      <w:r>
+        <w:rPr>
+          <w:b/>
+          <w:bCs/>
+        </w:rPr>
+        <w:t xml:space="preserve">95% (Listo para </w:t>
+      </w:r>
+      <w:proofErr w:type="spellStart"/>
+      <w:r>
+        <w:rPr>
+          <w:b/>
+          <w:bCs/>
+        </w:rPr>
+        <w:t>pruebas</w:t>
+      </w:r>
+      <w:proofErr w:type="spellEnd"/>
+      <w:r>
+        <w:rPr>
+          <w:b/>
+          <w:bCs/>
+        </w:rPr>
+        <w:t xml:space="preserve"> de </w:t>
+      </w:r>
+      <w:proofErr w:type="spellStart"/>
+      <w:r>
+        <w:rPr>
+          <w:b/>
+          <w:bCs/>
+        </w:rPr>
+        <w:t>integración</w:t>
+      </w:r>
+      <w:proofErr w:type="spellEnd"/>
+      <w:r>
+        <w:rPr>
+          <w:b/>
+          <w:bCs/>
+        </w:rPr>
+        <w:t>)</w:t>
+      </w:r>
+    </w:p>
+    <w:p>
+      <w:pPr>
+        <w:rPr>
+          <w:b/>
+          <w:bCs/>
+        </w:rPr>
+      </w:pPr>
+      <w:proofErr w:type="spellStart"/>
+      <w:r>
+        <w:rPr>
+          <w:b/>
+          <w:bCs/>
+        </w:rPr>
+        <w:t>Resumen</w:t>
+      </w:r>
+      <w:proofErr w:type="spellEnd"/>
+      <w:r>
+        <w:rPr>
+          <w:b/>
+          <w:bCs/>
+        </w:rPr>
+        <w:t xml:space="preserve"> del Desarrollo</w:t>
+      </w:r>
+    </w:p>
+    <w:p>
+      <w:r>
+        <w:t xml:space="preserve">Se ha </w:t>
+      </w:r>
+      <w:proofErr w:type="spellStart"/>
+      <w:r>
+        <w:t>implementado</w:t>
+      </w:r>
+      <w:proofErr w:type="spellEnd"/>
+      <w:r>
+        <w:t xml:space="preserve"> </w:t>
+      </w:r>
+      <w:proofErr w:type="spellStart"/>
+      <w:r>
+        <w:t>el</w:t>
+      </w:r>
+      <w:proofErr w:type="spellEnd"/>
+      <w:r>
+        <w:t xml:space="preserve"> </w:t>
+      </w:r>
+      <w:proofErr w:type="spellStart"/>
+      <w:r>
+        <w:t>núcleo</w:t>
+      </w:r>
+      <w:proofErr w:type="spellEnd"/>
+      <w:r>
+        <w:t xml:space="preserve"> de </w:t>
+      </w:r>
+      <w:proofErr w:type="spellStart"/>
+      <w:r>
+        <w:t>gestión</w:t>
+      </w:r>
+      <w:proofErr w:type="spellEnd"/>
+      <w:r>
+        <w:t xml:space="preserve"> de </w:t>
+      </w:r>
+      <w:proofErr w:type="spellStart"/>
+      <w:r>
+        <w:t>clientes</w:t>
+      </w:r>
+      <w:proofErr w:type="spellEnd"/>
+      <w:r>
+        <w:t xml:space="preserve"> bajo </w:t>
+      </w:r>
+      <w:proofErr w:type="spellStart"/>
+      <w:r>
+        <w:t>una</w:t>
+      </w:r>
+      <w:proofErr w:type="spellEnd"/>
+      <w:r>
+        <w:t xml:space="preserve"> </w:t>
+      </w:r>
+      <w:proofErr w:type="spellStart"/>
+      <w:r>
+        <w:t>arquitectura</w:t>
+      </w:r>
+      <w:proofErr w:type="spellEnd"/>
+      <w:r>
+        <w:t xml:space="preserve"> de </w:t>
+      </w:r>
+      <w:proofErr w:type="spellStart"/>
+      <w:r>
+        <w:t>tres</w:t>
+      </w:r>
+      <w:proofErr w:type="spellEnd"/>
+      <w:r>
+        <w:t xml:space="preserve"> </w:t>
+      </w:r>
+      <w:proofErr w:type="spellStart"/>
+      <w:r>
+        <w:t>capas</w:t>
+      </w:r>
+      <w:proofErr w:type="spellEnd"/>
+      <w:r>
+        <w:t xml:space="preserve"> (Modelo, </w:t>
+      </w:r>
+      <w:proofErr w:type="spellStart"/>
+      <w:r>
+        <w:t>Esquema</w:t>
+      </w:r>
+      <w:proofErr w:type="spellEnd"/>
+      <w:r>
+        <w:t xml:space="preserve">, Servicio), </w:t>
+      </w:r>
+      <w:proofErr w:type="spellStart"/>
+      <w:r>
+        <w:t>garantizando</w:t>
+      </w:r>
+      <w:proofErr w:type="spellEnd"/>
+      <w:r>
+        <w:t xml:space="preserve"> </w:t>
+      </w:r>
+      <w:proofErr w:type="spellStart"/>
+      <w:r>
+        <w:t>que</w:t>
+      </w:r>
+      <w:proofErr w:type="spellEnd"/>
+      <w:r>
+        <w:t xml:space="preserve"> la </w:t>
+      </w:r>
+      <w:proofErr w:type="spellStart"/>
+      <w:r>
+        <w:t>información</w:t>
+      </w:r>
+      <w:proofErr w:type="spellEnd"/>
+      <w:r>
+        <w:t xml:space="preserve"> sea transversal a </w:t>
+      </w:r>
+      <w:proofErr w:type="spellStart"/>
+      <w:r>
+        <w:t>todo</w:t>
+      </w:r>
+      <w:proofErr w:type="spellEnd"/>
+      <w:r>
+        <w:t xml:space="preserve"> </w:t>
+      </w:r>
+      <w:proofErr w:type="spellStart"/>
+      <w:r>
+        <w:t>el</w:t>
+      </w:r>
+      <w:proofErr w:type="spellEnd"/>
+      <w:r>
+        <w:t xml:space="preserve"> ERP.</w:t>
+      </w:r>
+    </w:p>
+    <w:p>
+      <w:pPr>
+        <w:rPr>
+          <w:b/>
+          <w:bCs/>
+        </w:rPr>
+      </w:pPr>
+      <w:r>
+        <w:rPr>
+          <w:rFonts w:ascii="Segoe UI Emoji" w:hAnsi="Segoe UI Emoji" w:cs="Segoe UI Emoji"/>
+          <w:b/>
+          <w:bCs/>
+        </w:rPr>
+        <w:t>🛠️</w:t>
+      </w:r>
+      <w:r>
+        <w:rPr>
+          <w:b/>
+          <w:bCs/>
+        </w:rPr>
+        <w:t xml:space="preserve"> </w:t>
+      </w:r>
+      <w:proofErr w:type="spellStart"/>
+      <w:r>
+        <w:rPr>
+          <w:b/>
+          <w:bCs/>
+        </w:rPr>
+        <w:t>Logros</w:t>
+      </w:r>
+      <w:proofErr w:type="spellEnd"/>
+      <w:r>
+        <w:rPr>
+          <w:b/>
+          <w:bCs/>
+        </w:rPr>
+        <w:t xml:space="preserve"> </w:t>
+      </w:r>
+      <w:proofErr w:type="spellStart"/>
+      <w:r>
+        <w:rPr>
+          <w:b/>
+          <w:bCs/>
+        </w:rPr>
+        <w:t>Técnicos</w:t>
+      </w:r>
+      <w:proofErr w:type="spellEnd"/>
+      <w:r>
+        <w:rPr>
+          <w:b/>
+          <w:bCs/>
+        </w:rPr>
+        <w:t xml:space="preserve"> (Backend)</w:t>
+      </w:r>
+    </w:p>
+    <w:p>
+      <w:pPr>
+        <w:numPr>
+          <w:ilvl w:val="0"/>
+          <w:numId w:val="17"/>
+        </w:numPr>
+      </w:pPr>
+      <w:proofErr w:type="spellStart"/>
+      <w:r>
+        <w:rPr>
+          <w:b/>
+          <w:bCs/>
+        </w:rPr>
+        <w:t>Persistencia</w:t>
+      </w:r>
+      <w:proofErr w:type="spellEnd"/>
+      <w:r>
+        <w:rPr>
+          <w:b/>
+          <w:bCs/>
+        </w:rPr>
+        <w:t xml:space="preserve"> Robusta:</w:t>
+      </w:r>
+      <w:r>
+        <w:t xml:space="preserve"> Se </w:t>
+      </w:r>
+      <w:proofErr w:type="spellStart"/>
+      <w:r>
+        <w:t>creó</w:t>
+      </w:r>
+      <w:proofErr w:type="spellEnd"/>
+      <w:r>
+        <w:t xml:space="preserve"> la </w:t>
+      </w:r>
+      <w:proofErr w:type="spellStart"/>
+      <w:r>
+        <w:t>tabla</w:t>
+      </w:r>
+      <w:proofErr w:type="spellEnd"/>
+      <w:r>
+        <w:t xml:space="preserve"> </w:t>
+      </w:r>
+      <w:proofErr w:type="spellStart"/>
+      <w:r>
+        <w:t>configuracion.clientes</w:t>
+      </w:r>
+      <w:proofErr w:type="spellEnd"/>
+      <w:r>
+        <w:t xml:space="preserve"> con </w:t>
+      </w:r>
+      <w:proofErr w:type="spellStart"/>
+      <w:r>
+        <w:t>indexación</w:t>
+      </w:r>
+      <w:proofErr w:type="spellEnd"/>
+      <w:r>
+        <w:t xml:space="preserve"> </w:t>
+      </w:r>
+      <w:proofErr w:type="spellStart"/>
+      <w:r>
+        <w:t>en</w:t>
+      </w:r>
+      <w:proofErr w:type="spellEnd"/>
+      <w:r>
+        <w:t xml:space="preserve"> </w:t>
+      </w:r>
+      <w:proofErr w:type="spellStart"/>
+      <w:r>
+        <w:t>id_cli</w:t>
+      </w:r>
+      <w:proofErr w:type="spellEnd"/>
+      <w:r>
+        <w:t xml:space="preserve"> y </w:t>
+      </w:r>
+      <w:proofErr w:type="spellStart"/>
+      <w:r>
+        <w:t>nombre</w:t>
+      </w:r>
+      <w:proofErr w:type="spellEnd"/>
+      <w:r>
+        <w:t xml:space="preserve"> para </w:t>
+      </w:r>
+      <w:proofErr w:type="spellStart"/>
+      <w:r>
+        <w:t>garantizar</w:t>
+      </w:r>
+      <w:proofErr w:type="spellEnd"/>
+      <w:r>
+        <w:t xml:space="preserve"> </w:t>
+      </w:r>
+      <w:proofErr w:type="spellStart"/>
+      <w:r>
+        <w:t>búsquedas</w:t>
+      </w:r>
+      <w:proofErr w:type="spellEnd"/>
+      <w:r>
+        <w:t xml:space="preserve"> </w:t>
+      </w:r>
+      <w:proofErr w:type="spellStart"/>
+      <w:r>
+        <w:t>instantáneas</w:t>
+      </w:r>
+      <w:proofErr w:type="spellEnd"/>
+      <w:r>
+        <w:t>.</w:t>
+      </w:r>
+    </w:p>
+    <w:p>
+      <w:pPr>
+        <w:numPr>
+          <w:ilvl w:val="0"/>
+          <w:numId w:val="17"/>
+        </w:numPr>
+      </w:pPr>
+      <w:proofErr w:type="spellStart"/>
+      <w:r>
+        <w:rPr>
+          <w:b/>
+          <w:bCs/>
+        </w:rPr>
+        <w:t>Seguridad</w:t>
+      </w:r>
+      <w:proofErr w:type="spellEnd"/>
+      <w:r>
+        <w:rPr>
+          <w:b/>
+          <w:bCs/>
+        </w:rPr>
+        <w:t xml:space="preserve"> de Identidad:</w:t>
+      </w:r>
+      <w:r>
+        <w:t xml:space="preserve"> </w:t>
+      </w:r>
+      <w:proofErr w:type="spellStart"/>
+      <w:r>
+        <w:t>Implementamos</w:t>
+      </w:r>
+      <w:proofErr w:type="spellEnd"/>
+      <w:r>
+        <w:t xml:space="preserve"> un </w:t>
+      </w:r>
+      <w:proofErr w:type="spellStart"/>
+      <w:r>
+        <w:t>bloqueo</w:t>
+      </w:r>
+      <w:proofErr w:type="spellEnd"/>
+      <w:r>
+        <w:t xml:space="preserve"> a </w:t>
+      </w:r>
+      <w:proofErr w:type="spellStart"/>
+      <w:r>
+        <w:t>nivel</w:t>
+      </w:r>
+      <w:proofErr w:type="spellEnd"/>
+      <w:r>
+        <w:t xml:space="preserve"> de </w:t>
+      </w:r>
+      <w:proofErr w:type="spellStart"/>
+      <w:r>
+        <w:t>servicio</w:t>
+      </w:r>
+      <w:proofErr w:type="spellEnd"/>
+      <w:r>
+        <w:t xml:space="preserve"> </w:t>
+      </w:r>
+      <w:proofErr w:type="spellStart"/>
+      <w:r>
+        <w:t>que</w:t>
+      </w:r>
+      <w:proofErr w:type="spellEnd"/>
+      <w:r>
+        <w:t xml:space="preserve"> </w:t>
+      </w:r>
+      <w:proofErr w:type="spellStart"/>
+      <w:r>
+        <w:t>impide</w:t>
+      </w:r>
+      <w:proofErr w:type="spellEnd"/>
+      <w:r>
+        <w:t xml:space="preserve"> la </w:t>
+      </w:r>
+      <w:proofErr w:type="spellStart"/>
+      <w:r>
+        <w:t>creación</w:t>
+      </w:r>
+      <w:proofErr w:type="spellEnd"/>
+      <w:r>
+        <w:t xml:space="preserve"> de NITs o Cédulas </w:t>
+      </w:r>
+      <w:proofErr w:type="spellStart"/>
+      <w:r>
+        <w:t>duplicadas</w:t>
+      </w:r>
+      <w:proofErr w:type="spellEnd"/>
+      <w:r>
+        <w:t xml:space="preserve"> (Error 400).</w:t>
+      </w:r>
+    </w:p>
+    <w:p>
+      <w:pPr>
+        <w:numPr>
+          <w:ilvl w:val="0"/>
+          <w:numId w:val="17"/>
+        </w:numPr>
+      </w:pPr>
+      <w:r>
+        <w:rPr>
+          <w:b/>
+          <w:bCs/>
+        </w:rPr>
+        <w:t xml:space="preserve">Sistema de </w:t>
+      </w:r>
+      <w:proofErr w:type="spellStart"/>
+      <w:r>
+        <w:rPr>
+          <w:b/>
+          <w:bCs/>
+        </w:rPr>
+        <w:t>Auditoría</w:t>
+      </w:r>
+      <w:proofErr w:type="spellEnd"/>
+      <w:r>
+        <w:rPr>
+          <w:b/>
+          <w:bCs/>
+        </w:rPr>
+        <w:t xml:space="preserve"> </w:t>
+      </w:r>
+      <w:proofErr w:type="spellStart"/>
+      <w:r>
+        <w:rPr>
+          <w:b/>
+          <w:bCs/>
+        </w:rPr>
+        <w:t>Activo</w:t>
+      </w:r>
+      <w:proofErr w:type="spellEnd"/>
+      <w:r>
+        <w:rPr>
+          <w:b/>
+          <w:bCs/>
+        </w:rPr>
+        <w:t>:</w:t>
+      </w:r>
+      <w:r>
+        <w:t xml:space="preserve"> Cada </w:t>
+      </w:r>
+      <w:proofErr w:type="spellStart"/>
+      <w:r>
+        <w:t>creación</w:t>
+      </w:r>
+      <w:proofErr w:type="spellEnd"/>
+      <w:r>
+        <w:t xml:space="preserve"> o </w:t>
+      </w:r>
+      <w:proofErr w:type="spellStart"/>
+      <w:r>
+        <w:t>modificación</w:t>
+      </w:r>
+      <w:proofErr w:type="spellEnd"/>
+      <w:r>
+        <w:t xml:space="preserve"> </w:t>
+      </w:r>
+      <w:proofErr w:type="spellStart"/>
+      <w:r>
+        <w:t>dispara</w:t>
+      </w:r>
+      <w:proofErr w:type="spellEnd"/>
+      <w:r>
+        <w:t xml:space="preserve"> un log </w:t>
+      </w:r>
+      <w:proofErr w:type="spellStart"/>
+      <w:r>
+        <w:t>automático</w:t>
+      </w:r>
+      <w:proofErr w:type="spellEnd"/>
+      <w:r>
+        <w:t xml:space="preserve">. </w:t>
+      </w:r>
+      <w:proofErr w:type="spellStart"/>
+      <w:r>
+        <w:t>Guardamos</w:t>
+      </w:r>
+      <w:proofErr w:type="spellEnd"/>
+      <w:r>
+        <w:t xml:space="preserve"> </w:t>
+      </w:r>
+      <w:proofErr w:type="spellStart"/>
+      <w:r>
+        <w:t>el</w:t>
+      </w:r>
+      <w:proofErr w:type="spellEnd"/>
+      <w:r>
+        <w:t xml:space="preserve"> "antes" y </w:t>
+      </w:r>
+      <w:proofErr w:type="spellStart"/>
+      <w:r>
+        <w:t>el</w:t>
+      </w:r>
+      <w:proofErr w:type="spellEnd"/>
+      <w:r>
+        <w:t xml:space="preserve"> "</w:t>
+      </w:r>
+      <w:proofErr w:type="spellStart"/>
+      <w:r>
+        <w:t>después</w:t>
+      </w:r>
+      <w:proofErr w:type="spellEnd"/>
+      <w:r>
+        <w:t xml:space="preserve">" de </w:t>
+      </w:r>
+      <w:proofErr w:type="spellStart"/>
+      <w:r>
+        <w:t>cada</w:t>
+      </w:r>
+      <w:proofErr w:type="spellEnd"/>
+      <w:r>
+        <w:t xml:space="preserve"> </w:t>
+      </w:r>
+      <w:proofErr w:type="spellStart"/>
+      <w:r>
+        <w:t>cliente</w:t>
+      </w:r>
+      <w:proofErr w:type="spellEnd"/>
+      <w:r>
+        <w:t xml:space="preserve"> </w:t>
+      </w:r>
+      <w:proofErr w:type="spellStart"/>
+      <w:r>
+        <w:t>modificado</w:t>
+      </w:r>
+      <w:proofErr w:type="spellEnd"/>
+      <w:r>
+        <w:t xml:space="preserve"> para control </w:t>
+      </w:r>
+      <w:proofErr w:type="spellStart"/>
+      <w:r>
+        <w:t>contable</w:t>
+      </w:r>
+      <w:proofErr w:type="spellEnd"/>
+      <w:r>
+        <w:t>.</w:t>
+      </w:r>
+    </w:p>
+    <w:p>
+      <w:pPr>
+        <w:numPr>
+          <w:ilvl w:val="0"/>
+          <w:numId w:val="17"/>
+        </w:numPr>
+      </w:pPr>
+      <w:proofErr w:type="spellStart"/>
+      <w:r>
+        <w:rPr>
+          <w:b/>
+          <w:bCs/>
+        </w:rPr>
+        <w:t>Gestión</w:t>
+      </w:r>
+      <w:proofErr w:type="spellEnd"/>
+      <w:r>
+        <w:rPr>
+          <w:b/>
+          <w:bCs/>
+        </w:rPr>
+        <w:t xml:space="preserve"> de </w:t>
+      </w:r>
+      <w:proofErr w:type="spellStart"/>
+      <w:r>
+        <w:rPr>
+          <w:b/>
+          <w:bCs/>
+        </w:rPr>
+        <w:t>Errores</w:t>
+      </w:r>
+      <w:proofErr w:type="spellEnd"/>
+      <w:r>
+        <w:rPr>
+          <w:b/>
+          <w:bCs/>
+        </w:rPr>
+        <w:t>:</w:t>
+      </w:r>
+      <w:r>
+        <w:t xml:space="preserve"> Se </w:t>
+      </w:r>
+      <w:proofErr w:type="spellStart"/>
+      <w:r>
+        <w:t>configuraron</w:t>
+      </w:r>
+      <w:proofErr w:type="spellEnd"/>
+      <w:r>
+        <w:t xml:space="preserve"> </w:t>
+      </w:r>
+      <w:proofErr w:type="spellStart"/>
+      <w:r>
+        <w:t>los</w:t>
+      </w:r>
+      <w:proofErr w:type="spellEnd"/>
+      <w:r>
+        <w:t xml:space="preserve"> </w:t>
+      </w:r>
+      <w:proofErr w:type="spellStart"/>
+      <w:r>
+        <w:t>permisos</w:t>
+      </w:r>
+      <w:proofErr w:type="spellEnd"/>
+      <w:r>
+        <w:t xml:space="preserve"> de </w:t>
+      </w:r>
+      <w:proofErr w:type="spellStart"/>
+      <w:r>
+        <w:t>secuencias</w:t>
+      </w:r>
+      <w:proofErr w:type="spellEnd"/>
+      <w:r>
+        <w:t xml:space="preserve"> </w:t>
+      </w:r>
+      <w:proofErr w:type="spellStart"/>
+      <w:r>
+        <w:t>en</w:t>
+      </w:r>
+      <w:proofErr w:type="spellEnd"/>
+      <w:r>
+        <w:t xml:space="preserve"> PostgreSQL para </w:t>
+      </w:r>
+      <w:proofErr w:type="spellStart"/>
+      <w:r>
+        <w:t>evitar</w:t>
+      </w:r>
+      <w:proofErr w:type="spellEnd"/>
+      <w:r>
+        <w:t xml:space="preserve"> </w:t>
+      </w:r>
+      <w:proofErr w:type="spellStart"/>
+      <w:r>
+        <w:t>fallos</w:t>
+      </w:r>
+      <w:proofErr w:type="spellEnd"/>
+      <w:r>
+        <w:t xml:space="preserve"> de </w:t>
+      </w:r>
+      <w:proofErr w:type="spellStart"/>
+      <w:r>
+        <w:t>privilegios</w:t>
+      </w:r>
+      <w:proofErr w:type="spellEnd"/>
+      <w:r>
+        <w:t xml:space="preserve"> </w:t>
+      </w:r>
+      <w:proofErr w:type="spellStart"/>
+      <w:r>
+        <w:t>en</w:t>
+      </w:r>
+      <w:proofErr w:type="spellEnd"/>
+      <w:r>
+        <w:t xml:space="preserve"> </w:t>
+      </w:r>
+      <w:proofErr w:type="spellStart"/>
+      <w:r>
+        <w:t>producción</w:t>
+      </w:r>
+      <w:proofErr w:type="spellEnd"/>
+      <w:r>
+        <w:t>.</w:t>
+      </w:r>
+    </w:p>
+    <w:p>
+      <w:pPr>
+        <w:rPr>
+          <w:b/>
+          <w:bCs/>
+        </w:rPr>
+      </w:pPr>
+      <w:r>
+        <w:rPr>
+          <w:rFonts w:ascii="Segoe UI Emoji" w:hAnsi="Segoe UI Emoji" w:cs="Segoe UI Emoji"/>
+          <w:b/>
+          <w:bCs/>
+        </w:rPr>
+        <w:lastRenderedPageBreak/>
+        <w:t>🖥️</w:t>
+      </w:r>
+      <w:r>
+        <w:rPr>
+          <w:b/>
+          <w:bCs/>
+        </w:rPr>
+        <w:t xml:space="preserve"> </w:t>
+      </w:r>
+      <w:proofErr w:type="spellStart"/>
+      <w:r>
+        <w:rPr>
+          <w:b/>
+          <w:bCs/>
+        </w:rPr>
+        <w:t>Interfaz</w:t>
+      </w:r>
+      <w:proofErr w:type="spellEnd"/>
+      <w:r>
+        <w:rPr>
+          <w:b/>
+          <w:bCs/>
+        </w:rPr>
+        <w:t xml:space="preserve"> y </w:t>
+      </w:r>
+      <w:proofErr w:type="spellStart"/>
+      <w:r>
+        <w:rPr>
+          <w:b/>
+          <w:bCs/>
+        </w:rPr>
+        <w:t>Comunicación</w:t>
+      </w:r>
+      <w:proofErr w:type="spellEnd"/>
+      <w:r>
+        <w:rPr>
+          <w:b/>
+          <w:bCs/>
+        </w:rPr>
+        <w:t xml:space="preserve"> (Frontend Ready)</w:t>
+      </w:r>
+    </w:p>
+    <w:p>
+      <w:pPr>
+        <w:numPr>
+          <w:ilvl w:val="0"/>
+          <w:numId w:val="18"/>
+        </w:numPr>
+      </w:pPr>
+      <w:proofErr w:type="spellStart"/>
+      <w:r>
+        <w:rPr>
+          <w:b/>
+          <w:bCs/>
+        </w:rPr>
+        <w:t>Contratos</w:t>
+      </w:r>
+      <w:proofErr w:type="spellEnd"/>
+      <w:r>
+        <w:rPr>
+          <w:b/>
+          <w:bCs/>
+        </w:rPr>
+        <w:t xml:space="preserve"> JSON:</w:t>
+      </w:r>
+      <w:r>
+        <w:t xml:space="preserve"> Los endpoints </w:t>
+      </w:r>
+      <w:proofErr w:type="spellStart"/>
+      <w:r>
+        <w:t>ya</w:t>
+      </w:r>
+      <w:proofErr w:type="spellEnd"/>
+      <w:r>
+        <w:t xml:space="preserve"> </w:t>
+      </w:r>
+      <w:proofErr w:type="spellStart"/>
+      <w:r>
+        <w:t>responden</w:t>
+      </w:r>
+      <w:proofErr w:type="spellEnd"/>
+      <w:r>
+        <w:t xml:space="preserve"> con </w:t>
+      </w:r>
+      <w:proofErr w:type="spellStart"/>
+      <w:r>
+        <w:t>el</w:t>
+      </w:r>
+      <w:proofErr w:type="spellEnd"/>
+      <w:r>
+        <w:t xml:space="preserve"> </w:t>
+      </w:r>
+      <w:proofErr w:type="spellStart"/>
+      <w:r>
+        <w:t>estándar</w:t>
+      </w:r>
+      <w:proofErr w:type="spellEnd"/>
+      <w:r>
+        <w:t xml:space="preserve"> </w:t>
+      </w:r>
+      <w:proofErr w:type="spellStart"/>
+      <w:r>
+        <w:t>ClienteResponse</w:t>
+      </w:r>
+      <w:proofErr w:type="spellEnd"/>
+      <w:r>
+        <w:t xml:space="preserve">, </w:t>
+      </w:r>
+      <w:proofErr w:type="spellStart"/>
+      <w:r>
+        <w:t>facilitando</w:t>
+      </w:r>
+      <w:proofErr w:type="spellEnd"/>
+      <w:r>
+        <w:t xml:space="preserve"> la </w:t>
+      </w:r>
+      <w:proofErr w:type="spellStart"/>
+      <w:r>
+        <w:t>integración</w:t>
+      </w:r>
+      <w:proofErr w:type="spellEnd"/>
+      <w:r>
+        <w:t xml:space="preserve"> con Angular.</w:t>
+      </w:r>
+    </w:p>
+    <w:p>
+      <w:pPr>
+        <w:numPr>
+          <w:ilvl w:val="0"/>
+          <w:numId w:val="18"/>
+        </w:numPr>
+      </w:pPr>
+      <w:proofErr w:type="spellStart"/>
+      <w:r>
+        <w:rPr>
+          <w:b/>
+          <w:bCs/>
+        </w:rPr>
+        <w:t>Validación</w:t>
+      </w:r>
+      <w:proofErr w:type="spellEnd"/>
+      <w:r>
+        <w:rPr>
+          <w:b/>
+          <w:bCs/>
+        </w:rPr>
+        <w:t xml:space="preserve"> de Datos:</w:t>
+      </w:r>
+      <w:r>
+        <w:t xml:space="preserve"> El backend </w:t>
+      </w:r>
+      <w:proofErr w:type="spellStart"/>
+      <w:r>
+        <w:t>ya</w:t>
+      </w:r>
+      <w:proofErr w:type="spellEnd"/>
+      <w:r>
+        <w:t xml:space="preserve"> </w:t>
+      </w:r>
+      <w:proofErr w:type="spellStart"/>
+      <w:r>
+        <w:t>rechaza</w:t>
+      </w:r>
+      <w:proofErr w:type="spellEnd"/>
+      <w:r>
+        <w:t xml:space="preserve"> </w:t>
+      </w:r>
+      <w:proofErr w:type="spellStart"/>
+      <w:r>
+        <w:t>correos</w:t>
+      </w:r>
+      <w:proofErr w:type="spellEnd"/>
+      <w:r>
+        <w:t xml:space="preserve"> </w:t>
+      </w:r>
+      <w:proofErr w:type="spellStart"/>
+      <w:r>
+        <w:t>electrónicos</w:t>
+      </w:r>
+      <w:proofErr w:type="spellEnd"/>
+      <w:r>
+        <w:t xml:space="preserve"> mal </w:t>
+      </w:r>
+      <w:proofErr w:type="spellStart"/>
+      <w:r>
+        <w:t>formados</w:t>
+      </w:r>
+      <w:proofErr w:type="spellEnd"/>
+      <w:r>
+        <w:t xml:space="preserve"> y campos </w:t>
+      </w:r>
+      <w:proofErr w:type="spellStart"/>
+      <w:r>
+        <w:t>obligatorios</w:t>
+      </w:r>
+      <w:proofErr w:type="spellEnd"/>
+      <w:r>
+        <w:t xml:space="preserve"> </w:t>
+      </w:r>
+      <w:proofErr w:type="spellStart"/>
+      <w:r>
+        <w:t>vacíos</w:t>
+      </w:r>
+      <w:proofErr w:type="spellEnd"/>
+      <w:r>
+        <w:t xml:space="preserve"> antes de </w:t>
+      </w:r>
+      <w:proofErr w:type="spellStart"/>
+      <w:r>
+        <w:t>tocar</w:t>
+      </w:r>
+      <w:proofErr w:type="spellEnd"/>
+      <w:r>
+        <w:t xml:space="preserve"> la base de </w:t>
+      </w:r>
+      <w:proofErr w:type="spellStart"/>
+      <w:r>
+        <w:t>datos</w:t>
+      </w:r>
+      <w:proofErr w:type="spellEnd"/>
+      <w:r>
+        <w:t>.</w:t>
+      </w:r>
+    </w:p>
+    <w:p>
+      <w:pPr>
+        <w:numPr>
+          <w:ilvl w:val="0"/>
+          <w:numId w:val="18"/>
+        </w:numPr>
+      </w:pPr>
+      <w:proofErr w:type="spellStart"/>
+      <w:r>
+        <w:rPr>
+          <w:b/>
+          <w:bCs/>
+        </w:rPr>
+        <w:t>Eliminación</w:t>
+      </w:r>
+      <w:proofErr w:type="spellEnd"/>
+      <w:r>
+        <w:rPr>
+          <w:b/>
+          <w:bCs/>
+        </w:rPr>
+        <w:t xml:space="preserve"> </w:t>
+      </w:r>
+      <w:proofErr w:type="spellStart"/>
+      <w:r>
+        <w:rPr>
+          <w:b/>
+          <w:bCs/>
+        </w:rPr>
+        <w:t>Lógica</w:t>
+      </w:r>
+      <w:proofErr w:type="spellEnd"/>
+      <w:r>
+        <w:rPr>
+          <w:b/>
+          <w:bCs/>
+        </w:rPr>
+        <w:t>:</w:t>
+      </w:r>
+      <w:r>
+        <w:t xml:space="preserve"> Se </w:t>
+      </w:r>
+      <w:proofErr w:type="spellStart"/>
+      <w:r>
+        <w:t>implementó</w:t>
+      </w:r>
+      <w:proofErr w:type="spellEnd"/>
+      <w:r>
+        <w:t xml:space="preserve"> </w:t>
+      </w:r>
+      <w:proofErr w:type="spellStart"/>
+      <w:r>
+        <w:t>el</w:t>
+      </w:r>
+      <w:proofErr w:type="spellEnd"/>
+      <w:r>
+        <w:t xml:space="preserve"> "Soft Delete". Si un </w:t>
+      </w:r>
+      <w:proofErr w:type="spellStart"/>
+      <w:r>
+        <w:t>usuario</w:t>
+      </w:r>
+      <w:proofErr w:type="spellEnd"/>
+      <w:r>
+        <w:t xml:space="preserve"> borra un </w:t>
+      </w:r>
+      <w:proofErr w:type="spellStart"/>
+      <w:r>
+        <w:t>cliente</w:t>
+      </w:r>
+      <w:proofErr w:type="spellEnd"/>
+      <w:r>
+        <w:t xml:space="preserve">, </w:t>
+      </w:r>
+      <w:proofErr w:type="spellStart"/>
+      <w:r>
+        <w:t>este</w:t>
+      </w:r>
+      <w:proofErr w:type="spellEnd"/>
+      <w:r>
+        <w:t xml:space="preserve"> </w:t>
+      </w:r>
+      <w:proofErr w:type="spellStart"/>
+      <w:r>
+        <w:t>desaparece</w:t>
+      </w:r>
+      <w:proofErr w:type="spellEnd"/>
+      <w:r>
+        <w:t xml:space="preserve"> de la vista </w:t>
+      </w:r>
+      <w:proofErr w:type="spellStart"/>
+      <w:r>
+        <w:t>comercial</w:t>
+      </w:r>
+      <w:proofErr w:type="spellEnd"/>
+      <w:r>
+        <w:t xml:space="preserve"> </w:t>
+      </w:r>
+      <w:proofErr w:type="spellStart"/>
+      <w:r>
+        <w:t>pero</w:t>
+      </w:r>
+      <w:proofErr w:type="spellEnd"/>
+      <w:r>
+        <w:t xml:space="preserve"> </w:t>
+      </w:r>
+      <w:proofErr w:type="spellStart"/>
+      <w:r>
+        <w:t>permanece</w:t>
+      </w:r>
+      <w:proofErr w:type="spellEnd"/>
+      <w:r>
+        <w:t xml:space="preserve"> </w:t>
+      </w:r>
+      <w:proofErr w:type="spellStart"/>
+      <w:r>
+        <w:t>en</w:t>
+      </w:r>
+      <w:proofErr w:type="spellEnd"/>
+      <w:r>
+        <w:t xml:space="preserve"> la base de </w:t>
+      </w:r>
+      <w:proofErr w:type="spellStart"/>
+      <w:r>
+        <w:t>datos</w:t>
+      </w:r>
+      <w:proofErr w:type="spellEnd"/>
+      <w:r>
+        <w:t xml:space="preserve"> para no romper </w:t>
+      </w:r>
+      <w:proofErr w:type="spellStart"/>
+      <w:r>
+        <w:t>el</w:t>
+      </w:r>
+      <w:proofErr w:type="spellEnd"/>
+      <w:r>
+        <w:t xml:space="preserve"> histórico de </w:t>
+      </w:r>
+      <w:proofErr w:type="spellStart"/>
+      <w:r>
+        <w:t>auditoría</w:t>
+      </w:r>
+      <w:proofErr w:type="spellEnd"/>
+      <w:r>
+        <w:t>.</w:t>
+      </w:r>
+    </w:p>
+    <w:p>
+      <w:pPr>
+        <w:rPr>
+          <w:b/>
+          <w:bCs/>
+        </w:rPr>
+      </w:pPr>
+      <w:r>
+        <w:rPr>
+          <w:rFonts w:ascii="Segoe UI Emoji" w:hAnsi="Segoe UI Emoji" w:cs="Segoe UI Emoji"/>
+          <w:b/>
+          <w:bCs/>
+        </w:rPr>
+        <w:t>✅</w:t>
+      </w:r>
+      <w:r>
+        <w:rPr>
+          <w:b/>
+          <w:bCs/>
+        </w:rPr>
+        <w:t xml:space="preserve"> Checklist de </w:t>
+      </w:r>
+      <w:proofErr w:type="spellStart"/>
+      <w:r>
+        <w:rPr>
+          <w:b/>
+          <w:bCs/>
+        </w:rPr>
+        <w:t>Criterios</w:t>
+      </w:r>
+      <w:proofErr w:type="spellEnd"/>
+      <w:r>
+        <w:rPr>
+          <w:b/>
+          <w:bCs/>
+        </w:rPr>
+        <w:t xml:space="preserve"> de </w:t>
+      </w:r>
+      <w:proofErr w:type="spellStart"/>
+      <w:r>
+        <w:rPr>
+          <w:b/>
+          <w:bCs/>
+        </w:rPr>
+        <w:t>Aceptación</w:t>
+      </w:r>
+      <w:proofErr w:type="spellEnd"/>
+    </w:p>
+    <w:p>
+      <w:pPr>
+        <w:numPr>
+          <w:ilvl w:val="0"/>
+          <w:numId w:val="19"/>
+        </w:numPr>
+      </w:pPr>
+      <w:r>
+        <w:t xml:space="preserve">[x] </w:t>
+      </w:r>
+      <w:proofErr w:type="spellStart"/>
+      <w:r>
+        <w:rPr>
+          <w:b/>
+          <w:bCs/>
+        </w:rPr>
+        <w:t>Creación</w:t>
+      </w:r>
+      <w:proofErr w:type="spellEnd"/>
+      <w:r>
+        <w:rPr>
+          <w:b/>
+          <w:bCs/>
+        </w:rPr>
+        <w:t>:</w:t>
+      </w:r>
+      <w:r>
+        <w:t xml:space="preserve"> </w:t>
+      </w:r>
+      <w:proofErr w:type="spellStart"/>
+      <w:r>
+        <w:t>Validada</w:t>
+      </w:r>
+      <w:proofErr w:type="spellEnd"/>
+      <w:r>
+        <w:t xml:space="preserve"> con </w:t>
+      </w:r>
+      <w:proofErr w:type="spellStart"/>
+      <w:r>
+        <w:t>éxito</w:t>
+      </w:r>
+      <w:proofErr w:type="spellEnd"/>
+      <w:r>
+        <w:t xml:space="preserve"> </w:t>
+      </w:r>
+      <w:proofErr w:type="spellStart"/>
+      <w:r>
+        <w:t>mediante</w:t>
+      </w:r>
+      <w:proofErr w:type="spellEnd"/>
+      <w:r>
+        <w:t xml:space="preserve"> POST.</w:t>
+      </w:r>
+    </w:p>
+    <w:p>
+      <w:pPr>
+        <w:numPr>
+          <w:ilvl w:val="0"/>
+          <w:numId w:val="19"/>
+        </w:numPr>
+      </w:pPr>
+      <w:r>
+        <w:t xml:space="preserve">[x] </w:t>
+      </w:r>
+      <w:r>
+        <w:rPr>
+          <w:b/>
+          <w:bCs/>
+        </w:rPr>
+        <w:t>Consulta:</w:t>
+      </w:r>
+      <w:r>
+        <w:t xml:space="preserve"> </w:t>
+      </w:r>
+      <w:proofErr w:type="spellStart"/>
+      <w:r>
+        <w:t>Funcionando</w:t>
+      </w:r>
+      <w:proofErr w:type="spellEnd"/>
+      <w:r>
+        <w:t xml:space="preserve"> (Falta </w:t>
+      </w:r>
+      <w:proofErr w:type="spellStart"/>
+      <w:r>
+        <w:t>pulir</w:t>
+      </w:r>
+      <w:proofErr w:type="spellEnd"/>
+      <w:r>
+        <w:t xml:space="preserve"> </w:t>
+      </w:r>
+      <w:proofErr w:type="spellStart"/>
+      <w:r>
+        <w:t>filtros</w:t>
+      </w:r>
+      <w:proofErr w:type="spellEnd"/>
+      <w:r>
+        <w:t xml:space="preserve"> </w:t>
+      </w:r>
+      <w:proofErr w:type="spellStart"/>
+      <w:r>
+        <w:t>dinámicos</w:t>
+      </w:r>
+      <w:proofErr w:type="spellEnd"/>
+      <w:r>
+        <w:t>).</w:t>
+      </w:r>
+    </w:p>
+    <w:p>
+      <w:pPr>
+        <w:numPr>
+          <w:ilvl w:val="0"/>
+          <w:numId w:val="19"/>
+        </w:numPr>
+      </w:pPr>
+      <w:r>
+        <w:t xml:space="preserve">[x] </w:t>
+      </w:r>
+      <w:proofErr w:type="spellStart"/>
+      <w:r>
+        <w:rPr>
+          <w:b/>
+          <w:bCs/>
+        </w:rPr>
+        <w:t>Actualización</w:t>
+      </w:r>
+      <w:proofErr w:type="spellEnd"/>
+      <w:r>
+        <w:rPr>
+          <w:b/>
+          <w:bCs/>
+        </w:rPr>
+        <w:t>:</w:t>
+      </w:r>
+      <w:r>
+        <w:t xml:space="preserve"> </w:t>
+      </w:r>
+      <w:proofErr w:type="spellStart"/>
+      <w:r>
+        <w:t>Implementada</w:t>
+      </w:r>
+      <w:proofErr w:type="spellEnd"/>
+      <w:r>
+        <w:t xml:space="preserve"> </w:t>
+      </w:r>
+      <w:proofErr w:type="spellStart"/>
+      <w:r>
+        <w:t>mediante</w:t>
+      </w:r>
+      <w:proofErr w:type="spellEnd"/>
+      <w:r>
+        <w:t xml:space="preserve"> PATCH (</w:t>
+      </w:r>
+      <w:proofErr w:type="spellStart"/>
+      <w:r>
+        <w:t>actualización</w:t>
+      </w:r>
+      <w:proofErr w:type="spellEnd"/>
+      <w:r>
+        <w:t xml:space="preserve"> </w:t>
+      </w:r>
+      <w:proofErr w:type="spellStart"/>
+      <w:r>
+        <w:t>parcial</w:t>
+      </w:r>
+      <w:proofErr w:type="spellEnd"/>
+      <w:r>
+        <w:t>).</w:t>
+      </w:r>
+    </w:p>
+    <w:p>
+      <w:pPr>
+        <w:numPr>
+          <w:ilvl w:val="0"/>
+          <w:numId w:val="19"/>
+        </w:numPr>
+      </w:pPr>
+      <w:r>
+        <w:t xml:space="preserve">[x] </w:t>
+      </w:r>
+      <w:proofErr w:type="spellStart"/>
+      <w:r>
+        <w:rPr>
+          <w:b/>
+          <w:bCs/>
+        </w:rPr>
+        <w:t>Eliminación</w:t>
+      </w:r>
+      <w:proofErr w:type="spellEnd"/>
+      <w:r>
+        <w:rPr>
+          <w:b/>
+          <w:bCs/>
+        </w:rPr>
+        <w:t>:</w:t>
+      </w:r>
+      <w:r>
+        <w:t xml:space="preserve"> </w:t>
+      </w:r>
+      <w:proofErr w:type="spellStart"/>
+      <w:r>
+        <w:t>Implementada</w:t>
+      </w:r>
+      <w:proofErr w:type="spellEnd"/>
+      <w:r>
+        <w:t xml:space="preserve"> </w:t>
+      </w:r>
+      <w:proofErr w:type="spellStart"/>
+      <w:r>
+        <w:t>como</w:t>
+      </w:r>
+      <w:proofErr w:type="spellEnd"/>
+      <w:r>
+        <w:t xml:space="preserve"> </w:t>
+      </w:r>
+      <w:proofErr w:type="spellStart"/>
+      <w:r>
+        <w:t>desactivación</w:t>
+      </w:r>
+      <w:proofErr w:type="spellEnd"/>
+      <w:r>
+        <w:t xml:space="preserve"> de </w:t>
+      </w:r>
+      <w:proofErr w:type="spellStart"/>
+      <w:r>
+        <w:t>estado</w:t>
+      </w:r>
+      <w:proofErr w:type="spellEnd"/>
+      <w:r>
+        <w:t>.</w:t>
+      </w:r>
+    </w:p>
+    <w:p>
+      <w:r>
+        <w:pict w14:anchorId="0D1FC055">
+          <v:rect id="_x0000_i1048" style="width:0;height:1.5pt" o:hralign="center" o:hrstd="t" o:hrnoshade="t" o:hr="t" fillcolor="gray" stroked="f"/>
+        </w:pict>
+      </w:r>
+    </w:p>
+    <w:p>
+      <w:r>
+        <w:rPr>
+          <w:b/>
+          <w:bCs/>
+        </w:rPr>
+        <w:t xml:space="preserve">¿Alejandro, </w:t>
+      </w:r>
+      <w:proofErr w:type="spellStart"/>
+      <w:r>
+        <w:rPr>
+          <w:b/>
+          <w:bCs/>
+        </w:rPr>
+        <w:t>prefieres</w:t>
+      </w:r>
+      <w:proofErr w:type="spellEnd"/>
+      <w:r>
+        <w:rPr>
+          <w:b/>
+          <w:bCs/>
+        </w:rPr>
+        <w:t xml:space="preserve"> </w:t>
+      </w:r>
+      <w:proofErr w:type="spellStart"/>
+      <w:r>
+        <w:rPr>
+          <w:b/>
+          <w:bCs/>
+        </w:rPr>
+        <w:t>que</w:t>
+      </w:r>
+      <w:proofErr w:type="spellEnd"/>
+      <w:r>
+        <w:rPr>
+          <w:b/>
+          <w:bCs/>
+        </w:rPr>
+        <w:t xml:space="preserve"> </w:t>
+      </w:r>
+      <w:proofErr w:type="spellStart"/>
+      <w:r>
+        <w:rPr>
+          <w:b/>
+          <w:bCs/>
+        </w:rPr>
+        <w:t>ajustemos</w:t>
+      </w:r>
+      <w:proofErr w:type="spellEnd"/>
+      <w:r>
+        <w:rPr>
+          <w:b/>
+          <w:bCs/>
+        </w:rPr>
+        <w:t xml:space="preserve"> de </w:t>
+      </w:r>
+      <w:proofErr w:type="spellStart"/>
+      <w:r>
+        <w:rPr>
+          <w:b/>
+          <w:bCs/>
+        </w:rPr>
+        <w:t>una</w:t>
+      </w:r>
+      <w:proofErr w:type="spellEnd"/>
+      <w:r>
+        <w:rPr>
+          <w:b/>
+          <w:bCs/>
+        </w:rPr>
+        <w:t xml:space="preserve"> </w:t>
+      </w:r>
+      <w:proofErr w:type="spellStart"/>
+      <w:r>
+        <w:rPr>
+          <w:b/>
+          <w:bCs/>
+        </w:rPr>
+        <w:t>vez</w:t>
+      </w:r>
+      <w:proofErr w:type="spellEnd"/>
+      <w:r>
+        <w:rPr>
+          <w:b/>
+          <w:bCs/>
+        </w:rPr>
+        <w:t xml:space="preserve"> </w:t>
+      </w:r>
+      <w:proofErr w:type="spellStart"/>
+      <w:r>
+        <w:rPr>
+          <w:b/>
+          <w:bCs/>
+        </w:rPr>
+        <w:t>los</w:t>
+      </w:r>
+      <w:proofErr w:type="spellEnd"/>
+      <w:r>
+        <w:rPr>
+          <w:b/>
+          <w:bCs/>
+        </w:rPr>
+        <w:t xml:space="preserve"> </w:t>
+      </w:r>
+      <w:proofErr w:type="spellStart"/>
+      <w:r>
+        <w:rPr>
+          <w:b/>
+          <w:bCs/>
+        </w:rPr>
+        <w:t>filtros</w:t>
+      </w:r>
+      <w:proofErr w:type="spellEnd"/>
+      <w:r>
+        <w:rPr>
+          <w:b/>
+          <w:bCs/>
+        </w:rPr>
+        <w:t xml:space="preserve"> de </w:t>
+      </w:r>
+      <w:proofErr w:type="spellStart"/>
+      <w:r>
+        <w:rPr>
+          <w:b/>
+          <w:bCs/>
+        </w:rPr>
+        <w:t>búsqueda</w:t>
+      </w:r>
+      <w:proofErr w:type="spellEnd"/>
+      <w:r>
+        <w:rPr>
+          <w:b/>
+          <w:bCs/>
+        </w:rPr>
+        <w:t xml:space="preserve"> (Nombre/Ciudad) o </w:t>
+      </w:r>
+      <w:proofErr w:type="spellStart"/>
+      <w:r>
+        <w:rPr>
+          <w:b/>
+          <w:bCs/>
+        </w:rPr>
+        <w:t>dejamos</w:t>
+      </w:r>
+      <w:proofErr w:type="spellEnd"/>
+      <w:r>
+        <w:rPr>
+          <w:b/>
+          <w:bCs/>
+        </w:rPr>
+        <w:t xml:space="preserve"> </w:t>
+      </w:r>
+      <w:proofErr w:type="spellStart"/>
+      <w:r>
+        <w:rPr>
+          <w:b/>
+          <w:bCs/>
+        </w:rPr>
+        <w:t>así</w:t>
+      </w:r>
+      <w:proofErr w:type="spellEnd"/>
+      <w:r>
+        <w:rPr>
+          <w:b/>
+          <w:bCs/>
+        </w:rPr>
+        <w:t xml:space="preserve"> la HU-005 y </w:t>
+      </w:r>
+      <w:proofErr w:type="spellStart"/>
+      <w:r>
+        <w:rPr>
+          <w:b/>
+          <w:bCs/>
+        </w:rPr>
+        <w:t>saltamos</w:t>
+      </w:r>
+      <w:proofErr w:type="spellEnd"/>
+      <w:r>
+        <w:rPr>
+          <w:b/>
+          <w:bCs/>
+        </w:rPr>
+        <w:t xml:space="preserve"> a la </w:t>
+      </w:r>
+      <w:proofErr w:type="spellStart"/>
+      <w:r>
+        <w:rPr>
+          <w:b/>
+          <w:bCs/>
+        </w:rPr>
+        <w:t>siguiente</w:t>
+      </w:r>
+      <w:proofErr w:type="spellEnd"/>
+      <w:r>
+        <w:rPr>
+          <w:b/>
+          <w:bCs/>
+        </w:rPr>
+        <w:t>?</w:t>
       </w:r>
     </w:p>
     <w:p>
@@ -5934,6 +8269,304 @@
 <file path=word/numbering.xml><?xml version="1.0" encoding="utf-8"?>
 <w:numbering xmlns:wpc="http://schemas.microsoft.com/office/word/2010/wordprocessingCanvas" xmlns:cx="http://schemas.microsoft.com/office/drawing/2014/chartex" xmlns:cx1="http://schemas.microsoft.com/office/drawing/2015/9/8/chartex" xmlns:cx2="http://schemas.microsoft.com/office/drawing/2015/10/21/chartex" xmlns:cx3="http://schemas.microsoft.com/office/drawing/2016/5/9/chartex" xmlns:cx4="http://schemas.microsoft.com/office/drawing/2016/5/10/chartex" xmlns:cx5="http://schemas.microsoft.com/office/drawing/2016/5/11/chartex" xmlns:cx6="http://schemas.microsoft.com/office/drawing/2016/5/12/chartex" xmlns:cx7="http://schemas.microsoft.com/office/drawing/2016/5/13/chartex" xmlns:cx8="http://schemas.microsoft.com/office/drawing/2016/5/14/chartex" xmlns:mc="http://schemas.openxmlformats.org/markup-compatibility/2006" xmlns:aink="http://schemas.microsoft.com/office/drawing/2016/ink" xmlns:am3d="http://schemas.microsoft.com/office/drawing/2017/model3d" xmlns:o="urn:schemas-microsoft-com:office:office" xmlns:oel="http://schemas.microsoft.com/office/2019/extlst" xmlns:r="http://schemas.openxmlformats.org/officeDocument/2006/relationships" xmlns:m="http://schemas.openxmlformats.org/officeDocument/2006/math" xmlns:v="urn:schemas-microsoft-com:vml" xmlns:wp14="http://schemas.microsoft.com/office/word/2010/wordprocessingDrawing" xmlns:wp="http://schemas.openxmlformats.org/drawingml/2006/wordprocessingDrawing" xmlns:w10="urn:schemas-microsoft-com:office:word" xmlns:w="http://schemas.openxmlformats.org/wordprocessingml/2006/main" xmlns:w14="http://schemas.microsoft.com/office/word/2010/wordml" xmlns:w15="http://schemas.microsoft.com/office/word/2012/wordml" xmlns:w16cex="http://schemas.microsoft.com/office/word/2018/wordml/cex" xmlns:w16cid="http://schemas.microsoft.com/office/word/2016/wordml/cid" xmlns:w16="http://schemas.microsoft.com/office/word/2018/wordml" xmlns:w16du="http://schemas.microsoft.com/office/word/2023/wordml/word16du" xmlns:w16sdtdh="http://schemas.microsoft.com/office/word/2020/wordml/sdtdatahash" xmlns:w16sdtfl="http://schemas.microsoft.com/office/word/2024/wordml/sdtformatlock" xmlns:w16se="http://schemas.microsoft.com/office/word/2015/wordml/symex" xmlns:wpg="http://schemas.microsoft.com/office/word/2010/wordprocessingGroup" xmlns:wpi="http://schemas.microsoft.com/office/word/2010/wordprocessingInk" xmlns:wne="http://schemas.microsoft.com/office/word/2006/wordml" xmlns:wps="http://schemas.microsoft.com/office/word/2010/wordprocessingShape" mc:Ignorable="w14 w15 w16se w16cid w16 w16cex w16sdtdh w16sdtfl w16du wp14">
   <w:abstractNum w:abstractNumId="0" w15:restartNumberingAfterBreak="0">
+    <w:nsid w:val="0885199E"/>
+    <w:multiLevelType w:val="multilevel"/>
+    <w:tmpl w:val="039A967C"/>
+    <w:lvl w:ilvl="0">
+      <w:start w:val="1"/>
+      <w:numFmt w:val="bullet"/>
+      <w:lvlText w:val=""/>
+      <w:lvlJc w:val="left"/>
+      <w:pPr>
+        <w:tabs>
+          <w:tab w:val="num" w:pos="720"/>
+        </w:tabs>
+        <w:ind w:left="720" w:hanging="360"/>
+      </w:pPr>
+      <w:rPr>
+        <w:rFonts w:ascii="Symbol" w:hAnsi="Symbol" w:hint="default"/>
+        <w:sz w:val="20"/>
+      </w:rPr>
+    </w:lvl>
+    <w:lvl w:ilvl="1" w:tentative="1">
+      <w:start w:val="1"/>
+      <w:numFmt w:val="bullet"/>
+      <w:lvlText w:val="o"/>
+      <w:lvlJc w:val="left"/>
+      <w:pPr>
+        <w:tabs>
+          <w:tab w:val="num" w:pos="1440"/>
+        </w:tabs>
+        <w:ind w:left="1440" w:hanging="360"/>
+      </w:pPr>
+      <w:rPr>
+        <w:rFonts w:ascii="Courier New" w:hAnsi="Courier New" w:hint="default"/>
+        <w:sz w:val="20"/>
+      </w:rPr>
+    </w:lvl>
+    <w:lvl w:ilvl="2" w:tentative="1">
+      <w:start w:val="1"/>
+      <w:numFmt w:val="bullet"/>
+      <w:lvlText w:val=""/>
+      <w:lvlJc w:val="left"/>
+      <w:pPr>
+        <w:tabs>
+          <w:tab w:val="num" w:pos="2160"/>
+        </w:tabs>
+        <w:ind w:left="2160" w:hanging="360"/>
+      </w:pPr>
+      <w:rPr>
+        <w:rFonts w:ascii="Wingdings" w:hAnsi="Wingdings" w:hint="default"/>
+        <w:sz w:val="20"/>
+      </w:rPr>
+    </w:lvl>
+    <w:lvl w:ilvl="3" w:tentative="1">
+      <w:start w:val="1"/>
+      <w:numFmt w:val="bullet"/>
+      <w:lvlText w:val=""/>
+      <w:lvlJc w:val="left"/>
+      <w:pPr>
+        <w:tabs>
+          <w:tab w:val="num" w:pos="2880"/>
+        </w:tabs>
+        <w:ind w:left="2880" w:hanging="360"/>
+      </w:pPr>
+      <w:rPr>
+        <w:rFonts w:ascii="Wingdings" w:hAnsi="Wingdings" w:hint="default"/>
+        <w:sz w:val="20"/>
+      </w:rPr>
+    </w:lvl>
+    <w:lvl w:ilvl="4" w:tentative="1">
+      <w:start w:val="1"/>
+      <w:numFmt w:val="bullet"/>
+      <w:lvlText w:val=""/>
+      <w:lvlJc w:val="left"/>
+      <w:pPr>
+        <w:tabs>
+          <w:tab w:val="num" w:pos="3600"/>
+        </w:tabs>
+        <w:ind w:left="3600" w:hanging="360"/>
+      </w:pPr>
+      <w:rPr>
+        <w:rFonts w:ascii="Wingdings" w:hAnsi="Wingdings" w:hint="default"/>
+        <w:sz w:val="20"/>
+      </w:rPr>
+    </w:lvl>
+    <w:lvl w:ilvl="5" w:tentative="1">
+      <w:start w:val="1"/>
+      <w:numFmt w:val="bullet"/>
+      <w:lvlText w:val=""/>
+      <w:lvlJc w:val="left"/>
+      <w:pPr>
+        <w:tabs>
+          <w:tab w:val="num" w:pos="4320"/>
+        </w:tabs>
+        <w:ind w:left="4320" w:hanging="360"/>
+      </w:pPr>
+      <w:rPr>
+        <w:rFonts w:ascii="Wingdings" w:hAnsi="Wingdings" w:hint="default"/>
+        <w:sz w:val="20"/>
+      </w:rPr>
+    </w:lvl>
+    <w:lvl w:ilvl="6" w:tentative="1">
+      <w:start w:val="1"/>
+      <w:numFmt w:val="bullet"/>
+      <w:lvlText w:val=""/>
+      <w:lvlJc w:val="left"/>
+      <w:pPr>
+        <w:tabs>
+          <w:tab w:val="num" w:pos="5040"/>
+        </w:tabs>
+        <w:ind w:left="5040" w:hanging="360"/>
+      </w:pPr>
+      <w:rPr>
+        <w:rFonts w:ascii="Wingdings" w:hAnsi="Wingdings" w:hint="default"/>
+        <w:sz w:val="20"/>
+      </w:rPr>
+    </w:lvl>
+    <w:lvl w:ilvl="7" w:tentative="1">
+      <w:start w:val="1"/>
+      <w:numFmt w:val="bullet"/>
+      <w:lvlText w:val=""/>
+      <w:lvlJc w:val="left"/>
+      <w:pPr>
+        <w:tabs>
+          <w:tab w:val="num" w:pos="5760"/>
+        </w:tabs>
+        <w:ind w:left="5760" w:hanging="360"/>
+      </w:pPr>
+      <w:rPr>
+        <w:rFonts w:ascii="Wingdings" w:hAnsi="Wingdings" w:hint="default"/>
+        <w:sz w:val="20"/>
+      </w:rPr>
+    </w:lvl>
+    <w:lvl w:ilvl="8" w:tentative="1">
+      <w:start w:val="1"/>
+      <w:numFmt w:val="bullet"/>
+      <w:lvlText w:val=""/>
+      <w:lvlJc w:val="left"/>
+      <w:pPr>
+        <w:tabs>
+          <w:tab w:val="num" w:pos="6480"/>
+        </w:tabs>
+        <w:ind w:left="6480" w:hanging="360"/>
+      </w:pPr>
+      <w:rPr>
+        <w:rFonts w:ascii="Wingdings" w:hAnsi="Wingdings" w:hint="default"/>
+        <w:sz w:val="20"/>
+      </w:rPr>
+    </w:lvl>
+  </w:abstractNum>
+  <w:abstractNum w:abstractNumId="1" w15:restartNumberingAfterBreak="0">
+    <w:nsid w:val="0E0F0BF4"/>
+    <w:multiLevelType w:val="multilevel"/>
+    <w:tmpl w:val="7EFAB3E4"/>
+    <w:lvl w:ilvl="0">
+      <w:start w:val="1"/>
+      <w:numFmt w:val="bullet"/>
+      <w:lvlText w:val=""/>
+      <w:lvlJc w:val="left"/>
+      <w:pPr>
+        <w:tabs>
+          <w:tab w:val="num" w:pos="720"/>
+        </w:tabs>
+        <w:ind w:left="720" w:hanging="360"/>
+      </w:pPr>
+      <w:rPr>
+        <w:rFonts w:ascii="Symbol" w:hAnsi="Symbol" w:hint="default"/>
+        <w:sz w:val="20"/>
+      </w:rPr>
+    </w:lvl>
+    <w:lvl w:ilvl="1" w:tentative="1">
+      <w:start w:val="1"/>
+      <w:numFmt w:val="bullet"/>
+      <w:lvlText w:val="o"/>
+      <w:lvlJc w:val="left"/>
+      <w:pPr>
+        <w:tabs>
+          <w:tab w:val="num" w:pos="1440"/>
+        </w:tabs>
+        <w:ind w:left="1440" w:hanging="360"/>
+      </w:pPr>
+      <w:rPr>
+        <w:rFonts w:ascii="Courier New" w:hAnsi="Courier New" w:hint="default"/>
+        <w:sz w:val="20"/>
+      </w:rPr>
+    </w:lvl>
+    <w:lvl w:ilvl="2" w:tentative="1">
+      <w:start w:val="1"/>
+      <w:numFmt w:val="bullet"/>
+      <w:lvlText w:val=""/>
+      <w:lvlJc w:val="left"/>
+      <w:pPr>
+        <w:tabs>
+          <w:tab w:val="num" w:pos="2160"/>
+        </w:tabs>
+        <w:ind w:left="2160" w:hanging="360"/>
+      </w:pPr>
+      <w:rPr>
+        <w:rFonts w:ascii="Wingdings" w:hAnsi="Wingdings" w:hint="default"/>
+        <w:sz w:val="20"/>
+      </w:rPr>
+    </w:lvl>
+    <w:lvl w:ilvl="3" w:tentative="1">
+      <w:start w:val="1"/>
+      <w:numFmt w:val="bullet"/>
+      <w:lvlText w:val=""/>
+      <w:lvlJc w:val="left"/>
+      <w:pPr>
+        <w:tabs>
+          <w:tab w:val="num" w:pos="2880"/>
+        </w:tabs>
+        <w:ind w:left="2880" w:hanging="360"/>
+      </w:pPr>
+      <w:rPr>
+        <w:rFonts w:ascii="Wingdings" w:hAnsi="Wingdings" w:hint="default"/>
+        <w:sz w:val="20"/>
+      </w:rPr>
+    </w:lvl>
+    <w:lvl w:ilvl="4" w:tentative="1">
+      <w:start w:val="1"/>
+      <w:numFmt w:val="bullet"/>
+      <w:lvlText w:val=""/>
+      <w:lvlJc w:val="left"/>
+      <w:pPr>
+        <w:tabs>
+          <w:tab w:val="num" w:pos="3600"/>
+        </w:tabs>
+        <w:ind w:left="3600" w:hanging="360"/>
+      </w:pPr>
+      <w:rPr>
+        <w:rFonts w:ascii="Wingdings" w:hAnsi="Wingdings" w:hint="default"/>
+        <w:sz w:val="20"/>
+      </w:rPr>
+    </w:lvl>
+    <w:lvl w:ilvl="5" w:tentative="1">
+      <w:start w:val="1"/>
+      <w:numFmt w:val="bullet"/>
+      <w:lvlText w:val=""/>
+      <w:lvlJc w:val="left"/>
+      <w:pPr>
+        <w:tabs>
+          <w:tab w:val="num" w:pos="4320"/>
+        </w:tabs>
+        <w:ind w:left="4320" w:hanging="360"/>
+      </w:pPr>
+      <w:rPr>
+        <w:rFonts w:ascii="Wingdings" w:hAnsi="Wingdings" w:hint="default"/>
+        <w:sz w:val="20"/>
+      </w:rPr>
+    </w:lvl>
+    <w:lvl w:ilvl="6" w:tentative="1">
+      <w:start w:val="1"/>
+      <w:numFmt w:val="bullet"/>
+      <w:lvlText w:val=""/>
+      <w:lvlJc w:val="left"/>
+      <w:pPr>
+        <w:tabs>
+          <w:tab w:val="num" w:pos="5040"/>
+        </w:tabs>
+        <w:ind w:left="5040" w:hanging="360"/>
+      </w:pPr>
+      <w:rPr>
+        <w:rFonts w:ascii="Wingdings" w:hAnsi="Wingdings" w:hint="default"/>
+        <w:sz w:val="20"/>
+      </w:rPr>
+    </w:lvl>
+    <w:lvl w:ilvl="7" w:tentative="1">
+      <w:start w:val="1"/>
+      <w:numFmt w:val="bullet"/>
+      <w:lvlText w:val=""/>
+      <w:lvlJc w:val="left"/>
+      <w:pPr>
+        <w:tabs>
+          <w:tab w:val="num" w:pos="5760"/>
+        </w:tabs>
+        <w:ind w:left="5760" w:hanging="360"/>
+      </w:pPr>
+      <w:rPr>
+        <w:rFonts w:ascii="Wingdings" w:hAnsi="Wingdings" w:hint="default"/>
+        <w:sz w:val="20"/>
+      </w:rPr>
+    </w:lvl>
+    <w:lvl w:ilvl="8" w:tentative="1">
+      <w:start w:val="1"/>
+      <w:numFmt w:val="bullet"/>
+      <w:lvlText w:val=""/>
+      <w:lvlJc w:val="left"/>
+      <w:pPr>
+        <w:tabs>
+          <w:tab w:val="num" w:pos="6480"/>
+        </w:tabs>
+        <w:ind w:left="6480" w:hanging="360"/>
+      </w:pPr>
+      <w:rPr>
+        <w:rFonts w:ascii="Wingdings" w:hAnsi="Wingdings" w:hint="default"/>
+        <w:sz w:val="20"/>
+      </w:rPr>
+    </w:lvl>
+  </w:abstractNum>
+  <w:abstractNum w:abstractNumId="2" w15:restartNumberingAfterBreak="0">
     <w:nsid w:val="1E695712"/>
     <w:multiLevelType w:val="multilevel"/>
     <w:tmpl w:val="05E8D97A"/>
@@ -6082,7 +8715,7 @@
       </w:rPr>
     </w:lvl>
   </w:abstractNum>
-  <w:abstractNum w:abstractNumId="1" w15:restartNumberingAfterBreak="0">
+  <w:abstractNum w:abstractNumId="3" w15:restartNumberingAfterBreak="0">
     <w:nsid w:val="20BA2A50"/>
     <w:multiLevelType w:val="multilevel"/>
     <w:tmpl w:val="00B6B176"/>
@@ -6231,7 +8864,7 @@
       </w:rPr>
     </w:lvl>
   </w:abstractNum>
-  <w:abstractNum w:abstractNumId="2" w15:restartNumberingAfterBreak="0">
+  <w:abstractNum w:abstractNumId="4" w15:restartNumberingAfterBreak="0">
     <w:nsid w:val="257A78F6"/>
     <w:multiLevelType w:val="multilevel"/>
     <w:tmpl w:val="9F783722"/>
@@ -6380,7 +9013,7 @@
       </w:rPr>
     </w:lvl>
   </w:abstractNum>
-  <w:abstractNum w:abstractNumId="3" w15:restartNumberingAfterBreak="0">
+  <w:abstractNum w:abstractNumId="5" w15:restartNumberingAfterBreak="0">
     <w:nsid w:val="26636A50"/>
     <w:multiLevelType w:val="multilevel"/>
     <w:tmpl w:val="ADE005AE"/>
@@ -6529,7 +9162,269 @@
       </w:rPr>
     </w:lvl>
   </w:abstractNum>
-  <w:abstractNum w:abstractNumId="4" w15:restartNumberingAfterBreak="0">
+  <w:abstractNum w:abstractNumId="6" w15:restartNumberingAfterBreak="0">
+    <w:nsid w:val="2E0813BE"/>
+    <w:multiLevelType w:val="multilevel"/>
+    <w:tmpl w:val="376A6BA4"/>
+    <w:lvl w:ilvl="0">
+      <w:start w:val="1"/>
+      <w:numFmt w:val="bullet"/>
+      <w:lvlText w:val=""/>
+      <w:lvlJc w:val="left"/>
+      <w:pPr>
+        <w:tabs>
+          <w:tab w:val="num" w:pos="720"/>
+        </w:tabs>
+        <w:ind w:left="720" w:hanging="360"/>
+      </w:pPr>
+      <w:rPr>
+        <w:rFonts w:ascii="Symbol" w:hAnsi="Symbol" w:hint="default"/>
+        <w:sz w:val="20"/>
+      </w:rPr>
+    </w:lvl>
+    <w:lvl w:ilvl="1" w:tentative="1">
+      <w:start w:val="1"/>
+      <w:numFmt w:val="bullet"/>
+      <w:lvlText w:val="o"/>
+      <w:lvlJc w:val="left"/>
+      <w:pPr>
+        <w:tabs>
+          <w:tab w:val="num" w:pos="1440"/>
+        </w:tabs>
+        <w:ind w:left="1440" w:hanging="360"/>
+      </w:pPr>
+      <w:rPr>
+        <w:rFonts w:ascii="Courier New" w:hAnsi="Courier New" w:hint="default"/>
+        <w:sz w:val="20"/>
+      </w:rPr>
+    </w:lvl>
+    <w:lvl w:ilvl="2" w:tentative="1">
+      <w:start w:val="1"/>
+      <w:numFmt w:val="bullet"/>
+      <w:lvlText w:val=""/>
+      <w:lvlJc w:val="left"/>
+      <w:pPr>
+        <w:tabs>
+          <w:tab w:val="num" w:pos="2160"/>
+        </w:tabs>
+        <w:ind w:left="2160" w:hanging="360"/>
+      </w:pPr>
+      <w:rPr>
+        <w:rFonts w:ascii="Wingdings" w:hAnsi="Wingdings" w:hint="default"/>
+        <w:sz w:val="20"/>
+      </w:rPr>
+    </w:lvl>
+    <w:lvl w:ilvl="3" w:tentative="1">
+      <w:start w:val="1"/>
+      <w:numFmt w:val="bullet"/>
+      <w:lvlText w:val=""/>
+      <w:lvlJc w:val="left"/>
+      <w:pPr>
+        <w:tabs>
+          <w:tab w:val="num" w:pos="2880"/>
+        </w:tabs>
+        <w:ind w:left="2880" w:hanging="360"/>
+      </w:pPr>
+      <w:rPr>
+        <w:rFonts w:ascii="Wingdings" w:hAnsi="Wingdings" w:hint="default"/>
+        <w:sz w:val="20"/>
+      </w:rPr>
+    </w:lvl>
+    <w:lvl w:ilvl="4" w:tentative="1">
+      <w:start w:val="1"/>
+      <w:numFmt w:val="bullet"/>
+      <w:lvlText w:val=""/>
+      <w:lvlJc w:val="left"/>
+      <w:pPr>
+        <w:tabs>
+          <w:tab w:val="num" w:pos="3600"/>
+        </w:tabs>
+        <w:ind w:left="3600" w:hanging="360"/>
+      </w:pPr>
+      <w:rPr>
+        <w:rFonts w:ascii="Wingdings" w:hAnsi="Wingdings" w:hint="default"/>
+        <w:sz w:val="20"/>
+      </w:rPr>
+    </w:lvl>
+    <w:lvl w:ilvl="5" w:tentative="1">
+      <w:start w:val="1"/>
+      <w:numFmt w:val="bullet"/>
+      <w:lvlText w:val=""/>
+      <w:lvlJc w:val="left"/>
+      <w:pPr>
+        <w:tabs>
+          <w:tab w:val="num" w:pos="4320"/>
+        </w:tabs>
+        <w:ind w:left="4320" w:hanging="360"/>
+      </w:pPr>
+      <w:rPr>
+        <w:rFonts w:ascii="Wingdings" w:hAnsi="Wingdings" w:hint="default"/>
+        <w:sz w:val="20"/>
+      </w:rPr>
+    </w:lvl>
+    <w:lvl w:ilvl="6" w:tentative="1">
+      <w:start w:val="1"/>
+      <w:numFmt w:val="bullet"/>
+      <w:lvlText w:val=""/>
+      <w:lvlJc w:val="left"/>
+      <w:pPr>
+        <w:tabs>
+          <w:tab w:val="num" w:pos="5040"/>
+        </w:tabs>
+        <w:ind w:left="5040" w:hanging="360"/>
+      </w:pPr>
+      <w:rPr>
+        <w:rFonts w:ascii="Wingdings" w:hAnsi="Wingdings" w:hint="default"/>
+        <w:sz w:val="20"/>
+      </w:rPr>
+    </w:lvl>
+    <w:lvl w:ilvl="7" w:tentative="1">
+      <w:start w:val="1"/>
+      <w:numFmt w:val="bullet"/>
+      <w:lvlText w:val=""/>
+      <w:lvlJc w:val="left"/>
+      <w:pPr>
+        <w:tabs>
+          <w:tab w:val="num" w:pos="5760"/>
+        </w:tabs>
+        <w:ind w:left="5760" w:hanging="360"/>
+      </w:pPr>
+      <w:rPr>
+        <w:rFonts w:ascii="Wingdings" w:hAnsi="Wingdings" w:hint="default"/>
+        <w:sz w:val="20"/>
+      </w:rPr>
+    </w:lvl>
+    <w:lvl w:ilvl="8" w:tentative="1">
+      <w:start w:val="1"/>
+      <w:numFmt w:val="bullet"/>
+      <w:lvlText w:val=""/>
+      <w:lvlJc w:val="left"/>
+      <w:pPr>
+        <w:tabs>
+          <w:tab w:val="num" w:pos="6480"/>
+        </w:tabs>
+        <w:ind w:left="6480" w:hanging="360"/>
+      </w:pPr>
+      <w:rPr>
+        <w:rFonts w:ascii="Wingdings" w:hAnsi="Wingdings" w:hint="default"/>
+        <w:sz w:val="20"/>
+      </w:rPr>
+    </w:lvl>
+  </w:abstractNum>
+  <w:abstractNum w:abstractNumId="7" w15:restartNumberingAfterBreak="0">
+    <w:nsid w:val="32203DB8"/>
+    <w:multiLevelType w:val="multilevel"/>
+    <w:tmpl w:val="DF52E65A"/>
+    <w:lvl w:ilvl="0">
+      <w:start w:val="1"/>
+      <w:numFmt w:val="decimal"/>
+      <w:lvlText w:val="%1."/>
+      <w:lvlJc w:val="left"/>
+      <w:pPr>
+        <w:tabs>
+          <w:tab w:val="num" w:pos="720"/>
+        </w:tabs>
+        <w:ind w:left="720" w:hanging="360"/>
+      </w:pPr>
+    </w:lvl>
+    <w:lvl w:ilvl="1" w:tentative="1">
+      <w:start w:val="1"/>
+      <w:numFmt w:val="decimal"/>
+      <w:lvlText w:val="%2."/>
+      <w:lvlJc w:val="left"/>
+      <w:pPr>
+        <w:tabs>
+          <w:tab w:val="num" w:pos="1440"/>
+        </w:tabs>
+        <w:ind w:left="1440" w:hanging="360"/>
+      </w:pPr>
+    </w:lvl>
+    <w:lvl w:ilvl="2" w:tentative="1">
+      <w:start w:val="1"/>
+      <w:numFmt w:val="decimal"/>
+      <w:lvlText w:val="%3."/>
+      <w:lvlJc w:val="left"/>
+      <w:pPr>
+        <w:tabs>
+          <w:tab w:val="num" w:pos="2160"/>
+        </w:tabs>
+        <w:ind w:left="2160" w:hanging="360"/>
+      </w:pPr>
+    </w:lvl>
+    <w:lvl w:ilvl="3" w:tentative="1">
+      <w:start w:val="1"/>
+      <w:numFmt w:val="decimal"/>
+      <w:lvlText w:val="%4."/>
+      <w:lvlJc w:val="left"/>
+      <w:pPr>
+        <w:tabs>
+          <w:tab w:val="num" w:pos="2880"/>
+        </w:tabs>
+        <w:ind w:left="2880" w:hanging="360"/>
+      </w:pPr>
+    </w:lvl>
+    <w:lvl w:ilvl="4" w:tentative="1">
+      <w:start w:val="1"/>
+      <w:numFmt w:val="decimal"/>
+      <w:lvlText w:val="%5."/>
+      <w:lvlJc w:val="left"/>
+      <w:pPr>
+        <w:tabs>
+          <w:tab w:val="num" w:pos="3600"/>
+        </w:tabs>
+        <w:ind w:left="3600" w:hanging="360"/>
+      </w:pPr>
+    </w:lvl>
+    <w:lvl w:ilvl="5" w:tentative="1">
+      <w:start w:val="1"/>
+      <w:numFmt w:val="decimal"/>
+      <w:lvlText w:val="%6."/>
+      <w:lvlJc w:val="left"/>
+      <w:pPr>
+        <w:tabs>
+          <w:tab w:val="num" w:pos="4320"/>
+        </w:tabs>
+        <w:ind w:left="4320" w:hanging="360"/>
+      </w:pPr>
+    </w:lvl>
+    <w:lvl w:ilvl="6" w:tentative="1">
+      <w:start w:val="1"/>
+      <w:numFmt w:val="decimal"/>
+      <w:lvlText w:val="%7."/>
+      <w:lvlJc w:val="left"/>
+      <w:pPr>
+        <w:tabs>
+          <w:tab w:val="num" w:pos="5040"/>
+        </w:tabs>
+        <w:ind w:left="5040" w:hanging="360"/>
+      </w:pPr>
+    </w:lvl>
+    <w:lvl w:ilvl="7" w:tentative="1">
+      <w:start w:val="1"/>
+      <w:numFmt w:val="decimal"/>
+      <w:lvlText w:val="%8."/>
+      <w:lvlJc w:val="left"/>
+      <w:pPr>
+        <w:tabs>
+          <w:tab w:val="num" w:pos="5760"/>
+        </w:tabs>
+        <w:ind w:left="5760" w:hanging="360"/>
+      </w:pPr>
+    </w:lvl>
+    <w:lvl w:ilvl="8" w:tentative="1">
+      <w:start w:val="1"/>
+      <w:numFmt w:val="decimal"/>
+      <w:lvlText w:val="%9."/>
+      <w:lvlJc w:val="left"/>
+      <w:pPr>
+        <w:tabs>
+          <w:tab w:val="num" w:pos="6480"/>
+        </w:tabs>
+        <w:ind w:left="6480" w:hanging="360"/>
+      </w:pPr>
+    </w:lvl>
+  </w:abstractNum>
+  <w:abstractNum w:abstractNumId="8" w15:restartNumberingAfterBreak="0">
     <w:nsid w:val="3FBA1120"/>
     <w:multiLevelType w:val="multilevel"/>
     <w:tmpl w:val="4036A524"/>
@@ -6678,7 +9573,7 @@
       </w:rPr>
     </w:lvl>
   </w:abstractNum>
-  <w:abstractNum w:abstractNumId="5" w15:restartNumberingAfterBreak="0">
+  <w:abstractNum w:abstractNumId="9" w15:restartNumberingAfterBreak="0">
     <w:nsid w:val="43491087"/>
     <w:multiLevelType w:val="multilevel"/>
     <w:tmpl w:val="713A2978"/>
@@ -6827,7 +9722,7 @@
       </w:rPr>
     </w:lvl>
   </w:abstractNum>
-  <w:abstractNum w:abstractNumId="6" w15:restartNumberingAfterBreak="0">
+  <w:abstractNum w:abstractNumId="10" w15:restartNumberingAfterBreak="0">
     <w:nsid w:val="4A817672"/>
     <w:multiLevelType w:val="multilevel"/>
     <w:tmpl w:val="A9C0D8A8"/>
@@ -6976,7 +9871,7 @@
       </w:rPr>
     </w:lvl>
   </w:abstractNum>
-  <w:abstractNum w:abstractNumId="7" w15:restartNumberingAfterBreak="0">
+  <w:abstractNum w:abstractNumId="11" w15:restartNumberingAfterBreak="0">
     <w:nsid w:val="588D60D9"/>
     <w:multiLevelType w:val="multilevel"/>
     <w:tmpl w:val="70C47DF0"/>
@@ -7125,7 +10020,7 @@
       </w:rPr>
     </w:lvl>
   </w:abstractNum>
-  <w:abstractNum w:abstractNumId="8" w15:restartNumberingAfterBreak="0">
+  <w:abstractNum w:abstractNumId="12" w15:restartNumberingAfterBreak="0">
     <w:nsid w:val="590F530A"/>
     <w:multiLevelType w:val="multilevel"/>
     <w:tmpl w:val="F266DCF8"/>
@@ -7274,7 +10169,7 @@
       </w:rPr>
     </w:lvl>
   </w:abstractNum>
-  <w:abstractNum w:abstractNumId="9" w15:restartNumberingAfterBreak="0">
+  <w:abstractNum w:abstractNumId="13" w15:restartNumberingAfterBreak="0">
     <w:nsid w:val="5F411846"/>
     <w:multiLevelType w:val="multilevel"/>
     <w:tmpl w:val="F99A37E8"/>
@@ -7423,7 +10318,7 @@
       </w:rPr>
     </w:lvl>
   </w:abstractNum>
-  <w:abstractNum w:abstractNumId="10" w15:restartNumberingAfterBreak="0">
+  <w:abstractNum w:abstractNumId="14" w15:restartNumberingAfterBreak="0">
     <w:nsid w:val="68997650"/>
     <w:multiLevelType w:val="multilevel"/>
     <w:tmpl w:val="6B3A2A4A"/>
@@ -7572,7 +10467,7 @@
       </w:rPr>
     </w:lvl>
   </w:abstractNum>
-  <w:abstractNum w:abstractNumId="11" w15:restartNumberingAfterBreak="0">
+  <w:abstractNum w:abstractNumId="15" w15:restartNumberingAfterBreak="0">
     <w:nsid w:val="68C775D4"/>
     <w:multiLevelType w:val="multilevel"/>
     <w:tmpl w:val="16FABC12"/>
@@ -7721,7 +10616,7 @@
       </w:rPr>
     </w:lvl>
   </w:abstractNum>
-  <w:abstractNum w:abstractNumId="12" w15:restartNumberingAfterBreak="0">
+  <w:abstractNum w:abstractNumId="16" w15:restartNumberingAfterBreak="0">
     <w:nsid w:val="6D15135B"/>
     <w:multiLevelType w:val="multilevel"/>
     <w:tmpl w:val="7D164CC6"/>
@@ -7870,7 +10765,7 @@
       </w:rPr>
     </w:lvl>
   </w:abstractNum>
-  <w:abstractNum w:abstractNumId="13" w15:restartNumberingAfterBreak="0">
+  <w:abstractNum w:abstractNumId="17" w15:restartNumberingAfterBreak="0">
     <w:nsid w:val="6F0A2D5B"/>
     <w:multiLevelType w:val="multilevel"/>
     <w:tmpl w:val="8222D54C"/>
@@ -7983,7 +10878,7 @@
       </w:pPr>
     </w:lvl>
   </w:abstractNum>
-  <w:abstractNum w:abstractNumId="14" w15:restartNumberingAfterBreak="0">
+  <w:abstractNum w:abstractNumId="18" w15:restartNumberingAfterBreak="0">
     <w:nsid w:val="788432F5"/>
     <w:multiLevelType w:val="multilevel"/>
     <w:tmpl w:val="1F4062E0"/>
@@ -8133,49 +11028,61 @@
     </w:lvl>
   </w:abstractNum>
   <w:num w:numId="1" w16cid:durableId="412506156">
+    <w:abstractNumId w:val="9"/>
+  </w:num>
+  <w:num w:numId="2" w16cid:durableId="474765523">
+    <w:abstractNumId w:val="13"/>
+  </w:num>
+  <w:num w:numId="3" w16cid:durableId="1353190117">
+    <w:abstractNumId w:val="16"/>
+  </w:num>
+  <w:num w:numId="4" w16cid:durableId="1172718243">
+    <w:abstractNumId w:val="3"/>
+  </w:num>
+  <w:num w:numId="5" w16cid:durableId="951859613">
+    <w:abstractNumId w:val="15"/>
+  </w:num>
+  <w:num w:numId="6" w16cid:durableId="1653951703">
+    <w:abstractNumId w:val="14"/>
+  </w:num>
+  <w:num w:numId="7" w16cid:durableId="993141891">
+    <w:abstractNumId w:val="4"/>
+  </w:num>
+  <w:num w:numId="8" w16cid:durableId="1152285510">
+    <w:abstractNumId w:val="18"/>
+  </w:num>
+  <w:num w:numId="9" w16cid:durableId="900604328">
+    <w:abstractNumId w:val="17"/>
+  </w:num>
+  <w:num w:numId="10" w16cid:durableId="454446034">
     <w:abstractNumId w:val="5"/>
   </w:num>
-  <w:num w:numId="2" w16cid:durableId="474765523">
-    <w:abstractNumId w:val="9"/>
-  </w:num>
-  <w:num w:numId="3" w16cid:durableId="1353190117">
+  <w:num w:numId="11" w16cid:durableId="1467434070">
     <w:abstractNumId w:val="12"/>
   </w:num>
-  <w:num w:numId="4" w16cid:durableId="1172718243">
-    <w:abstractNumId w:val="1"/>
+  <w:num w:numId="12" w16cid:durableId="1297251611">
+    <w:abstractNumId w:val="2"/>
   </w:num>
-  <w:num w:numId="5" w16cid:durableId="951859613">
+  <w:num w:numId="13" w16cid:durableId="1879779413">
+    <w:abstractNumId w:val="8"/>
+  </w:num>
+  <w:num w:numId="14" w16cid:durableId="2012026836">
     <w:abstractNumId w:val="11"/>
   </w:num>
-  <w:num w:numId="6" w16cid:durableId="1653951703">
+  <w:num w:numId="15" w16cid:durableId="721949121">
     <w:abstractNumId w:val="10"/>
   </w:num>
-  <w:num w:numId="7" w16cid:durableId="993141891">
-    <w:abstractNumId w:val="2"/>
-  </w:num>
-  <w:num w:numId="8" w16cid:durableId="1152285510">
-    <w:abstractNumId w:val="14"/>
-  </w:num>
-  <w:num w:numId="9" w16cid:durableId="900604328">
-    <w:abstractNumId w:val="13"/>
-  </w:num>
-  <w:num w:numId="10" w16cid:durableId="454446034">
-    <w:abstractNumId w:val="3"/>
-  </w:num>
-  <w:num w:numId="11" w16cid:durableId="1467434070">
-    <w:abstractNumId w:val="8"/>
-  </w:num>
-  <w:num w:numId="12" w16cid:durableId="1297251611">
+  <w:num w:numId="16" w16cid:durableId="1127351653">
     <w:abstractNumId w:val="0"/>
   </w:num>
-  <w:num w:numId="13" w16cid:durableId="1879779413">
-    <w:abstractNumId w:val="4"/>
-  </w:num>
-  <w:num w:numId="14" w16cid:durableId="2012026836">
+  <w:num w:numId="17" w16cid:durableId="1470248380">
     <w:abstractNumId w:val="7"/>
   </w:num>
-  <w:num w:numId="15" w16cid:durableId="721949121">
+  <w:num w:numId="18" w16cid:durableId="2085880461">
     <w:abstractNumId w:val="6"/>
+  </w:num>
+  <w:num w:numId="19" w16cid:durableId="1565027483">
+    <w:abstractNumId w:val="1"/>
   </w:num>
 </w:numbering>
 </file>
@@ -9096,6 +12003,17 @@
       <w:spacing w:val="5"/>
     </w:rPr>
   </w:style>
+  <w:style w:type="paragraph" w:styleId="NormalWeb">
+    <w:name w:val="Normal (Web)"/>
+    <w:basedOn w:val="Normal"/>
+    <w:uiPriority w:val="99"/>
+    <w:semiHidden/>
+    <w:unhideWhenUsed/>
+    <w:rsid w:val="00376251"/>
+    <w:rPr>
+      <w:rFonts w:ascii="Times New Roman" w:hAnsi="Times New Roman" w:cs="Times New Roman"/>
+    </w:rPr>
+  </w:style>
 </w:styles>
 </file>
 

</xml_diff>